<commit_message>
Corrección ortográfica de objetivo y el apellido de autor.
</commit_message>
<xml_diff>
--- a/docs/Documento escrito.docx
+++ b/docs/Documento escrito.docx
@@ -272,6 +272,10 @@
     <w:sdt>
       <w:sdtPr>
         <w:rPr>
+          <w:rFonts w:ascii="Aptos" w:eastAsia="Aptos" w:hAnsi="Aptos" w:cs="Aptos"/>
+          <w:color w:val="auto"/>
+          <w:sz w:val="24"/>
+          <w:szCs w:val="24"/>
           <w:lang w:val="es-ES"/>
         </w:rPr>
         <w:id w:val="438495234"/>
@@ -282,12 +286,8 @@
       </w:sdtPr>
       <w:sdtEndPr>
         <w:rPr>
-          <w:rFonts w:ascii="Aptos" w:eastAsia="Aptos" w:hAnsi="Aptos" w:cs="Aptos"/>
-          <w:b/>
-          <w:bCs/>
-          <w:color w:val="auto"/>
-          <w:sz w:val="24"/>
-          <w:szCs w:val="24"/>
+          <w:b/>
+          <w:bCs/>
         </w:rPr>
       </w:sdtEndPr>
       <w:sdtContent>
@@ -327,7 +327,7 @@
             </w:rPr>
             <w:fldChar w:fldCharType="separate"/>
           </w:r>
-          <w:hyperlink w:anchor="_Toc243082141" w:history="1">
+          <w:hyperlink w:anchor="_Toc243153603" w:history="1">
             <w:r>
               <w:rPr>
                 <w:rStyle w:val="Hipervnculo"/>
@@ -358,7 +358,7 @@
                 <w:noProof/>
                 <w:webHidden/>
               </w:rPr>
-              <w:instrText xml:space="preserve"> PAGEREF _Toc243082141 \h </w:instrText>
+              <w:instrText xml:space="preserve"> PAGEREF _Toc243153603 \h </w:instrText>
             </w:r>
             <w:r>
               <w:rPr>
@@ -406,7 +406,7 @@
               <w14:ligatures w14:val="standardContextual"/>
             </w:rPr>
           </w:pPr>
-          <w:hyperlink w:anchor="_Toc243082142" w:history="1">
+          <w:hyperlink w:anchor="_Toc243153604" w:history="1">
             <w:r>
               <w:rPr>
                 <w:rStyle w:val="Hipervnculo"/>
@@ -437,7 +437,7 @@
                 <w:noProof/>
                 <w:webHidden/>
               </w:rPr>
-              <w:instrText xml:space="preserve"> PAGEREF _Toc243082142 \h </w:instrText>
+              <w:instrText xml:space="preserve"> PAGEREF _Toc243153604 \h </w:instrText>
             </w:r>
             <w:r>
               <w:rPr>
@@ -485,7 +485,7 @@
               <w14:ligatures w14:val="standardContextual"/>
             </w:rPr>
           </w:pPr>
-          <w:hyperlink w:anchor="_Toc243082143" w:history="1">
+          <w:hyperlink w:anchor="_Toc243153605" w:history="1">
             <w:r>
               <w:rPr>
                 <w:rStyle w:val="Hipervnculo"/>
@@ -516,7 +516,7 @@
                 <w:noProof/>
                 <w:webHidden/>
               </w:rPr>
-              <w:instrText xml:space="preserve"> PAGEREF _Toc243082143 \h </w:instrText>
+              <w:instrText xml:space="preserve"> PAGEREF _Toc243153605 \h </w:instrText>
             </w:r>
             <w:r>
               <w:rPr>
@@ -564,7 +564,7 @@
               <w14:ligatures w14:val="standardContextual"/>
             </w:rPr>
           </w:pPr>
-          <w:hyperlink w:anchor="_Toc243082144" w:history="1">
+          <w:hyperlink w:anchor="_Toc243153606" w:history="1">
             <w:r>
               <w:rPr>
                 <w:rStyle w:val="Hipervnculo"/>
@@ -595,7 +595,7 @@
                 <w:noProof/>
                 <w:webHidden/>
               </w:rPr>
-              <w:instrText xml:space="preserve"> PAGEREF _Toc243082144 \h </w:instrText>
+              <w:instrText xml:space="preserve"> PAGEREF _Toc243153606 \h </w:instrText>
             </w:r>
             <w:r>
               <w:rPr>
@@ -637,11 +637,13 @@
               <w:tab w:val="right" w:leader="dot" w:pos="8828"/>
             </w:tabs>
             <w:rPr>
-              <w:rFonts w:ascii="Times New Roman" w:hAnsi="Times New Roman" w:cs="Times New Roman"/>
+              <w:rFonts w:ascii="Times New Roman" w:eastAsiaTheme="minorEastAsia" w:hAnsi="Times New Roman" w:cs="Times New Roman"/>
               <w:noProof/>
+              <w:kern w:val="2"/>
+              <w14:ligatures w14:val="standardContextual"/>
             </w:rPr>
           </w:pPr>
-          <w:hyperlink w:anchor="_Toc243082145" w:history="1">
+          <w:hyperlink w:anchor="_Toc243153607" w:history="1">
             <w:r>
               <w:rPr>
                 <w:rStyle w:val="Hipervnculo"/>
@@ -672,7 +674,7 @@
                 <w:noProof/>
                 <w:webHidden/>
               </w:rPr>
-              <w:instrText xml:space="preserve"> PAGEREF _Toc243082145 \h </w:instrText>
+              <w:instrText xml:space="preserve"> PAGEREF _Toc243153607 \h </w:instrText>
             </w:r>
             <w:r>
               <w:rPr>
@@ -714,18 +716,20 @@
               <w:tab w:val="right" w:leader="dot" w:pos="8828"/>
             </w:tabs>
             <w:rPr>
-              <w:rFonts w:ascii="Times New Roman" w:hAnsi="Times New Roman" w:cs="Times New Roman"/>
+              <w:rFonts w:ascii="Times New Roman" w:eastAsiaTheme="minorEastAsia" w:hAnsi="Times New Roman" w:cs="Times New Roman"/>
               <w:noProof/>
+              <w:kern w:val="2"/>
+              <w14:ligatures w14:val="standardContextual"/>
             </w:rPr>
           </w:pPr>
-          <w:hyperlink w:anchor="_Toc243082146" w:history="1">
+          <w:hyperlink w:anchor="_Toc243153608" w:history="1">
             <w:r>
               <w:rPr>
                 <w:rStyle w:val="Hipervnculo"/>
                 <w:rFonts w:ascii="Times New Roman" w:hAnsi="Times New Roman" w:cs="Times New Roman"/>
                 <w:noProof/>
               </w:rPr>
-              <w:t>Objetos Específicos</w:t>
+              <w:t>Objetivos Específicos</w:t>
             </w:r>
             <w:r>
               <w:rPr>
@@ -749,7 +753,7 @@
                 <w:noProof/>
                 <w:webHidden/>
               </w:rPr>
-              <w:instrText xml:space="preserve"> PAGEREF _Toc243082146 \h </w:instrText>
+              <w:instrText xml:space="preserve"> PAGEREF _Toc243153608 \h </w:instrText>
             </w:r>
             <w:r>
               <w:rPr>
@@ -797,7 +801,7 @@
               <w14:ligatures w14:val="standardContextual"/>
             </w:rPr>
           </w:pPr>
-          <w:hyperlink w:anchor="_Toc243082147" w:history="1">
+          <w:hyperlink w:anchor="_Toc243153609" w:history="1">
             <w:r>
               <w:rPr>
                 <w:rStyle w:val="Hipervnculo"/>
@@ -828,7 +832,7 @@
                 <w:noProof/>
                 <w:webHidden/>
               </w:rPr>
-              <w:instrText xml:space="preserve"> PAGEREF _Toc243082147 \h </w:instrText>
+              <w:instrText xml:space="preserve"> PAGEREF _Toc243153609 \h </w:instrText>
             </w:r>
             <w:r>
               <w:rPr>
@@ -876,7 +880,7 @@
               <w14:ligatures w14:val="standardContextual"/>
             </w:rPr>
           </w:pPr>
-          <w:hyperlink w:anchor="_Toc243082148" w:history="1">
+          <w:hyperlink w:anchor="_Toc243153610" w:history="1">
             <w:r>
               <w:rPr>
                 <w:rStyle w:val="Hipervnculo"/>
@@ -907,7 +911,7 @@
                 <w:noProof/>
                 <w:webHidden/>
               </w:rPr>
-              <w:instrText xml:space="preserve"> PAGEREF _Toc243082148 \h </w:instrText>
+              <w:instrText xml:space="preserve"> PAGEREF _Toc243153610 \h </w:instrText>
             </w:r>
             <w:r>
               <w:rPr>
@@ -955,7 +959,7 @@
               <w14:ligatures w14:val="standardContextual"/>
             </w:rPr>
           </w:pPr>
-          <w:hyperlink w:anchor="_Toc243082149" w:history="1">
+          <w:hyperlink w:anchor="_Toc243153611" w:history="1">
             <w:r>
               <w:rPr>
                 <w:rStyle w:val="Hipervnculo"/>
@@ -986,7 +990,7 @@
                 <w:noProof/>
                 <w:webHidden/>
               </w:rPr>
-              <w:instrText xml:space="preserve"> PAGEREF _Toc243082149 \h </w:instrText>
+              <w:instrText xml:space="preserve"> PAGEREF _Toc243153611 \h </w:instrText>
             </w:r>
             <w:r>
               <w:rPr>
@@ -1034,7 +1038,7 @@
               <w14:ligatures w14:val="standardContextual"/>
             </w:rPr>
           </w:pPr>
-          <w:hyperlink w:anchor="_Toc243082150" w:history="1">
+          <w:hyperlink w:anchor="_Toc243153612" w:history="1">
             <w:r>
               <w:rPr>
                 <w:rStyle w:val="Hipervnculo"/>
@@ -1065,7 +1069,7 @@
                 <w:noProof/>
                 <w:webHidden/>
               </w:rPr>
-              <w:instrText xml:space="preserve"> PAGEREF _Toc243082150 \h </w:instrText>
+              <w:instrText xml:space="preserve"> PAGEREF _Toc243153612 \h </w:instrText>
             </w:r>
             <w:r>
               <w:rPr>
@@ -1246,7 +1250,7 @@
       <w:pPr>
         <w:pStyle w:val="Ttulo1"/>
       </w:pPr>
-      <w:bookmarkStart w:id="0" w:name="_Toc243082141"/>
+      <w:bookmarkStart w:id="0" w:name="_Toc243153603"/>
       <w:r>
         <w:lastRenderedPageBreak/>
         <w:t>Introducción</w:t>
@@ -1296,7 +1300,7 @@
         <w:rPr>
           <w:rFonts w:ascii="Times New Roman" w:eastAsia="Times New Roman" w:hAnsi="Times New Roman" w:cs="Times New Roman"/>
         </w:rPr>
-        <w:t>Corders</w:t>
+        <w:t>Coders</w:t>
       </w:r>
       <w:proofErr w:type="spellEnd"/>
       <w:r>
@@ -1503,7 +1507,7 @@
       <w:pPr>
         <w:pStyle w:val="Ttulo1"/>
       </w:pPr>
-      <w:bookmarkStart w:id="1" w:name="_Toc243082142"/>
+      <w:bookmarkStart w:id="1" w:name="_Toc243153604"/>
       <w:r>
         <w:t>Enlace al repositorio de Git</w:t>
       </w:r>
@@ -1652,6 +1656,7 @@
     </w:p>
     <w:p>
       <w:pPr>
+        <w:ind w:left="720" w:hanging="720"/>
         <w:jc w:val="center"/>
         <w:rPr>
           <w:rFonts w:ascii="Times New Roman" w:eastAsia="Times New Roman" w:hAnsi="Times New Roman" w:cs="Times New Roman"/>
@@ -1693,7 +1698,7 @@
       <w:pPr>
         <w:pStyle w:val="Ttulo1"/>
       </w:pPr>
-      <w:bookmarkStart w:id="2" w:name="_Toc243082143"/>
+      <w:bookmarkStart w:id="2" w:name="_Toc243153605"/>
       <w:r>
         <w:lastRenderedPageBreak/>
         <w:t>Enunciado del problema</w:t>
@@ -1937,7 +1942,7 @@
       <w:pPr>
         <w:pStyle w:val="Ttulo1"/>
       </w:pPr>
-      <w:bookmarkStart w:id="3" w:name="_Toc243082144"/>
+      <w:bookmarkStart w:id="3" w:name="_Toc243153606"/>
       <w:r>
         <w:lastRenderedPageBreak/>
         <w:t>Objetivos</w:t>
@@ -1958,7 +1963,7 @@
       <w:pPr>
         <w:pStyle w:val="Ttulo2"/>
       </w:pPr>
-      <w:bookmarkStart w:id="4" w:name="_Toc243082145"/>
+      <w:bookmarkStart w:id="4" w:name="_Toc243153607"/>
       <w:r>
         <w:t>Objetivo General</w:t>
       </w:r>
@@ -2085,9 +2090,15 @@
       <w:pPr>
         <w:pStyle w:val="Ttulo2"/>
       </w:pPr>
-      <w:bookmarkStart w:id="5" w:name="_Toc243082146"/>
-      <w:r>
-        <w:t>Objetos Específicos</w:t>
+      <w:bookmarkStart w:id="5" w:name="_Toc243153608"/>
+      <w:r>
+        <w:t>Ob</w:t>
+      </w:r>
+      <w:r>
+        <w:t>jetiv</w:t>
+      </w:r>
+      <w:r>
+        <w:t>os Específicos</w:t>
       </w:r>
       <w:bookmarkEnd w:id="5"/>
     </w:p>
@@ -2281,7 +2292,7 @@
       <w:pPr>
         <w:pStyle w:val="Ttulo1"/>
       </w:pPr>
-      <w:bookmarkStart w:id="6" w:name="_Toc243082147"/>
+      <w:bookmarkStart w:id="6" w:name="_Toc243153609"/>
       <w:r>
         <w:lastRenderedPageBreak/>
         <w:t>Descripción de la solución</w:t>
@@ -2540,7 +2551,7 @@
       <w:pPr>
         <w:pStyle w:val="Ttulo1"/>
       </w:pPr>
-      <w:bookmarkStart w:id="7" w:name="_Toc243082148"/>
+      <w:bookmarkStart w:id="7" w:name="_Toc243153610"/>
       <w:r>
         <w:lastRenderedPageBreak/>
         <w:t>Diagrama del Modelo Dimensional (Esquema Estrella o Copo de Nieve)</w:t>
@@ -2811,7 +2822,7 @@
       <w:pPr>
         <w:pStyle w:val="Ttulo1"/>
       </w:pPr>
-      <w:bookmarkStart w:id="8" w:name="_Toc243082149"/>
+      <w:bookmarkStart w:id="8" w:name="_Toc243153611"/>
       <w:r>
         <w:lastRenderedPageBreak/>
         <w:t>Conclusión</w:t>
@@ -3082,7 +3093,7 @@
       <w:pPr>
         <w:pStyle w:val="Ttulo1"/>
       </w:pPr>
-      <w:bookmarkStart w:id="9" w:name="_Toc243082150"/>
+      <w:bookmarkStart w:id="9" w:name="_Toc243153612"/>
       <w:r>
         <w:lastRenderedPageBreak/>
         <w:t>Bibliografía</w:t>
@@ -3106,6 +3117,7 @@
         <w:ind w:left="720" w:hanging="720"/>
         <w:rPr>
           <w:rFonts w:ascii="Times New Roman" w:hAnsi="Times New Roman" w:cs="Times New Roman"/>
+          <w:lang w:val="en-US"/>
         </w:rPr>
       </w:pPr>
       <w:r>
@@ -3115,26 +3127,24 @@
         <w:t xml:space="preserve">Numeral </w:t>
       </w:r>
       <w:proofErr w:type="spellStart"/>
-      <w:proofErr w:type="gramStart"/>
-      <w:r>
-        <w:rPr>
-          <w:rFonts w:ascii="Times New Roman" w:eastAsia="Times New Roman" w:hAnsi="Times New Roman" w:cs="Times New Roman"/>
-        </w:rPr>
-        <w:t>Corders</w:t>
+      <w:r>
+        <w:rPr>
+          <w:rFonts w:ascii="Times New Roman" w:eastAsia="Times New Roman" w:hAnsi="Times New Roman" w:cs="Times New Roman"/>
+        </w:rPr>
+        <w:t>Coders</w:t>
       </w:r>
       <w:proofErr w:type="spellEnd"/>
       <w:r>
         <w:rPr>
           <w:rFonts w:ascii="Times New Roman" w:eastAsia="Times New Roman" w:hAnsi="Times New Roman" w:cs="Times New Roman"/>
         </w:rPr>
-        <w:t>.(</w:t>
-      </w:r>
-      <w:proofErr w:type="gramEnd"/>
-      <w:r>
-        <w:rPr>
-          <w:rFonts w:ascii="Times New Roman" w:eastAsia="Times New Roman" w:hAnsi="Times New Roman" w:cs="Times New Roman"/>
-        </w:rPr>
-        <w:t xml:space="preserve">2023, 11 de agosto). </w:t>
+        <w:t xml:space="preserve"> </w:t>
+      </w:r>
+      <w:r>
+        <w:rPr>
+          <w:rFonts w:ascii="Times New Roman" w:eastAsia="Times New Roman" w:hAnsi="Times New Roman" w:cs="Times New Roman"/>
+        </w:rPr>
+        <w:t xml:space="preserve">(2023, 11 de agosto). </w:t>
       </w:r>
       <w:r>
         <w:rPr>
@@ -5246,28 +5256,28 @@
 </file>
 
 <file path=customXml/item1.xml><?xml version="1.0" encoding="utf-8"?>
+<b:Sources xmlns:b="http://schemas.openxmlformats.org/officeDocument/2006/bibliography" xmlns="http://schemas.openxmlformats.org/officeDocument/2006/bibliography" SelectedStyle="\APASixthEditionOfficeOnline.xsl" StyleName="APA" Version="6"/>
+</file>
+
+<file path=customXml/item2.xml><?xml version="1.0" encoding="utf-8"?>
 <go:gDocsCustomXmlDataStorage xmlns:go="http://customooxmlschemas.google.com/" xmlns:r="http://schemas.openxmlformats.org/officeDocument/2006/relationships" uri="GoogleDocsCustomDataVersion2">
   <go:docsCustomData xmlns:go="http://customooxmlschemas.google.com/" roundtripDataSignature="AMtx7mgNEoP3Kwq+1LxZPzAZXi8V9NcnBA==">CgMxLjA4AHIhMWZGMDk1QVlYQkZjVDI5RnR4bmhOaUp4VnZIVnd1WC1Y</go:docsCustomData>
 </go:gDocsCustomXmlDataStorage>
 </file>
 
-<file path=customXml/item2.xml><?xml version="1.0" encoding="utf-8"?>
-<b:Sources xmlns:b="http://schemas.openxmlformats.org/officeDocument/2006/bibliography" xmlns="http://schemas.openxmlformats.org/officeDocument/2006/bibliography" SelectedStyle="\APASixthEditionOfficeOnline.xsl" StyleName="APA" Version="6"/>
+<file path=customXml/itemProps1.xml><?xml version="1.0" encoding="utf-8"?>
+<ds:datastoreItem xmlns:ds="http://schemas.openxmlformats.org/officeDocument/2006/customXml" ds:itemID="{1ABD5AAA-B4E8-496F-AB7C-4CB05F8790EB}">
+  <ds:schemaRefs>
+    <ds:schemaRef ds:uri="http://schemas.openxmlformats.org/officeDocument/2006/bibliography"/>
+  </ds:schemaRefs>
+</ds:datastoreItem>
 </file>
 
-<file path=customXml/itemProps1.xml><?xml version="1.0" encoding="utf-8"?>
+<file path=customXml/itemProps2.xml><?xml version="1.0" encoding="utf-8"?>
 <ds:datastoreItem xmlns:ds="http://schemas.openxmlformats.org/officeDocument/2006/customXml" ds:itemID="{11111111-1234-1234-1234-123412341234}">
   <ds:schemaRefs>
     <ds:schemaRef ds:uri="http://customooxmlschemas.google.com/"/>
     <ds:schemaRef ds:uri="http://schemas.openxmlformats.org/officeDocument/2006/relationships"/>
   </ds:schemaRefs>
 </ds:datastoreItem>
-</file>
-
-<file path=customXml/itemProps2.xml><?xml version="1.0" encoding="utf-8"?>
-<ds:datastoreItem xmlns:ds="http://schemas.openxmlformats.org/officeDocument/2006/customXml" ds:itemID="{1ABD5AAA-B4E8-496F-AB7C-4CB05F8790EB}">
-  <ds:schemaRefs>
-    <ds:schemaRef ds:uri="http://schemas.openxmlformats.org/officeDocument/2006/bibliography"/>
-  </ds:schemaRefs>
-</ds:datastoreItem>
 </file>
</xml_diff>

<commit_message>
Modifica los objetivos específicos para que sean medibles.
</commit_message>
<xml_diff>
--- a/docs/Documento escrito.docx
+++ b/docs/Documento escrito.docx
@@ -2111,6 +2111,58 @@
     </w:p>
     <w:p>
       <w:pPr>
+        <w:pStyle w:val="Prrafodelista"/>
+        <w:numPr>
+          <w:ilvl w:val="0"/>
+          <w:numId w:val="3"/>
+        </w:numPr>
+        <w:spacing w:line="480" w:lineRule="auto"/>
+        <w:rPr>
+          <w:rFonts w:ascii="Times New Roman" w:eastAsia="Times New Roman" w:hAnsi="Times New Roman" w:cs="Times New Roman"/>
+        </w:rPr>
+      </w:pPr>
+      <w:r>
+        <w:rPr>
+          <w:rFonts w:ascii="Times New Roman" w:eastAsia="Times New Roman" w:hAnsi="Times New Roman" w:cs="Times New Roman"/>
+        </w:rPr>
+        <w:t xml:space="preserve">Evaluar la calidad de la información de las ocho tablas de la base de datos </w:t>
+      </w:r>
+      <w:proofErr w:type="spellStart"/>
+      <w:r>
+        <w:rPr>
+          <w:rFonts w:ascii="Times New Roman" w:eastAsia="Times New Roman" w:hAnsi="Times New Roman" w:cs="Times New Roman"/>
+        </w:rPr>
+        <w:t>Dunnhumby</w:t>
+      </w:r>
+      <w:proofErr w:type="spellEnd"/>
+      <w:r>
+        <w:rPr>
+          <w:rFonts w:ascii="Times New Roman" w:eastAsia="Times New Roman" w:hAnsi="Times New Roman" w:cs="Times New Roman"/>
+        </w:rPr>
+        <w:t>, mediante consultas que permitan identificar y cuantificar valores nulos, registros duplicados e inconsistencias en los datos.</w:t>
+      </w:r>
+    </w:p>
+    <w:p>
+      <w:pPr>
+        <w:pStyle w:val="Prrafodelista"/>
+        <w:numPr>
+          <w:ilvl w:val="0"/>
+          <w:numId w:val="3"/>
+        </w:numPr>
+        <w:spacing w:line="480" w:lineRule="auto"/>
+        <w:rPr>
+          <w:rFonts w:ascii="Times New Roman" w:eastAsia="Times New Roman" w:hAnsi="Times New Roman" w:cs="Times New Roman"/>
+        </w:rPr>
+      </w:pPr>
+      <w:r>
+        <w:rPr>
+          <w:rFonts w:ascii="Times New Roman" w:eastAsia="Times New Roman" w:hAnsi="Times New Roman" w:cs="Times New Roman"/>
+        </w:rPr>
+        <w:t>Diseñar un modelo dimensional para la empresa, identificando las tablas de hechos, dimensiones, medidas y granularidad necesarias para el análisis de la información comercial.</w:t>
+      </w:r>
+    </w:p>
+    <w:p>
+      <w:pPr>
         <w:numPr>
           <w:ilvl w:val="0"/>
           <w:numId w:val="3"/>
@@ -2124,21 +2176,49 @@
         <w:rPr>
           <w:rFonts w:ascii="Times New Roman" w:eastAsia="Times New Roman" w:hAnsi="Times New Roman" w:cs="Times New Roman"/>
         </w:rPr>
-        <w:t xml:space="preserve">Evaluar la calidad de la información de la base de datos </w:t>
+        <w:t xml:space="preserve">Implementar el Data </w:t>
       </w:r>
       <w:proofErr w:type="spellStart"/>
       <w:r>
         <w:rPr>
           <w:rFonts w:ascii="Times New Roman" w:eastAsia="Times New Roman" w:hAnsi="Times New Roman" w:cs="Times New Roman"/>
         </w:rPr>
-        <w:t>Dunnhumby</w:t>
+        <w:t>Warehouse</w:t>
       </w:r>
       <w:proofErr w:type="spellEnd"/>
       <w:r>
         <w:rPr>
           <w:rFonts w:ascii="Times New Roman" w:eastAsia="Times New Roman" w:hAnsi="Times New Roman" w:cs="Times New Roman"/>
         </w:rPr>
-        <w:t xml:space="preserve"> mediante la identificación de valores nulos, inconsistencias y problemas estructurales en las tablas fuentes.</w:t>
+        <w:t xml:space="preserve"> utilizando PostgreSQL y </w:t>
+      </w:r>
+      <w:proofErr w:type="spellStart"/>
+      <w:r>
+        <w:rPr>
+          <w:rFonts w:ascii="Times New Roman" w:eastAsia="Times New Roman" w:hAnsi="Times New Roman" w:cs="Times New Roman"/>
+        </w:rPr>
+        <w:t>dbt</w:t>
+      </w:r>
+      <w:proofErr w:type="spellEnd"/>
+      <w:r>
+        <w:rPr>
+          <w:rFonts w:ascii="Times New Roman" w:eastAsia="Times New Roman" w:hAnsi="Times New Roman" w:cs="Times New Roman"/>
+        </w:rPr>
+        <w:t xml:space="preserve"> (Data </w:t>
+      </w:r>
+      <w:proofErr w:type="spellStart"/>
+      <w:r>
+        <w:rPr>
+          <w:rFonts w:ascii="Times New Roman" w:eastAsia="Times New Roman" w:hAnsi="Times New Roman" w:cs="Times New Roman"/>
+        </w:rPr>
+        <w:t>Build</w:t>
+      </w:r>
+      <w:proofErr w:type="spellEnd"/>
+      <w:r>
+        <w:rPr>
+          <w:rFonts w:ascii="Times New Roman" w:eastAsia="Times New Roman" w:hAnsi="Times New Roman" w:cs="Times New Roman"/>
+        </w:rPr>
+        <w:t xml:space="preserve"> Tool), verificando la ejecución correcta de las transformaciones y la carga de los datos en las tablas del modelo dimensional.</w:t>
       </w:r>
     </w:p>
     <w:p>
@@ -2156,25 +2236,7 @@
         <w:rPr>
           <w:rFonts w:ascii="Times New Roman" w:eastAsia="Times New Roman" w:hAnsi="Times New Roman" w:cs="Times New Roman"/>
         </w:rPr>
-        <w:t xml:space="preserve">Diseñar el modelo dimensional acorde a las necesidades analíticas de la empresa y a la granularidad requerida para el negocio. </w:t>
-      </w:r>
-    </w:p>
-    <w:p>
-      <w:pPr>
-        <w:numPr>
-          <w:ilvl w:val="0"/>
-          <w:numId w:val="1"/>
-        </w:numPr>
-        <w:spacing w:after="0" w:line="480" w:lineRule="auto"/>
-        <w:rPr>
-          <w:rFonts w:ascii="Times New Roman" w:eastAsia="Times New Roman" w:hAnsi="Times New Roman" w:cs="Times New Roman"/>
-        </w:rPr>
-      </w:pPr>
-      <w:r>
-        <w:rPr>
-          <w:rFonts w:ascii="Times New Roman" w:eastAsia="Times New Roman" w:hAnsi="Times New Roman" w:cs="Times New Roman"/>
-        </w:rPr>
-        <w:t xml:space="preserve">Implementar el Data </w:t>
+        <w:t xml:space="preserve">Elaborar informes mediante tablas dinámicas en Excel conectadas al Data </w:t>
       </w:r>
       <w:proofErr w:type="spellStart"/>
       <w:r>
@@ -2188,105 +2250,8 @@
         <w:rPr>
           <w:rFonts w:ascii="Times New Roman" w:eastAsia="Times New Roman" w:hAnsi="Times New Roman" w:cs="Times New Roman"/>
         </w:rPr>
-        <w:t xml:space="preserve"> y los flujos de transformación utilizando PostgreSQL y </w:t>
-      </w:r>
-      <w:proofErr w:type="spellStart"/>
-      <w:r>
-        <w:rPr>
-          <w:rFonts w:ascii="Times New Roman" w:eastAsia="Times New Roman" w:hAnsi="Times New Roman" w:cs="Times New Roman"/>
-        </w:rPr>
-        <w:t>dbt</w:t>
-      </w:r>
-      <w:proofErr w:type="spellEnd"/>
-      <w:r>
-        <w:rPr>
-          <w:rFonts w:ascii="Times New Roman" w:eastAsia="Times New Roman" w:hAnsi="Times New Roman" w:cs="Times New Roman"/>
-        </w:rPr>
-        <w:t xml:space="preserve"> (Data </w:t>
-      </w:r>
-      <w:proofErr w:type="spellStart"/>
-      <w:r>
-        <w:rPr>
-          <w:rFonts w:ascii="Times New Roman" w:eastAsia="Times New Roman" w:hAnsi="Times New Roman" w:cs="Times New Roman"/>
-        </w:rPr>
-        <w:t>Build</w:t>
-      </w:r>
-      <w:proofErr w:type="spellEnd"/>
-      <w:r>
-        <w:rPr>
-          <w:rFonts w:ascii="Times New Roman" w:eastAsia="Times New Roman" w:hAnsi="Times New Roman" w:cs="Times New Roman"/>
-        </w:rPr>
-        <w:t xml:space="preserve"> Tool) automatizando la integración de los datos. </w:t>
-      </w:r>
-    </w:p>
-    <w:p>
-      <w:pPr>
-        <w:numPr>
-          <w:ilvl w:val="0"/>
-          <w:numId w:val="1"/>
-        </w:numPr>
-        <w:spacing w:line="480" w:lineRule="auto"/>
-        <w:rPr>
-          <w:rFonts w:ascii="Times New Roman" w:eastAsia="Times New Roman" w:hAnsi="Times New Roman" w:cs="Times New Roman"/>
-        </w:rPr>
-      </w:pPr>
-      <w:r>
-        <w:rPr>
-          <w:rFonts w:ascii="Times New Roman" w:eastAsia="Times New Roman" w:hAnsi="Times New Roman" w:cs="Times New Roman"/>
-        </w:rPr>
-        <w:t xml:space="preserve">Elaborar informes mediante tablas dinámicas en Excel conectadas al Data </w:t>
-      </w:r>
-      <w:proofErr w:type="spellStart"/>
-      <w:r>
-        <w:rPr>
-          <w:rFonts w:ascii="Times New Roman" w:eastAsia="Times New Roman" w:hAnsi="Times New Roman" w:cs="Times New Roman"/>
-        </w:rPr>
-        <w:t>Warehouse</w:t>
-      </w:r>
-      <w:proofErr w:type="spellEnd"/>
-      <w:r>
-        <w:rPr>
-          <w:rFonts w:ascii="Times New Roman" w:eastAsia="Times New Roman" w:hAnsi="Times New Roman" w:cs="Times New Roman"/>
-        </w:rPr>
-        <w:t xml:space="preserve"> para el análisis de los indicadores del negocio.</w:t>
-      </w:r>
-    </w:p>
-    <w:p>
-      <w:pPr>
-        <w:jc w:val="center"/>
-        <w:rPr>
-          <w:rFonts w:ascii="Times New Roman" w:eastAsia="Times New Roman" w:hAnsi="Times New Roman" w:cs="Times New Roman"/>
-          <w:b/>
-          <w:bCs/>
-        </w:rPr>
-      </w:pPr>
-    </w:p>
-    <w:p>
-      <w:pPr>
-        <w:rPr>
-          <w:rFonts w:ascii="Times New Roman" w:eastAsia="Times New Roman" w:hAnsi="Times New Roman" w:cs="Times New Roman"/>
-          <w:b/>
-          <w:bCs/>
-        </w:rPr>
-      </w:pPr>
-    </w:p>
-    <w:p>
-      <w:pPr>
-        <w:rPr>
-          <w:rFonts w:ascii="Times New Roman" w:eastAsia="Times New Roman" w:hAnsi="Times New Roman" w:cs="Times New Roman"/>
-          <w:b/>
-          <w:bCs/>
-        </w:rPr>
-      </w:pPr>
-    </w:p>
-    <w:p>
-      <w:pPr>
-        <w:rPr>
-          <w:rFonts w:ascii="Times New Roman" w:eastAsia="Times New Roman" w:hAnsi="Times New Roman" w:cs="Times New Roman"/>
-          <w:b/>
-          <w:bCs/>
-        </w:rPr>
-      </w:pPr>
+        <w:t>, que permitan consultar y analizar indicadores comerciales y verificar que la información se obtiene correctamente.</w:t>
+      </w:r>
     </w:p>
     <w:p>
       <w:pPr>
@@ -4332,6 +4297,7 @@
   <w:style w:type="paragraph" w:default="1" w:styleId="Normal">
     <w:name w:val="Normal"/>
     <w:qFormat/>
+    <w:rsid w:val="00142074"/>
   </w:style>
   <w:style w:type="paragraph" w:styleId="Ttulo1">
     <w:name w:val="heading 1"/>
@@ -5256,28 +5222,28 @@
 </file>
 
 <file path=customXml/item1.xml><?xml version="1.0" encoding="utf-8"?>
-<b:Sources xmlns:b="http://schemas.openxmlformats.org/officeDocument/2006/bibliography" xmlns="http://schemas.openxmlformats.org/officeDocument/2006/bibliography" SelectedStyle="\APASixthEditionOfficeOnline.xsl" StyleName="APA" Version="6"/>
-</file>
-
-<file path=customXml/item2.xml><?xml version="1.0" encoding="utf-8"?>
 <go:gDocsCustomXmlDataStorage xmlns:go="http://customooxmlschemas.google.com/" xmlns:r="http://schemas.openxmlformats.org/officeDocument/2006/relationships" uri="GoogleDocsCustomDataVersion2">
   <go:docsCustomData xmlns:go="http://customooxmlschemas.google.com/" roundtripDataSignature="AMtx7mgNEoP3Kwq+1LxZPzAZXi8V9NcnBA==">CgMxLjA4AHIhMWZGMDk1QVlYQkZjVDI5RnR4bmhOaUp4VnZIVnd1WC1Y</go:docsCustomData>
 </go:gDocsCustomXmlDataStorage>
 </file>
 
-<file path=customXml/itemProps1.xml><?xml version="1.0" encoding="utf-8"?>
-<ds:datastoreItem xmlns:ds="http://schemas.openxmlformats.org/officeDocument/2006/customXml" ds:itemID="{1ABD5AAA-B4E8-496F-AB7C-4CB05F8790EB}">
-  <ds:schemaRefs>
-    <ds:schemaRef ds:uri="http://schemas.openxmlformats.org/officeDocument/2006/bibliography"/>
-  </ds:schemaRefs>
-</ds:datastoreItem>
+<file path=customXml/item2.xml><?xml version="1.0" encoding="utf-8"?>
+<b:Sources xmlns:b="http://schemas.openxmlformats.org/officeDocument/2006/bibliography" xmlns="http://schemas.openxmlformats.org/officeDocument/2006/bibliography" SelectedStyle="\APASixthEditionOfficeOnline.xsl" StyleName="APA" Version="6"/>
 </file>
 
-<file path=customXml/itemProps2.xml><?xml version="1.0" encoding="utf-8"?>
+<file path=customXml/itemProps1.xml><?xml version="1.0" encoding="utf-8"?>
 <ds:datastoreItem xmlns:ds="http://schemas.openxmlformats.org/officeDocument/2006/customXml" ds:itemID="{11111111-1234-1234-1234-123412341234}">
   <ds:schemaRefs>
     <ds:schemaRef ds:uri="http://customooxmlschemas.google.com/"/>
     <ds:schemaRef ds:uri="http://schemas.openxmlformats.org/officeDocument/2006/relationships"/>
   </ds:schemaRefs>
 </ds:datastoreItem>
+</file>
+
+<file path=customXml/itemProps2.xml><?xml version="1.0" encoding="utf-8"?>
+<ds:datastoreItem xmlns:ds="http://schemas.openxmlformats.org/officeDocument/2006/customXml" ds:itemID="{1ABD5AAA-B4E8-496F-AB7C-4CB05F8790EB}">
+  <ds:schemaRefs>
+    <ds:schemaRef ds:uri="http://schemas.openxmlformats.org/officeDocument/2006/bibliography"/>
+  </ds:schemaRefs>
+</ds:datastoreItem>
 </file>
</xml_diff>

<commit_message>
Incluye la identificacion del analis de los usuarios finales (skeolders)
</commit_message>
<xml_diff>
--- a/docs/Documento escrito.docx
+++ b/docs/Documento escrito.docx
@@ -104,6 +104,8 @@
           <w:rFonts w:ascii="Times New Roman" w:eastAsia="Times New Roman" w:hAnsi="Times New Roman" w:cs="Times New Roman"/>
           <w:b/>
           <w:bCs/>
+          <w:sz w:val="22"/>
+          <w:szCs w:val="22"/>
         </w:rPr>
       </w:pPr>
     </w:p>
@@ -116,13 +118,17 @@
           <w:rFonts w:ascii="Times New Roman" w:eastAsia="Times New Roman" w:hAnsi="Times New Roman" w:cs="Times New Roman"/>
           <w:b/>
           <w:bCs/>
-        </w:rPr>
-      </w:pPr>
-      <w:r>
-        <w:rPr>
-          <w:rFonts w:ascii="Times New Roman" w:eastAsia="Times New Roman" w:hAnsi="Times New Roman" w:cs="Times New Roman"/>
-          <w:b/>
-          <w:bCs/>
+          <w:sz w:val="22"/>
+          <w:szCs w:val="22"/>
+        </w:rPr>
+      </w:pPr>
+      <w:r>
+        <w:rPr>
+          <w:rFonts w:ascii="Times New Roman" w:eastAsia="Times New Roman" w:hAnsi="Times New Roman" w:cs="Times New Roman"/>
+          <w:b/>
+          <w:bCs/>
+          <w:sz w:val="22"/>
+          <w:szCs w:val="22"/>
         </w:rPr>
         <w:t xml:space="preserve">Proyecto #1  </w:t>
       </w:r>
@@ -134,6 +140,8 @@
         <w:jc w:val="center"/>
         <w:rPr>
           <w:rFonts w:ascii="Times New Roman" w:eastAsia="Times New Roman" w:hAnsi="Times New Roman" w:cs="Times New Roman"/>
+          <w:sz w:val="22"/>
+          <w:szCs w:val="22"/>
         </w:rPr>
       </w:pPr>
     </w:p>
@@ -144,25 +152,23 @@
         <w:jc w:val="center"/>
         <w:rPr>
           <w:rFonts w:ascii="Times New Roman" w:eastAsia="Times New Roman" w:hAnsi="Times New Roman" w:cs="Times New Roman"/>
-        </w:rPr>
-      </w:pPr>
-      <w:proofErr w:type="spellStart"/>
-      <w:r>
-        <w:rPr>
-          <w:rFonts w:ascii="Times New Roman" w:eastAsia="Times New Roman" w:hAnsi="Times New Roman" w:cs="Times New Roman"/>
-        </w:rPr>
-        <w:t>Walbyn</w:t>
-      </w:r>
-      <w:proofErr w:type="spellEnd"/>
-      <w:r>
-        <w:rPr>
-          <w:rFonts w:ascii="Times New Roman" w:eastAsia="Times New Roman" w:hAnsi="Times New Roman" w:cs="Times New Roman"/>
-        </w:rPr>
-        <w:t xml:space="preserve"> González Sequeira</w:t>
-      </w:r>
-      <w:r>
-        <w:rPr>
-          <w:rFonts w:ascii="Times New Roman" w:eastAsia="Times New Roman" w:hAnsi="Times New Roman" w:cs="Times New Roman"/>
+          <w:sz w:val="22"/>
+          <w:szCs w:val="22"/>
+        </w:rPr>
+      </w:pPr>
+      <w:r>
+        <w:rPr>
+          <w:rFonts w:ascii="Times New Roman" w:eastAsia="Times New Roman" w:hAnsi="Times New Roman" w:cs="Times New Roman"/>
+          <w:sz w:val="22"/>
+          <w:szCs w:val="22"/>
+        </w:rPr>
+        <w:t>Walbyn González Sequeira</w:t>
+      </w:r>
+      <w:r>
+        <w:rPr>
+          <w:rFonts w:ascii="Times New Roman" w:eastAsia="Times New Roman" w:hAnsi="Times New Roman" w:cs="Times New Roman"/>
+          <w:sz w:val="22"/>
+          <w:szCs w:val="22"/>
         </w:rPr>
         <w:br/>
         <w:t xml:space="preserve"> Seidy Alanis Balladares</w:t>
@@ -170,6 +176,8 @@
       <w:r>
         <w:rPr>
           <w:rFonts w:ascii="Times New Roman" w:eastAsia="Times New Roman" w:hAnsi="Times New Roman" w:cs="Times New Roman"/>
+          <w:sz w:val="22"/>
+          <w:szCs w:val="22"/>
         </w:rPr>
         <w:br/>
         <w:t xml:space="preserve">Fiorella Lazo Reyes </w:t>
@@ -177,6 +185,8 @@
       <w:r>
         <w:rPr>
           <w:rFonts w:ascii="Times New Roman" w:eastAsia="Times New Roman" w:hAnsi="Times New Roman" w:cs="Times New Roman"/>
+          <w:sz w:val="22"/>
+          <w:szCs w:val="22"/>
         </w:rPr>
         <w:br/>
         <w:t>Jimena Jara Rojas</w:t>
@@ -189,6 +199,8 @@
         <w:jc w:val="center"/>
         <w:rPr>
           <w:rFonts w:ascii="Times New Roman" w:eastAsia="Times New Roman" w:hAnsi="Times New Roman" w:cs="Times New Roman"/>
+          <w:sz w:val="22"/>
+          <w:szCs w:val="22"/>
         </w:rPr>
       </w:pPr>
     </w:p>
@@ -199,17 +211,23 @@
         <w:jc w:val="center"/>
         <w:rPr>
           <w:rFonts w:ascii="Times New Roman" w:eastAsia="Times New Roman" w:hAnsi="Times New Roman" w:cs="Times New Roman"/>
-        </w:rPr>
-      </w:pPr>
-      <w:r>
-        <w:rPr>
-          <w:rFonts w:ascii="Times New Roman" w:eastAsia="Times New Roman" w:hAnsi="Times New Roman" w:cs="Times New Roman"/>
+          <w:sz w:val="22"/>
+          <w:szCs w:val="22"/>
+        </w:rPr>
+      </w:pPr>
+      <w:r>
+        <w:rPr>
+          <w:rFonts w:ascii="Times New Roman" w:eastAsia="Times New Roman" w:hAnsi="Times New Roman" w:cs="Times New Roman"/>
+          <w:sz w:val="22"/>
+          <w:szCs w:val="22"/>
         </w:rPr>
         <w:t>Sede Regional de San Carlos, Universidad Técnica Nacional</w:t>
       </w:r>
       <w:r>
         <w:rPr>
           <w:rFonts w:ascii="Times New Roman" w:eastAsia="Times New Roman" w:hAnsi="Times New Roman" w:cs="Times New Roman"/>
+          <w:sz w:val="22"/>
+          <w:szCs w:val="22"/>
         </w:rPr>
         <w:br/>
         <w:t>Ingeniería del Software</w:t>
@@ -217,6 +235,8 @@
       <w:r>
         <w:rPr>
           <w:rFonts w:ascii="Times New Roman" w:eastAsia="Times New Roman" w:hAnsi="Times New Roman" w:cs="Times New Roman"/>
+          <w:sz w:val="22"/>
+          <w:szCs w:val="22"/>
         </w:rPr>
         <w:br/>
         <w:t xml:space="preserve">ISW- 911: Minería de Datos </w:t>
@@ -224,6 +244,8 @@
       <w:r>
         <w:rPr>
           <w:rFonts w:ascii="Times New Roman" w:eastAsia="Times New Roman" w:hAnsi="Times New Roman" w:cs="Times New Roman"/>
+          <w:sz w:val="22"/>
+          <w:szCs w:val="22"/>
         </w:rPr>
         <w:br/>
         <w:t>Prof. Freddy Rocha Boza</w:t>
@@ -231,6 +253,8 @@
       <w:r>
         <w:rPr>
           <w:rFonts w:ascii="Times New Roman" w:eastAsia="Times New Roman" w:hAnsi="Times New Roman" w:cs="Times New Roman"/>
+          <w:sz w:val="22"/>
+          <w:szCs w:val="22"/>
         </w:rPr>
         <w:br/>
         <w:t>Octubre del 2026</w:t>
@@ -246,36 +270,41 @@
     <w:p/>
     <w:p>
       <w:pPr>
-        <w:jc w:val="center"/>
-        <w:rPr>
-          <w:rFonts w:ascii="Times New Roman" w:eastAsia="Times New Roman" w:hAnsi="Times New Roman" w:cs="Times New Roman"/>
-          <w:b/>
-          <w:bCs/>
-        </w:rPr>
-      </w:pPr>
-      <w:r>
-        <w:rPr>
-          <w:rFonts w:ascii="Times New Roman" w:eastAsia="Times New Roman" w:hAnsi="Times New Roman" w:cs="Times New Roman"/>
-          <w:b/>
-          <w:bCs/>
+        <w:rPr>
+          <w:sz w:val="22"/>
+          <w:szCs w:val="22"/>
+        </w:rPr>
+      </w:pPr>
+    </w:p>
+    <w:p>
+      <w:pPr>
+        <w:jc w:val="center"/>
+        <w:rPr>
+          <w:rFonts w:ascii="Times New Roman" w:eastAsia="Times New Roman" w:hAnsi="Times New Roman" w:cs="Times New Roman"/>
+          <w:b/>
+          <w:bCs/>
+          <w:sz w:val="22"/>
+          <w:szCs w:val="22"/>
+        </w:rPr>
+      </w:pPr>
+      <w:r>
+        <w:rPr>
+          <w:rFonts w:ascii="Times New Roman" w:eastAsia="Times New Roman" w:hAnsi="Times New Roman" w:cs="Times New Roman"/>
+          <w:b/>
+          <w:bCs/>
+          <w:sz w:val="22"/>
+          <w:szCs w:val="22"/>
         </w:rPr>
         <w:t>Tabla de Contenidos</w:t>
       </w:r>
-    </w:p>
-    <w:p>
-      <w:pPr>
-        <w:rPr>
-          <w:rFonts w:ascii="Times New Roman" w:eastAsia="Times New Roman" w:hAnsi="Times New Roman" w:cs="Times New Roman"/>
-        </w:rPr>
-      </w:pPr>
     </w:p>
     <w:sdt>
       <w:sdtPr>
         <w:rPr>
           <w:rFonts w:ascii="Aptos" w:eastAsia="Aptos" w:hAnsi="Aptos" w:cs="Aptos"/>
           <w:color w:val="auto"/>
-          <w:sz w:val="24"/>
-          <w:szCs w:val="24"/>
+          <w:sz w:val="22"/>
+          <w:szCs w:val="22"/>
           <w:lang w:val="es-ES"/>
         </w:rPr>
         <w:id w:val="438495234"/>
@@ -294,6 +323,10 @@
         <w:p>
           <w:pPr>
             <w:pStyle w:val="TtuloTDC"/>
+            <w:rPr>
+              <w:sz w:val="22"/>
+              <w:szCs w:val="22"/>
+            </w:rPr>
           </w:pPr>
         </w:p>
         <w:p>
@@ -303,7 +336,7 @@
               <w:tab w:val="right" w:leader="dot" w:pos="8828"/>
             </w:tabs>
             <w:rPr>
-              <w:rFonts w:ascii="Times New Roman" w:eastAsiaTheme="minorEastAsia" w:hAnsi="Times New Roman" w:cs="Times New Roman"/>
+              <w:rFonts w:asciiTheme="minorHAnsi" w:eastAsiaTheme="minorEastAsia" w:hAnsiTheme="minorHAnsi" w:cstheme="minorBidi"/>
               <w:noProof/>
               <w:kern w:val="2"/>
               <w14:ligatures w14:val="standardContextual"/>
@@ -312,33 +345,38 @@
           <w:r>
             <w:rPr>
               <w:rFonts w:ascii="Times New Roman" w:hAnsi="Times New Roman" w:cs="Times New Roman"/>
+              <w:sz w:val="22"/>
+              <w:szCs w:val="22"/>
             </w:rPr>
             <w:fldChar w:fldCharType="begin"/>
           </w:r>
           <w:r>
             <w:rPr>
               <w:rFonts w:ascii="Times New Roman" w:hAnsi="Times New Roman" w:cs="Times New Roman"/>
+              <w:sz w:val="22"/>
+              <w:szCs w:val="22"/>
             </w:rPr>
             <w:instrText xml:space="preserve"> TOC \o "1-3" \h \z \u </w:instrText>
           </w:r>
           <w:r>
             <w:rPr>
               <w:rFonts w:ascii="Times New Roman" w:hAnsi="Times New Roman" w:cs="Times New Roman"/>
+              <w:sz w:val="22"/>
+              <w:szCs w:val="22"/>
             </w:rPr>
             <w:fldChar w:fldCharType="separate"/>
           </w:r>
-          <w:hyperlink w:anchor="_Toc243153603" w:history="1">
+          <w:hyperlink w:anchor="_Toc243403960" w:history="1">
             <w:r>
               <w:rPr>
                 <w:rStyle w:val="Hipervnculo"/>
-                <w:rFonts w:ascii="Times New Roman" w:hAnsi="Times New Roman" w:cs="Times New Roman"/>
-                <w:noProof/>
-              </w:rPr>
-              <w:t>Introducción</w:t>
-            </w:r>
-            <w:r>
-              <w:rPr>
-                <w:rFonts w:ascii="Times New Roman" w:hAnsi="Times New Roman" w:cs="Times New Roman"/>
+                <w:rFonts w:cs="Times New Roman"/>
+                <w:noProof/>
+              </w:rPr>
+              <w:t>Lista de Tablas</w:t>
+            </w:r>
+            <w:r>
+              <w:rPr>
                 <w:noProof/>
                 <w:webHidden/>
               </w:rPr>
@@ -346,7 +384,6 @@
             </w:r>
             <w:r>
               <w:rPr>
-                <w:rFonts w:ascii="Times New Roman" w:hAnsi="Times New Roman" w:cs="Times New Roman"/>
                 <w:noProof/>
                 <w:webHidden/>
               </w:rPr>
@@ -354,22 +391,19 @@
             </w:r>
             <w:r>
               <w:rPr>
-                <w:rFonts w:ascii="Times New Roman" w:hAnsi="Times New Roman" w:cs="Times New Roman"/>
-                <w:noProof/>
-                <w:webHidden/>
-              </w:rPr>
-              <w:instrText xml:space="preserve"> PAGEREF _Toc243153603 \h </w:instrText>
-            </w:r>
-            <w:r>
-              <w:rPr>
-                <w:rFonts w:ascii="Times New Roman" w:hAnsi="Times New Roman" w:cs="Times New Roman"/>
-                <w:noProof/>
-                <w:webHidden/>
-              </w:rPr>
-            </w:r>
-            <w:r>
-              <w:rPr>
-                <w:rFonts w:ascii="Times New Roman" w:hAnsi="Times New Roman" w:cs="Times New Roman"/>
+                <w:noProof/>
+                <w:webHidden/>
+              </w:rPr>
+              <w:instrText xml:space="preserve"> PAGEREF _Toc243403960 \h </w:instrText>
+            </w:r>
+            <w:r>
+              <w:rPr>
+                <w:noProof/>
+                <w:webHidden/>
+              </w:rPr>
+            </w:r>
+            <w:r>
+              <w:rPr>
                 <w:noProof/>
                 <w:webHidden/>
               </w:rPr>
@@ -377,15 +411,13 @@
             </w:r>
             <w:r>
               <w:rPr>
-                <w:rFonts w:ascii="Times New Roman" w:hAnsi="Times New Roman" w:cs="Times New Roman"/>
-                <w:noProof/>
-                <w:webHidden/>
-              </w:rPr>
-              <w:t>3</w:t>
-            </w:r>
-            <w:r>
-              <w:rPr>
-                <w:rFonts w:ascii="Times New Roman" w:hAnsi="Times New Roman" w:cs="Times New Roman"/>
+                <w:noProof/>
+                <w:webHidden/>
+              </w:rPr>
+              <w:t>2</w:t>
+            </w:r>
+            <w:r>
+              <w:rPr>
                 <w:noProof/>
                 <w:webHidden/>
               </w:rPr>
@@ -400,24 +432,22 @@
               <w:tab w:val="right" w:leader="dot" w:pos="8828"/>
             </w:tabs>
             <w:rPr>
-              <w:rFonts w:ascii="Times New Roman" w:eastAsiaTheme="minorEastAsia" w:hAnsi="Times New Roman" w:cs="Times New Roman"/>
+              <w:rFonts w:asciiTheme="minorHAnsi" w:eastAsiaTheme="minorEastAsia" w:hAnsiTheme="minorHAnsi" w:cstheme="minorBidi"/>
               <w:noProof/>
               <w:kern w:val="2"/>
               <w14:ligatures w14:val="standardContextual"/>
             </w:rPr>
           </w:pPr>
-          <w:hyperlink w:anchor="_Toc243153604" w:history="1">
+          <w:hyperlink w:anchor="_Toc243403961" w:history="1">
             <w:r>
               <w:rPr>
                 <w:rStyle w:val="Hipervnculo"/>
-                <w:rFonts w:ascii="Times New Roman" w:hAnsi="Times New Roman" w:cs="Times New Roman"/>
-                <w:noProof/>
-              </w:rPr>
-              <w:t>Enlace al repositorio de Git</w:t>
-            </w:r>
-            <w:r>
-              <w:rPr>
-                <w:rFonts w:ascii="Times New Roman" w:hAnsi="Times New Roman" w:cs="Times New Roman"/>
+                <w:noProof/>
+              </w:rPr>
+              <w:t>Introducción</w:t>
+            </w:r>
+            <w:r>
+              <w:rPr>
                 <w:noProof/>
                 <w:webHidden/>
               </w:rPr>
@@ -425,7 +455,6 @@
             </w:r>
             <w:r>
               <w:rPr>
-                <w:rFonts w:ascii="Times New Roman" w:hAnsi="Times New Roman" w:cs="Times New Roman"/>
                 <w:noProof/>
                 <w:webHidden/>
               </w:rPr>
@@ -433,22 +462,19 @@
             </w:r>
             <w:r>
               <w:rPr>
-                <w:rFonts w:ascii="Times New Roman" w:hAnsi="Times New Roman" w:cs="Times New Roman"/>
-                <w:noProof/>
-                <w:webHidden/>
-              </w:rPr>
-              <w:instrText xml:space="preserve"> PAGEREF _Toc243153604 \h </w:instrText>
-            </w:r>
-            <w:r>
-              <w:rPr>
-                <w:rFonts w:ascii="Times New Roman" w:hAnsi="Times New Roman" w:cs="Times New Roman"/>
-                <w:noProof/>
-                <w:webHidden/>
-              </w:rPr>
-            </w:r>
-            <w:r>
-              <w:rPr>
-                <w:rFonts w:ascii="Times New Roman" w:hAnsi="Times New Roman" w:cs="Times New Roman"/>
+                <w:noProof/>
+                <w:webHidden/>
+              </w:rPr>
+              <w:instrText xml:space="preserve"> PAGEREF _Toc243403961 \h </w:instrText>
+            </w:r>
+            <w:r>
+              <w:rPr>
+                <w:noProof/>
+                <w:webHidden/>
+              </w:rPr>
+            </w:r>
+            <w:r>
+              <w:rPr>
                 <w:noProof/>
                 <w:webHidden/>
               </w:rPr>
@@ -456,15 +482,13 @@
             </w:r>
             <w:r>
               <w:rPr>
-                <w:rFonts w:ascii="Times New Roman" w:hAnsi="Times New Roman" w:cs="Times New Roman"/>
-                <w:noProof/>
-                <w:webHidden/>
-              </w:rPr>
-              <w:t>4</w:t>
-            </w:r>
-            <w:r>
-              <w:rPr>
-                <w:rFonts w:ascii="Times New Roman" w:hAnsi="Times New Roman" w:cs="Times New Roman"/>
+                <w:noProof/>
+                <w:webHidden/>
+              </w:rPr>
+              <w:t>3</w:t>
+            </w:r>
+            <w:r>
+              <w:rPr>
                 <w:noProof/>
                 <w:webHidden/>
               </w:rPr>
@@ -479,24 +503,22 @@
               <w:tab w:val="right" w:leader="dot" w:pos="8828"/>
             </w:tabs>
             <w:rPr>
-              <w:rFonts w:ascii="Times New Roman" w:eastAsiaTheme="minorEastAsia" w:hAnsi="Times New Roman" w:cs="Times New Roman"/>
+              <w:rFonts w:asciiTheme="minorHAnsi" w:eastAsiaTheme="minorEastAsia" w:hAnsiTheme="minorHAnsi" w:cstheme="minorBidi"/>
               <w:noProof/>
               <w:kern w:val="2"/>
               <w14:ligatures w14:val="standardContextual"/>
             </w:rPr>
           </w:pPr>
-          <w:hyperlink w:anchor="_Toc243153605" w:history="1">
+          <w:hyperlink w:anchor="_Toc243403962" w:history="1">
             <w:r>
               <w:rPr>
                 <w:rStyle w:val="Hipervnculo"/>
-                <w:rFonts w:ascii="Times New Roman" w:hAnsi="Times New Roman" w:cs="Times New Roman"/>
-                <w:noProof/>
-              </w:rPr>
-              <w:t>Enunciado del problema</w:t>
-            </w:r>
-            <w:r>
-              <w:rPr>
-                <w:rFonts w:ascii="Times New Roman" w:hAnsi="Times New Roman" w:cs="Times New Roman"/>
+                <w:noProof/>
+              </w:rPr>
+              <w:t>Enlace al repositorio de Git</w:t>
+            </w:r>
+            <w:r>
+              <w:rPr>
                 <w:noProof/>
                 <w:webHidden/>
               </w:rPr>
@@ -504,7 +526,6 @@
             </w:r>
             <w:r>
               <w:rPr>
-                <w:rFonts w:ascii="Times New Roman" w:hAnsi="Times New Roman" w:cs="Times New Roman"/>
                 <w:noProof/>
                 <w:webHidden/>
               </w:rPr>
@@ -512,22 +533,19 @@
             </w:r>
             <w:r>
               <w:rPr>
-                <w:rFonts w:ascii="Times New Roman" w:hAnsi="Times New Roman" w:cs="Times New Roman"/>
-                <w:noProof/>
-                <w:webHidden/>
-              </w:rPr>
-              <w:instrText xml:space="preserve"> PAGEREF _Toc243153605 \h </w:instrText>
-            </w:r>
-            <w:r>
-              <w:rPr>
-                <w:rFonts w:ascii="Times New Roman" w:hAnsi="Times New Roman" w:cs="Times New Roman"/>
-                <w:noProof/>
-                <w:webHidden/>
-              </w:rPr>
-            </w:r>
-            <w:r>
-              <w:rPr>
-                <w:rFonts w:ascii="Times New Roman" w:hAnsi="Times New Roman" w:cs="Times New Roman"/>
+                <w:noProof/>
+                <w:webHidden/>
+              </w:rPr>
+              <w:instrText xml:space="preserve"> PAGEREF _Toc243403962 \h </w:instrText>
+            </w:r>
+            <w:r>
+              <w:rPr>
+                <w:noProof/>
+                <w:webHidden/>
+              </w:rPr>
+            </w:r>
+            <w:r>
+              <w:rPr>
                 <w:noProof/>
                 <w:webHidden/>
               </w:rPr>
@@ -535,15 +553,13 @@
             </w:r>
             <w:r>
               <w:rPr>
-                <w:rFonts w:ascii="Times New Roman" w:hAnsi="Times New Roman" w:cs="Times New Roman"/>
-                <w:noProof/>
-                <w:webHidden/>
-              </w:rPr>
-              <w:t>5</w:t>
-            </w:r>
-            <w:r>
-              <w:rPr>
-                <w:rFonts w:ascii="Times New Roman" w:hAnsi="Times New Roman" w:cs="Times New Roman"/>
+                <w:noProof/>
+                <w:webHidden/>
+              </w:rPr>
+              <w:t>4</w:t>
+            </w:r>
+            <w:r>
+              <w:rPr>
                 <w:noProof/>
                 <w:webHidden/>
               </w:rPr>
@@ -558,24 +574,93 @@
               <w:tab w:val="right" w:leader="dot" w:pos="8828"/>
             </w:tabs>
             <w:rPr>
-              <w:rFonts w:ascii="Times New Roman" w:eastAsiaTheme="minorEastAsia" w:hAnsi="Times New Roman" w:cs="Times New Roman"/>
+              <w:rFonts w:asciiTheme="minorHAnsi" w:eastAsiaTheme="minorEastAsia" w:hAnsiTheme="minorHAnsi" w:cstheme="minorBidi"/>
               <w:noProof/>
               <w:kern w:val="2"/>
               <w14:ligatures w14:val="standardContextual"/>
             </w:rPr>
           </w:pPr>
-          <w:hyperlink w:anchor="_Toc243153606" w:history="1">
+          <w:hyperlink w:anchor="_Toc243403963" w:history="1">
             <w:r>
               <w:rPr>
                 <w:rStyle w:val="Hipervnculo"/>
-                <w:rFonts w:ascii="Times New Roman" w:hAnsi="Times New Roman" w:cs="Times New Roman"/>
+                <w:noProof/>
+              </w:rPr>
+              <w:t>Enunciado del problema</w:t>
+            </w:r>
+            <w:r>
+              <w:rPr>
+                <w:noProof/>
+                <w:webHidden/>
+              </w:rPr>
+              <w:tab/>
+            </w:r>
+            <w:r>
+              <w:rPr>
+                <w:noProof/>
+                <w:webHidden/>
+              </w:rPr>
+              <w:fldChar w:fldCharType="begin"/>
+            </w:r>
+            <w:r>
+              <w:rPr>
+                <w:noProof/>
+                <w:webHidden/>
+              </w:rPr>
+              <w:instrText xml:space="preserve"> PAGEREF _Toc243403963 \h </w:instrText>
+            </w:r>
+            <w:r>
+              <w:rPr>
+                <w:noProof/>
+                <w:webHidden/>
+              </w:rPr>
+            </w:r>
+            <w:r>
+              <w:rPr>
+                <w:noProof/>
+                <w:webHidden/>
+              </w:rPr>
+              <w:fldChar w:fldCharType="separate"/>
+            </w:r>
+            <w:r>
+              <w:rPr>
+                <w:noProof/>
+                <w:webHidden/>
+              </w:rPr>
+              <w:t>5</w:t>
+            </w:r>
+            <w:r>
+              <w:rPr>
+                <w:noProof/>
+                <w:webHidden/>
+              </w:rPr>
+              <w:fldChar w:fldCharType="end"/>
+            </w:r>
+          </w:hyperlink>
+        </w:p>
+        <w:p>
+          <w:pPr>
+            <w:pStyle w:val="TDC1"/>
+            <w:tabs>
+              <w:tab w:val="right" w:leader="dot" w:pos="8828"/>
+            </w:tabs>
+            <w:rPr>
+              <w:rFonts w:asciiTheme="minorHAnsi" w:eastAsiaTheme="minorEastAsia" w:hAnsiTheme="minorHAnsi" w:cstheme="minorBidi"/>
+              <w:noProof/>
+              <w:kern w:val="2"/>
+              <w14:ligatures w14:val="standardContextual"/>
+            </w:rPr>
+          </w:pPr>
+          <w:hyperlink w:anchor="_Toc243403964" w:history="1">
+            <w:r>
+              <w:rPr>
+                <w:rStyle w:val="Hipervnculo"/>
                 <w:noProof/>
               </w:rPr>
               <w:t>Objetivos</w:t>
             </w:r>
             <w:r>
               <w:rPr>
-                <w:rFonts w:ascii="Times New Roman" w:hAnsi="Times New Roman" w:cs="Times New Roman"/>
                 <w:noProof/>
                 <w:webHidden/>
               </w:rPr>
@@ -583,7 +668,6 @@
             </w:r>
             <w:r>
               <w:rPr>
-                <w:rFonts w:ascii="Times New Roman" w:hAnsi="Times New Roman" w:cs="Times New Roman"/>
                 <w:noProof/>
                 <w:webHidden/>
               </w:rPr>
@@ -591,22 +675,19 @@
             </w:r>
             <w:r>
               <w:rPr>
-                <w:rFonts w:ascii="Times New Roman" w:hAnsi="Times New Roman" w:cs="Times New Roman"/>
-                <w:noProof/>
-                <w:webHidden/>
-              </w:rPr>
-              <w:instrText xml:space="preserve"> PAGEREF _Toc243153606 \h </w:instrText>
-            </w:r>
-            <w:r>
-              <w:rPr>
-                <w:rFonts w:ascii="Times New Roman" w:hAnsi="Times New Roman" w:cs="Times New Roman"/>
-                <w:noProof/>
-                <w:webHidden/>
-              </w:rPr>
-            </w:r>
-            <w:r>
-              <w:rPr>
-                <w:rFonts w:ascii="Times New Roman" w:hAnsi="Times New Roman" w:cs="Times New Roman"/>
+                <w:noProof/>
+                <w:webHidden/>
+              </w:rPr>
+              <w:instrText xml:space="preserve"> PAGEREF _Toc243403964 \h </w:instrText>
+            </w:r>
+            <w:r>
+              <w:rPr>
+                <w:noProof/>
+                <w:webHidden/>
+              </w:rPr>
+            </w:r>
+            <w:r>
+              <w:rPr>
                 <w:noProof/>
                 <w:webHidden/>
               </w:rPr>
@@ -614,7 +695,6 @@
             </w:r>
             <w:r>
               <w:rPr>
-                <w:rFonts w:ascii="Times New Roman" w:hAnsi="Times New Roman" w:cs="Times New Roman"/>
                 <w:noProof/>
                 <w:webHidden/>
               </w:rPr>
@@ -622,7 +702,6 @@
             </w:r>
             <w:r>
               <w:rPr>
-                <w:rFonts w:ascii="Times New Roman" w:hAnsi="Times New Roman" w:cs="Times New Roman"/>
                 <w:noProof/>
                 <w:webHidden/>
               </w:rPr>
@@ -637,24 +716,22 @@
               <w:tab w:val="right" w:leader="dot" w:pos="8828"/>
             </w:tabs>
             <w:rPr>
-              <w:rFonts w:ascii="Times New Roman" w:eastAsiaTheme="minorEastAsia" w:hAnsi="Times New Roman" w:cs="Times New Roman"/>
+              <w:rFonts w:asciiTheme="minorHAnsi" w:eastAsiaTheme="minorEastAsia" w:hAnsiTheme="minorHAnsi" w:cstheme="minorBidi"/>
               <w:noProof/>
               <w:kern w:val="2"/>
               <w14:ligatures w14:val="standardContextual"/>
             </w:rPr>
           </w:pPr>
-          <w:hyperlink w:anchor="_Toc243153607" w:history="1">
+          <w:hyperlink w:anchor="_Toc243403965" w:history="1">
             <w:r>
               <w:rPr>
                 <w:rStyle w:val="Hipervnculo"/>
-                <w:rFonts w:ascii="Times New Roman" w:hAnsi="Times New Roman" w:cs="Times New Roman"/>
                 <w:noProof/>
               </w:rPr>
               <w:t>Objetivo General</w:t>
             </w:r>
             <w:r>
               <w:rPr>
-                <w:rFonts w:ascii="Times New Roman" w:hAnsi="Times New Roman" w:cs="Times New Roman"/>
                 <w:noProof/>
                 <w:webHidden/>
               </w:rPr>
@@ -662,7 +739,6 @@
             </w:r>
             <w:r>
               <w:rPr>
-                <w:rFonts w:ascii="Times New Roman" w:hAnsi="Times New Roman" w:cs="Times New Roman"/>
                 <w:noProof/>
                 <w:webHidden/>
               </w:rPr>
@@ -670,22 +746,19 @@
             </w:r>
             <w:r>
               <w:rPr>
-                <w:rFonts w:ascii="Times New Roman" w:hAnsi="Times New Roman" w:cs="Times New Roman"/>
-                <w:noProof/>
-                <w:webHidden/>
-              </w:rPr>
-              <w:instrText xml:space="preserve"> PAGEREF _Toc243153607 \h </w:instrText>
-            </w:r>
-            <w:r>
-              <w:rPr>
-                <w:rFonts w:ascii="Times New Roman" w:hAnsi="Times New Roman" w:cs="Times New Roman"/>
-                <w:noProof/>
-                <w:webHidden/>
-              </w:rPr>
-            </w:r>
-            <w:r>
-              <w:rPr>
-                <w:rFonts w:ascii="Times New Roman" w:hAnsi="Times New Roman" w:cs="Times New Roman"/>
+                <w:noProof/>
+                <w:webHidden/>
+              </w:rPr>
+              <w:instrText xml:space="preserve"> PAGEREF _Toc243403965 \h </w:instrText>
+            </w:r>
+            <w:r>
+              <w:rPr>
+                <w:noProof/>
+                <w:webHidden/>
+              </w:rPr>
+            </w:r>
+            <w:r>
+              <w:rPr>
                 <w:noProof/>
                 <w:webHidden/>
               </w:rPr>
@@ -693,7 +766,6 @@
             </w:r>
             <w:r>
               <w:rPr>
-                <w:rFonts w:ascii="Times New Roman" w:hAnsi="Times New Roman" w:cs="Times New Roman"/>
                 <w:noProof/>
                 <w:webHidden/>
               </w:rPr>
@@ -701,7 +773,6 @@
             </w:r>
             <w:r>
               <w:rPr>
-                <w:rFonts w:ascii="Times New Roman" w:hAnsi="Times New Roman" w:cs="Times New Roman"/>
                 <w:noProof/>
                 <w:webHidden/>
               </w:rPr>
@@ -716,24 +787,22 @@
               <w:tab w:val="right" w:leader="dot" w:pos="8828"/>
             </w:tabs>
             <w:rPr>
-              <w:rFonts w:ascii="Times New Roman" w:eastAsiaTheme="minorEastAsia" w:hAnsi="Times New Roman" w:cs="Times New Roman"/>
+              <w:rFonts w:asciiTheme="minorHAnsi" w:eastAsiaTheme="minorEastAsia" w:hAnsiTheme="minorHAnsi" w:cstheme="minorBidi"/>
               <w:noProof/>
               <w:kern w:val="2"/>
               <w14:ligatures w14:val="standardContextual"/>
             </w:rPr>
           </w:pPr>
-          <w:hyperlink w:anchor="_Toc243153608" w:history="1">
+          <w:hyperlink w:anchor="_Toc243403966" w:history="1">
             <w:r>
               <w:rPr>
                 <w:rStyle w:val="Hipervnculo"/>
-                <w:rFonts w:ascii="Times New Roman" w:hAnsi="Times New Roman" w:cs="Times New Roman"/>
                 <w:noProof/>
               </w:rPr>
               <w:t>Objetivos Específicos</w:t>
             </w:r>
             <w:r>
               <w:rPr>
-                <w:rFonts w:ascii="Times New Roman" w:hAnsi="Times New Roman" w:cs="Times New Roman"/>
                 <w:noProof/>
                 <w:webHidden/>
               </w:rPr>
@@ -741,7 +810,6 @@
             </w:r>
             <w:r>
               <w:rPr>
-                <w:rFonts w:ascii="Times New Roman" w:hAnsi="Times New Roman" w:cs="Times New Roman"/>
                 <w:noProof/>
                 <w:webHidden/>
               </w:rPr>
@@ -749,22 +817,19 @@
             </w:r>
             <w:r>
               <w:rPr>
-                <w:rFonts w:ascii="Times New Roman" w:hAnsi="Times New Roman" w:cs="Times New Roman"/>
-                <w:noProof/>
-                <w:webHidden/>
-              </w:rPr>
-              <w:instrText xml:space="preserve"> PAGEREF _Toc243153608 \h </w:instrText>
-            </w:r>
-            <w:r>
-              <w:rPr>
-                <w:rFonts w:ascii="Times New Roman" w:hAnsi="Times New Roman" w:cs="Times New Roman"/>
-                <w:noProof/>
-                <w:webHidden/>
-              </w:rPr>
-            </w:r>
-            <w:r>
-              <w:rPr>
-                <w:rFonts w:ascii="Times New Roman" w:hAnsi="Times New Roman" w:cs="Times New Roman"/>
+                <w:noProof/>
+                <w:webHidden/>
+              </w:rPr>
+              <w:instrText xml:space="preserve"> PAGEREF _Toc243403966 \h </w:instrText>
+            </w:r>
+            <w:r>
+              <w:rPr>
+                <w:noProof/>
+                <w:webHidden/>
+              </w:rPr>
+            </w:r>
+            <w:r>
+              <w:rPr>
                 <w:noProof/>
                 <w:webHidden/>
               </w:rPr>
@@ -772,7 +837,6 @@
             </w:r>
             <w:r>
               <w:rPr>
-                <w:rFonts w:ascii="Times New Roman" w:hAnsi="Times New Roman" w:cs="Times New Roman"/>
                 <w:noProof/>
                 <w:webHidden/>
               </w:rPr>
@@ -780,7 +844,6 @@
             </w:r>
             <w:r>
               <w:rPr>
-                <w:rFonts w:ascii="Times New Roman" w:hAnsi="Times New Roman" w:cs="Times New Roman"/>
                 <w:noProof/>
                 <w:webHidden/>
               </w:rPr>
@@ -795,24 +858,22 @@
               <w:tab w:val="right" w:leader="dot" w:pos="8828"/>
             </w:tabs>
             <w:rPr>
-              <w:rFonts w:ascii="Times New Roman" w:eastAsiaTheme="minorEastAsia" w:hAnsi="Times New Roman" w:cs="Times New Roman"/>
+              <w:rFonts w:asciiTheme="minorHAnsi" w:eastAsiaTheme="minorEastAsia" w:hAnsiTheme="minorHAnsi" w:cstheme="minorBidi"/>
               <w:noProof/>
               <w:kern w:val="2"/>
               <w14:ligatures w14:val="standardContextual"/>
             </w:rPr>
           </w:pPr>
-          <w:hyperlink w:anchor="_Toc243153609" w:history="1">
+          <w:hyperlink w:anchor="_Toc243403967" w:history="1">
             <w:r>
               <w:rPr>
                 <w:rStyle w:val="Hipervnculo"/>
-                <w:rFonts w:ascii="Times New Roman" w:hAnsi="Times New Roman" w:cs="Times New Roman"/>
-                <w:noProof/>
-              </w:rPr>
-              <w:t>Descripción de la solución</w:t>
-            </w:r>
-            <w:r>
-              <w:rPr>
-                <w:rFonts w:ascii="Times New Roman" w:hAnsi="Times New Roman" w:cs="Times New Roman"/>
+                <w:noProof/>
+              </w:rPr>
+              <w:t>Identificación de stakeholders y necesidades de análisis</w:t>
+            </w:r>
+            <w:r>
+              <w:rPr>
                 <w:noProof/>
                 <w:webHidden/>
               </w:rPr>
@@ -820,7 +881,6 @@
             </w:r>
             <w:r>
               <w:rPr>
-                <w:rFonts w:ascii="Times New Roman" w:hAnsi="Times New Roman" w:cs="Times New Roman"/>
                 <w:noProof/>
                 <w:webHidden/>
               </w:rPr>
@@ -828,22 +888,19 @@
             </w:r>
             <w:r>
               <w:rPr>
-                <w:rFonts w:ascii="Times New Roman" w:hAnsi="Times New Roman" w:cs="Times New Roman"/>
-                <w:noProof/>
-                <w:webHidden/>
-              </w:rPr>
-              <w:instrText xml:space="preserve"> PAGEREF _Toc243153609 \h </w:instrText>
-            </w:r>
-            <w:r>
-              <w:rPr>
-                <w:rFonts w:ascii="Times New Roman" w:hAnsi="Times New Roman" w:cs="Times New Roman"/>
-                <w:noProof/>
-                <w:webHidden/>
-              </w:rPr>
-            </w:r>
-            <w:r>
-              <w:rPr>
-                <w:rFonts w:ascii="Times New Roman" w:hAnsi="Times New Roman" w:cs="Times New Roman"/>
+                <w:noProof/>
+                <w:webHidden/>
+              </w:rPr>
+              <w:instrText xml:space="preserve"> PAGEREF _Toc243403967 \h </w:instrText>
+            </w:r>
+            <w:r>
+              <w:rPr>
+                <w:noProof/>
+                <w:webHidden/>
+              </w:rPr>
+            </w:r>
+            <w:r>
+              <w:rPr>
                 <w:noProof/>
                 <w:webHidden/>
               </w:rPr>
@@ -851,15 +908,13 @@
             </w:r>
             <w:r>
               <w:rPr>
-                <w:rFonts w:ascii="Times New Roman" w:hAnsi="Times New Roman" w:cs="Times New Roman"/>
-                <w:noProof/>
-                <w:webHidden/>
-              </w:rPr>
-              <w:t>7</w:t>
-            </w:r>
-            <w:r>
-              <w:rPr>
-                <w:rFonts w:ascii="Times New Roman" w:hAnsi="Times New Roman" w:cs="Times New Roman"/>
+                <w:noProof/>
+                <w:webHidden/>
+              </w:rPr>
+              <w:t>6</w:t>
+            </w:r>
+            <w:r>
+              <w:rPr>
                 <w:noProof/>
                 <w:webHidden/>
               </w:rPr>
@@ -874,24 +929,22 @@
               <w:tab w:val="right" w:leader="dot" w:pos="8828"/>
             </w:tabs>
             <w:rPr>
-              <w:rFonts w:ascii="Times New Roman" w:eastAsiaTheme="minorEastAsia" w:hAnsi="Times New Roman" w:cs="Times New Roman"/>
+              <w:rFonts w:asciiTheme="minorHAnsi" w:eastAsiaTheme="minorEastAsia" w:hAnsiTheme="minorHAnsi" w:cstheme="minorBidi"/>
               <w:noProof/>
               <w:kern w:val="2"/>
               <w14:ligatures w14:val="standardContextual"/>
             </w:rPr>
           </w:pPr>
-          <w:hyperlink w:anchor="_Toc243153610" w:history="1">
+          <w:hyperlink w:anchor="_Toc243403968" w:history="1">
             <w:r>
               <w:rPr>
                 <w:rStyle w:val="Hipervnculo"/>
-                <w:rFonts w:ascii="Times New Roman" w:hAnsi="Times New Roman" w:cs="Times New Roman"/>
-                <w:noProof/>
-              </w:rPr>
-              <w:t>Diagrama del Modelo Dimensional (Esquema Estrella o Copo de Nieve)</w:t>
-            </w:r>
-            <w:r>
-              <w:rPr>
-                <w:rFonts w:ascii="Times New Roman" w:hAnsi="Times New Roman" w:cs="Times New Roman"/>
+                <w:noProof/>
+              </w:rPr>
+              <w:t>Descripción de la solución</w:t>
+            </w:r>
+            <w:r>
+              <w:rPr>
                 <w:noProof/>
                 <w:webHidden/>
               </w:rPr>
@@ -899,7 +952,6 @@
             </w:r>
             <w:r>
               <w:rPr>
-                <w:rFonts w:ascii="Times New Roman" w:hAnsi="Times New Roman" w:cs="Times New Roman"/>
                 <w:noProof/>
                 <w:webHidden/>
               </w:rPr>
@@ -907,22 +959,19 @@
             </w:r>
             <w:r>
               <w:rPr>
-                <w:rFonts w:ascii="Times New Roman" w:hAnsi="Times New Roman" w:cs="Times New Roman"/>
-                <w:noProof/>
-                <w:webHidden/>
-              </w:rPr>
-              <w:instrText xml:space="preserve"> PAGEREF _Toc243153610 \h </w:instrText>
-            </w:r>
-            <w:r>
-              <w:rPr>
-                <w:rFonts w:ascii="Times New Roman" w:hAnsi="Times New Roman" w:cs="Times New Roman"/>
-                <w:noProof/>
-                <w:webHidden/>
-              </w:rPr>
-            </w:r>
-            <w:r>
-              <w:rPr>
-                <w:rFonts w:ascii="Times New Roman" w:hAnsi="Times New Roman" w:cs="Times New Roman"/>
+                <w:noProof/>
+                <w:webHidden/>
+              </w:rPr>
+              <w:instrText xml:space="preserve"> PAGEREF _Toc243403968 \h </w:instrText>
+            </w:r>
+            <w:r>
+              <w:rPr>
+                <w:noProof/>
+                <w:webHidden/>
+              </w:rPr>
+            </w:r>
+            <w:r>
+              <w:rPr>
                 <w:noProof/>
                 <w:webHidden/>
               </w:rPr>
@@ -930,7 +979,6 @@
             </w:r>
             <w:r>
               <w:rPr>
-                <w:rFonts w:ascii="Times New Roman" w:hAnsi="Times New Roman" w:cs="Times New Roman"/>
                 <w:noProof/>
                 <w:webHidden/>
               </w:rPr>
@@ -938,7 +986,6 @@
             </w:r>
             <w:r>
               <w:rPr>
-                <w:rFonts w:ascii="Times New Roman" w:hAnsi="Times New Roman" w:cs="Times New Roman"/>
                 <w:noProof/>
                 <w:webHidden/>
               </w:rPr>
@@ -953,24 +1000,22 @@
               <w:tab w:val="right" w:leader="dot" w:pos="8828"/>
             </w:tabs>
             <w:rPr>
-              <w:rFonts w:ascii="Times New Roman" w:eastAsiaTheme="minorEastAsia" w:hAnsi="Times New Roman" w:cs="Times New Roman"/>
+              <w:rFonts w:asciiTheme="minorHAnsi" w:eastAsiaTheme="minorEastAsia" w:hAnsiTheme="minorHAnsi" w:cstheme="minorBidi"/>
               <w:noProof/>
               <w:kern w:val="2"/>
               <w14:ligatures w14:val="standardContextual"/>
             </w:rPr>
           </w:pPr>
-          <w:hyperlink w:anchor="_Toc243153611" w:history="1">
+          <w:hyperlink w:anchor="_Toc243403969" w:history="1">
             <w:r>
               <w:rPr>
                 <w:rStyle w:val="Hipervnculo"/>
-                <w:rFonts w:ascii="Times New Roman" w:hAnsi="Times New Roman" w:cs="Times New Roman"/>
-                <w:noProof/>
-              </w:rPr>
-              <w:t>Conclusión</w:t>
-            </w:r>
-            <w:r>
-              <w:rPr>
-                <w:rFonts w:ascii="Times New Roman" w:hAnsi="Times New Roman" w:cs="Times New Roman"/>
+                <w:noProof/>
+              </w:rPr>
+              <w:t>Diagrama del Modelo Dimensional (Esquema Estrella o Copo de Nieve)</w:t>
+            </w:r>
+            <w:r>
+              <w:rPr>
                 <w:noProof/>
                 <w:webHidden/>
               </w:rPr>
@@ -978,7 +1023,6 @@
             </w:r>
             <w:r>
               <w:rPr>
-                <w:rFonts w:ascii="Times New Roman" w:hAnsi="Times New Roman" w:cs="Times New Roman"/>
                 <w:noProof/>
                 <w:webHidden/>
               </w:rPr>
@@ -986,22 +1030,19 @@
             </w:r>
             <w:r>
               <w:rPr>
-                <w:rFonts w:ascii="Times New Roman" w:hAnsi="Times New Roman" w:cs="Times New Roman"/>
-                <w:noProof/>
-                <w:webHidden/>
-              </w:rPr>
-              <w:instrText xml:space="preserve"> PAGEREF _Toc243153611 \h </w:instrText>
-            </w:r>
-            <w:r>
-              <w:rPr>
-                <w:rFonts w:ascii="Times New Roman" w:hAnsi="Times New Roman" w:cs="Times New Roman"/>
-                <w:noProof/>
-                <w:webHidden/>
-              </w:rPr>
-            </w:r>
-            <w:r>
-              <w:rPr>
-                <w:rFonts w:ascii="Times New Roman" w:hAnsi="Times New Roman" w:cs="Times New Roman"/>
+                <w:noProof/>
+                <w:webHidden/>
+              </w:rPr>
+              <w:instrText xml:space="preserve"> PAGEREF _Toc243403969 \h </w:instrText>
+            </w:r>
+            <w:r>
+              <w:rPr>
+                <w:noProof/>
+                <w:webHidden/>
+              </w:rPr>
+            </w:r>
+            <w:r>
+              <w:rPr>
                 <w:noProof/>
                 <w:webHidden/>
               </w:rPr>
@@ -1009,7 +1050,6 @@
             </w:r>
             <w:r>
               <w:rPr>
-                <w:rFonts w:ascii="Times New Roman" w:hAnsi="Times New Roman" w:cs="Times New Roman"/>
                 <w:noProof/>
                 <w:webHidden/>
               </w:rPr>
@@ -1017,7 +1057,6 @@
             </w:r>
             <w:r>
               <w:rPr>
-                <w:rFonts w:ascii="Times New Roman" w:hAnsi="Times New Roman" w:cs="Times New Roman"/>
                 <w:noProof/>
                 <w:webHidden/>
               </w:rPr>
@@ -1032,24 +1071,93 @@
               <w:tab w:val="right" w:leader="dot" w:pos="8828"/>
             </w:tabs>
             <w:rPr>
-              <w:rFonts w:ascii="Times New Roman" w:eastAsiaTheme="minorEastAsia" w:hAnsi="Times New Roman" w:cs="Times New Roman"/>
+              <w:rFonts w:asciiTheme="minorHAnsi" w:eastAsiaTheme="minorEastAsia" w:hAnsiTheme="minorHAnsi" w:cstheme="minorBidi"/>
               <w:noProof/>
               <w:kern w:val="2"/>
               <w14:ligatures w14:val="standardContextual"/>
             </w:rPr>
           </w:pPr>
-          <w:hyperlink w:anchor="_Toc243153612" w:history="1">
+          <w:hyperlink w:anchor="_Toc243403970" w:history="1">
             <w:r>
               <w:rPr>
                 <w:rStyle w:val="Hipervnculo"/>
-                <w:rFonts w:ascii="Times New Roman" w:hAnsi="Times New Roman" w:cs="Times New Roman"/>
+                <w:noProof/>
+              </w:rPr>
+              <w:t>Conclusión</w:t>
+            </w:r>
+            <w:r>
+              <w:rPr>
+                <w:noProof/>
+                <w:webHidden/>
+              </w:rPr>
+              <w:tab/>
+            </w:r>
+            <w:r>
+              <w:rPr>
+                <w:noProof/>
+                <w:webHidden/>
+              </w:rPr>
+              <w:fldChar w:fldCharType="begin"/>
+            </w:r>
+            <w:r>
+              <w:rPr>
+                <w:noProof/>
+                <w:webHidden/>
+              </w:rPr>
+              <w:instrText xml:space="preserve"> PAGEREF _Toc243403970 \h </w:instrText>
+            </w:r>
+            <w:r>
+              <w:rPr>
+                <w:noProof/>
+                <w:webHidden/>
+              </w:rPr>
+            </w:r>
+            <w:r>
+              <w:rPr>
+                <w:noProof/>
+                <w:webHidden/>
+              </w:rPr>
+              <w:fldChar w:fldCharType="separate"/>
+            </w:r>
+            <w:r>
+              <w:rPr>
+                <w:noProof/>
+                <w:webHidden/>
+              </w:rPr>
+              <w:t>10</w:t>
+            </w:r>
+            <w:r>
+              <w:rPr>
+                <w:noProof/>
+                <w:webHidden/>
+              </w:rPr>
+              <w:fldChar w:fldCharType="end"/>
+            </w:r>
+          </w:hyperlink>
+        </w:p>
+        <w:p>
+          <w:pPr>
+            <w:pStyle w:val="TDC1"/>
+            <w:tabs>
+              <w:tab w:val="right" w:leader="dot" w:pos="8828"/>
+            </w:tabs>
+            <w:rPr>
+              <w:rFonts w:asciiTheme="minorHAnsi" w:eastAsiaTheme="minorEastAsia" w:hAnsiTheme="minorHAnsi" w:cstheme="minorBidi"/>
+              <w:noProof/>
+              <w:kern w:val="2"/>
+              <w14:ligatures w14:val="standardContextual"/>
+            </w:rPr>
+          </w:pPr>
+          <w:hyperlink w:anchor="_Toc243403971" w:history="1">
+            <w:r>
+              <w:rPr>
+                <w:rStyle w:val="Hipervnculo"/>
                 <w:noProof/>
               </w:rPr>
               <w:t>Bibliografía</w:t>
             </w:r>
             <w:r>
               <w:rPr>
-                <w:rFonts w:ascii="Times New Roman" w:hAnsi="Times New Roman" w:cs="Times New Roman"/>
                 <w:noProof/>
                 <w:webHidden/>
               </w:rPr>
@@ -1057,7 +1165,6 @@
             </w:r>
             <w:r>
               <w:rPr>
-                <w:rFonts w:ascii="Times New Roman" w:hAnsi="Times New Roman" w:cs="Times New Roman"/>
                 <w:noProof/>
                 <w:webHidden/>
               </w:rPr>
@@ -1065,22 +1172,19 @@
             </w:r>
             <w:r>
               <w:rPr>
-                <w:rFonts w:ascii="Times New Roman" w:hAnsi="Times New Roman" w:cs="Times New Roman"/>
-                <w:noProof/>
-                <w:webHidden/>
-              </w:rPr>
-              <w:instrText xml:space="preserve"> PAGEREF _Toc243153612 \h </w:instrText>
-            </w:r>
-            <w:r>
-              <w:rPr>
-                <w:rFonts w:ascii="Times New Roman" w:hAnsi="Times New Roman" w:cs="Times New Roman"/>
-                <w:noProof/>
-                <w:webHidden/>
-              </w:rPr>
-            </w:r>
-            <w:r>
-              <w:rPr>
-                <w:rFonts w:ascii="Times New Roman" w:hAnsi="Times New Roman" w:cs="Times New Roman"/>
+                <w:noProof/>
+                <w:webHidden/>
+              </w:rPr>
+              <w:instrText xml:space="preserve"> PAGEREF _Toc243403971 \h </w:instrText>
+            </w:r>
+            <w:r>
+              <w:rPr>
+                <w:noProof/>
+                <w:webHidden/>
+              </w:rPr>
+            </w:r>
+            <w:r>
+              <w:rPr>
                 <w:noProof/>
                 <w:webHidden/>
               </w:rPr>
@@ -1088,15 +1192,13 @@
             </w:r>
             <w:r>
               <w:rPr>
-                <w:rFonts w:ascii="Times New Roman" w:hAnsi="Times New Roman" w:cs="Times New Roman"/>
-                <w:noProof/>
-                <w:webHidden/>
-              </w:rPr>
-              <w:t>10</w:t>
-            </w:r>
-            <w:r>
-              <w:rPr>
-                <w:rFonts w:ascii="Times New Roman" w:hAnsi="Times New Roman" w:cs="Times New Roman"/>
+                <w:noProof/>
+                <w:webHidden/>
+              </w:rPr>
+              <w:t>11</w:t>
+            </w:r>
+            <w:r>
+              <w:rPr>
                 <w:noProof/>
                 <w:webHidden/>
               </w:rPr>
@@ -1110,6 +1212,8 @@
               <w:rFonts w:ascii="Times New Roman" w:hAnsi="Times New Roman" w:cs="Times New Roman"/>
               <w:b/>
               <w:bCs/>
+              <w:sz w:val="22"/>
+              <w:szCs w:val="22"/>
               <w:lang w:val="es-ES"/>
             </w:rPr>
             <w:fldChar w:fldCharType="end"/>
@@ -1119,126 +1223,6 @@
     </w:sdt>
     <w:p>
       <w:pPr>
-        <w:jc w:val="center"/>
-        <w:rPr>
-          <w:rFonts w:ascii="Times New Roman" w:eastAsia="Times New Roman" w:hAnsi="Times New Roman" w:cs="Times New Roman"/>
-          <w:b/>
-          <w:bCs/>
-        </w:rPr>
-      </w:pPr>
-    </w:p>
-    <w:p>
-      <w:pPr>
-        <w:jc w:val="center"/>
-        <w:rPr>
-          <w:rFonts w:ascii="Times New Roman" w:eastAsia="Times New Roman" w:hAnsi="Times New Roman" w:cs="Times New Roman"/>
-          <w:b/>
-          <w:bCs/>
-        </w:rPr>
-      </w:pPr>
-    </w:p>
-    <w:p>
-      <w:pPr>
-        <w:jc w:val="center"/>
-        <w:rPr>
-          <w:rFonts w:ascii="Times New Roman" w:eastAsia="Times New Roman" w:hAnsi="Times New Roman" w:cs="Times New Roman"/>
-          <w:b/>
-          <w:bCs/>
-        </w:rPr>
-      </w:pPr>
-    </w:p>
-    <w:p>
-      <w:pPr>
-        <w:jc w:val="center"/>
-        <w:rPr>
-          <w:rFonts w:ascii="Times New Roman" w:eastAsia="Times New Roman" w:hAnsi="Times New Roman" w:cs="Times New Roman"/>
-          <w:b/>
-          <w:bCs/>
-        </w:rPr>
-      </w:pPr>
-    </w:p>
-    <w:p>
-      <w:pPr>
-        <w:jc w:val="center"/>
-        <w:rPr>
-          <w:rFonts w:ascii="Times New Roman" w:eastAsia="Times New Roman" w:hAnsi="Times New Roman" w:cs="Times New Roman"/>
-          <w:b/>
-          <w:bCs/>
-        </w:rPr>
-      </w:pPr>
-    </w:p>
-    <w:p>
-      <w:pPr>
-        <w:jc w:val="center"/>
-        <w:rPr>
-          <w:rFonts w:ascii="Times New Roman" w:eastAsia="Times New Roman" w:hAnsi="Times New Roman" w:cs="Times New Roman"/>
-          <w:b/>
-          <w:bCs/>
-        </w:rPr>
-      </w:pPr>
-    </w:p>
-    <w:p>
-      <w:pPr>
-        <w:jc w:val="center"/>
-        <w:rPr>
-          <w:rFonts w:ascii="Times New Roman" w:eastAsia="Times New Roman" w:hAnsi="Times New Roman" w:cs="Times New Roman"/>
-          <w:b/>
-          <w:bCs/>
-        </w:rPr>
-      </w:pPr>
-    </w:p>
-    <w:p>
-      <w:pPr>
-        <w:jc w:val="center"/>
-        <w:rPr>
-          <w:rFonts w:ascii="Times New Roman" w:eastAsia="Times New Roman" w:hAnsi="Times New Roman" w:cs="Times New Roman"/>
-          <w:b/>
-          <w:bCs/>
-        </w:rPr>
-      </w:pPr>
-    </w:p>
-    <w:p>
-      <w:pPr>
-        <w:jc w:val="center"/>
-        <w:rPr>
-          <w:rFonts w:ascii="Times New Roman" w:eastAsia="Times New Roman" w:hAnsi="Times New Roman" w:cs="Times New Roman"/>
-          <w:b/>
-          <w:bCs/>
-        </w:rPr>
-      </w:pPr>
-    </w:p>
-    <w:p>
-      <w:pPr>
-        <w:jc w:val="center"/>
-        <w:rPr>
-          <w:rFonts w:ascii="Times New Roman" w:eastAsia="Times New Roman" w:hAnsi="Times New Roman" w:cs="Times New Roman"/>
-          <w:b/>
-          <w:bCs/>
-        </w:rPr>
-      </w:pPr>
-    </w:p>
-    <w:p>
-      <w:pPr>
-        <w:jc w:val="center"/>
-        <w:rPr>
-          <w:rFonts w:ascii="Times New Roman" w:eastAsia="Times New Roman" w:hAnsi="Times New Roman" w:cs="Times New Roman"/>
-          <w:b/>
-          <w:bCs/>
-        </w:rPr>
-      </w:pPr>
-    </w:p>
-    <w:p>
-      <w:pPr>
-        <w:jc w:val="center"/>
-        <w:rPr>
-          <w:rFonts w:ascii="Times New Roman" w:eastAsia="Times New Roman" w:hAnsi="Times New Roman" w:cs="Times New Roman"/>
-          <w:b/>
-          <w:bCs/>
-        </w:rPr>
-      </w:pPr>
-    </w:p>
-    <w:p>
-      <w:pPr>
         <w:rPr>
           <w:rFonts w:ascii="Times New Roman" w:eastAsia="Times New Roman" w:hAnsi="Times New Roman" w:cs="Times New Roman"/>
           <w:b/>
@@ -1249,23 +1233,295 @@
     <w:p>
       <w:pPr>
         <w:pStyle w:val="Ttulo1"/>
-      </w:pPr>
-      <w:bookmarkStart w:id="0" w:name="_Toc243153603"/>
+        <w:rPr>
+          <w:rFonts w:cs="Times New Roman"/>
+          <w:sz w:val="22"/>
+          <w:szCs w:val="22"/>
+        </w:rPr>
+      </w:pPr>
+      <w:bookmarkStart w:id="0" w:name="_Toc234699713"/>
+      <w:bookmarkStart w:id="1" w:name="_Toc238242791"/>
+      <w:bookmarkStart w:id="2" w:name="_Toc243403960"/>
+      <w:r>
+        <w:rPr>
+          <w:rFonts w:cs="Times New Roman"/>
+          <w:sz w:val="22"/>
+          <w:szCs w:val="22"/>
+        </w:rPr>
+        <w:t>Lista de Tablas</w:t>
+      </w:r>
+      <w:bookmarkEnd w:id="0"/>
+      <w:bookmarkEnd w:id="1"/>
+      <w:bookmarkEnd w:id="2"/>
+      <w:r>
+        <w:rPr>
+          <w:rFonts w:cs="Times New Roman"/>
+          <w:sz w:val="22"/>
+          <w:szCs w:val="22"/>
+        </w:rPr>
+        <w:br/>
+      </w:r>
+    </w:p>
+    <w:p>
+      <w:pPr>
+        <w:pStyle w:val="Tabladeilustraciones"/>
+        <w:tabs>
+          <w:tab w:val="left" w:pos="1200"/>
+          <w:tab w:val="right" w:leader="dot" w:pos="8828"/>
+        </w:tabs>
+        <w:rPr>
+          <w:rFonts w:asciiTheme="minorHAnsi" w:eastAsiaTheme="minorEastAsia" w:hAnsiTheme="minorHAnsi" w:cstheme="minorBidi"/>
+          <w:noProof/>
+          <w:kern w:val="2"/>
+          <w:sz w:val="22"/>
+          <w:szCs w:val="22"/>
+          <w14:ligatures w14:val="standardContextual"/>
+        </w:rPr>
+      </w:pPr>
+      <w:r>
+        <w:rPr>
+          <w:rFonts w:ascii="Times New Roman" w:eastAsia="Times New Roman" w:hAnsi="Times New Roman" w:cs="Times New Roman"/>
+          <w:b/>
+          <w:bCs/>
+          <w:sz w:val="22"/>
+          <w:szCs w:val="22"/>
+        </w:rPr>
+        <w:fldChar w:fldCharType="begin"/>
+      </w:r>
+      <w:r>
+        <w:rPr>
+          <w:rFonts w:ascii="Times New Roman" w:eastAsia="Times New Roman" w:hAnsi="Times New Roman" w:cs="Times New Roman"/>
+          <w:b/>
+          <w:bCs/>
+          <w:sz w:val="22"/>
+          <w:szCs w:val="22"/>
+        </w:rPr>
+        <w:instrText xml:space="preserve"> TOC \h \z \c "Tabla" </w:instrText>
+      </w:r>
+      <w:r>
+        <w:rPr>
+          <w:rFonts w:ascii="Times New Roman" w:eastAsia="Times New Roman" w:hAnsi="Times New Roman" w:cs="Times New Roman"/>
+          <w:b/>
+          <w:bCs/>
+          <w:sz w:val="22"/>
+          <w:szCs w:val="22"/>
+        </w:rPr>
+        <w:fldChar w:fldCharType="separate"/>
+      </w:r>
+      <w:hyperlink w:anchor="_Toc243396385" w:history="1">
+        <w:r>
+          <w:rPr>
+            <w:rStyle w:val="Hipervnculo"/>
+            <w:rFonts w:ascii="Times New Roman" w:eastAsiaTheme="minorHAnsi" w:hAnsi="Times New Roman" w:cs="Times New Roman"/>
+            <w:b/>
+            <w:bCs/>
+            <w:noProof/>
+            <w:sz w:val="22"/>
+            <w:szCs w:val="22"/>
+            <w:lang w:eastAsia="en-US"/>
+          </w:rPr>
+          <w:t>Tabla 1</w:t>
+        </w:r>
+        <w:r>
+          <w:rPr>
+            <w:rFonts w:asciiTheme="minorHAnsi" w:eastAsiaTheme="minorEastAsia" w:hAnsiTheme="minorHAnsi" w:cstheme="minorBidi"/>
+            <w:noProof/>
+            <w:kern w:val="2"/>
+            <w:sz w:val="22"/>
+            <w:szCs w:val="22"/>
+            <w14:ligatures w14:val="standardContextual"/>
+          </w:rPr>
+          <w:tab/>
+        </w:r>
+        <w:r>
+          <w:rPr>
+            <w:rStyle w:val="Hipervnculo"/>
+            <w:rFonts w:ascii="Times New Roman" w:eastAsiaTheme="minorHAnsi" w:hAnsi="Times New Roman" w:cs="Times New Roman"/>
+            <w:b/>
+            <w:bCs/>
+            <w:noProof/>
+            <w:sz w:val="22"/>
+            <w:szCs w:val="22"/>
+            <w:lang w:eastAsia="en-US"/>
+          </w:rPr>
+          <w:t xml:space="preserve">                                                                                                                              </w:t>
+        </w:r>
+        <w:r>
+          <w:rPr>
+            <w:rStyle w:val="Hipervnculo"/>
+            <w:rFonts w:ascii="Times New Roman" w:eastAsiaTheme="minorHAnsi" w:hAnsi="Times New Roman" w:cs="Times New Roman"/>
+            <w:noProof/>
+            <w:sz w:val="22"/>
+            <w:szCs w:val="22"/>
+            <w:lang w:eastAsia="en-US"/>
+          </w:rPr>
+          <w:t>Stakeholders, necesidades de análisis</w:t>
+        </w:r>
+        <w:r>
+          <w:rPr>
+            <w:noProof/>
+            <w:webHidden/>
+            <w:sz w:val="22"/>
+            <w:szCs w:val="22"/>
+          </w:rPr>
+          <w:tab/>
+        </w:r>
+        <w:r>
+          <w:rPr>
+            <w:noProof/>
+            <w:webHidden/>
+            <w:sz w:val="22"/>
+            <w:szCs w:val="22"/>
+          </w:rPr>
+          <w:fldChar w:fldCharType="begin"/>
+        </w:r>
+        <w:r>
+          <w:rPr>
+            <w:noProof/>
+            <w:webHidden/>
+            <w:sz w:val="22"/>
+            <w:szCs w:val="22"/>
+          </w:rPr>
+          <w:instrText xml:space="preserve"> PAGEREF _Toc243396385 \h </w:instrText>
+        </w:r>
+        <w:r>
+          <w:rPr>
+            <w:noProof/>
+            <w:webHidden/>
+            <w:sz w:val="22"/>
+            <w:szCs w:val="22"/>
+          </w:rPr>
+        </w:r>
+        <w:r>
+          <w:rPr>
+            <w:noProof/>
+            <w:webHidden/>
+            <w:sz w:val="22"/>
+            <w:szCs w:val="22"/>
+          </w:rPr>
+          <w:fldChar w:fldCharType="separate"/>
+        </w:r>
+        <w:r>
+          <w:rPr>
+            <w:noProof/>
+            <w:webHidden/>
+            <w:sz w:val="22"/>
+            <w:szCs w:val="22"/>
+          </w:rPr>
+          <w:t>7</w:t>
+        </w:r>
+        <w:r>
+          <w:rPr>
+            <w:noProof/>
+            <w:webHidden/>
+            <w:sz w:val="22"/>
+            <w:szCs w:val="22"/>
+          </w:rPr>
+          <w:fldChar w:fldCharType="end"/>
+        </w:r>
+      </w:hyperlink>
+    </w:p>
+    <w:p>
+      <w:pPr>
+        <w:jc w:val="center"/>
+        <w:rPr>
+          <w:rFonts w:ascii="Times New Roman" w:eastAsia="Times New Roman" w:hAnsi="Times New Roman" w:cs="Times New Roman"/>
+          <w:b/>
+          <w:bCs/>
+          <w:sz w:val="22"/>
+          <w:szCs w:val="22"/>
+        </w:rPr>
+      </w:pPr>
+      <w:r>
+        <w:rPr>
+          <w:rFonts w:ascii="Times New Roman" w:eastAsia="Times New Roman" w:hAnsi="Times New Roman" w:cs="Times New Roman"/>
+          <w:b/>
+          <w:bCs/>
+          <w:sz w:val="22"/>
+          <w:szCs w:val="22"/>
+        </w:rPr>
+        <w:fldChar w:fldCharType="end"/>
+      </w:r>
+    </w:p>
+    <w:p>
+      <w:pPr>
+        <w:jc w:val="center"/>
+        <w:rPr>
+          <w:rFonts w:ascii="Times New Roman" w:eastAsia="Times New Roman" w:hAnsi="Times New Roman" w:cs="Times New Roman"/>
+          <w:b/>
+          <w:bCs/>
+        </w:rPr>
+      </w:pPr>
+    </w:p>
+    <w:p>
+      <w:pPr>
+        <w:jc w:val="center"/>
+        <w:rPr>
+          <w:rFonts w:ascii="Times New Roman" w:eastAsia="Times New Roman" w:hAnsi="Times New Roman" w:cs="Times New Roman"/>
+          <w:b/>
+          <w:bCs/>
+        </w:rPr>
+      </w:pPr>
+    </w:p>
+    <w:p>
+      <w:pPr>
+        <w:jc w:val="center"/>
+        <w:rPr>
+          <w:rFonts w:ascii="Times New Roman" w:eastAsia="Times New Roman" w:hAnsi="Times New Roman" w:cs="Times New Roman"/>
+          <w:b/>
+          <w:bCs/>
+        </w:rPr>
+      </w:pPr>
+    </w:p>
+    <w:p>
+      <w:pPr>
+        <w:jc w:val="center"/>
+        <w:rPr>
+          <w:rFonts w:ascii="Times New Roman" w:eastAsia="Times New Roman" w:hAnsi="Times New Roman" w:cs="Times New Roman"/>
+          <w:b/>
+          <w:bCs/>
+        </w:rPr>
+      </w:pPr>
+    </w:p>
+    <w:p>
+      <w:pPr>
+        <w:jc w:val="center"/>
+        <w:rPr>
+          <w:rFonts w:ascii="Times New Roman" w:eastAsia="Times New Roman" w:hAnsi="Times New Roman" w:cs="Times New Roman"/>
+          <w:b/>
+          <w:bCs/>
+        </w:rPr>
+      </w:pPr>
+    </w:p>
+    <w:p>
+      <w:pPr>
+        <w:jc w:val="center"/>
+        <w:rPr>
+          <w:rFonts w:ascii="Times New Roman" w:eastAsia="Times New Roman" w:hAnsi="Times New Roman" w:cs="Times New Roman"/>
+          <w:b/>
+          <w:bCs/>
+        </w:rPr>
+      </w:pPr>
+    </w:p>
+    <w:p>
+      <w:pPr>
+        <w:rPr>
+          <w:rFonts w:ascii="Times New Roman" w:eastAsia="Times New Roman" w:hAnsi="Times New Roman" w:cs="Times New Roman"/>
+          <w:b/>
+          <w:bCs/>
+        </w:rPr>
+      </w:pPr>
+    </w:p>
+    <w:p>
+      <w:pPr>
+        <w:pStyle w:val="Ttulo1"/>
+      </w:pPr>
+      <w:bookmarkStart w:id="3" w:name="_Toc243403961"/>
       <w:r>
         <w:lastRenderedPageBreak/>
         <w:t>Introducción</w:t>
       </w:r>
-      <w:bookmarkEnd w:id="0"/>
-    </w:p>
-    <w:p>
-      <w:pPr>
-        <w:jc w:val="center"/>
-        <w:rPr>
-          <w:rFonts w:ascii="Times New Roman" w:eastAsia="Times New Roman" w:hAnsi="Times New Roman" w:cs="Times New Roman"/>
-          <w:b/>
-          <w:bCs/>
-        </w:rPr>
-      </w:pPr>
+      <w:bookmarkEnd w:id="3"/>
     </w:p>
     <w:p>
       <w:pPr>
@@ -1273,39 +1529,33 @@
         <w:ind w:firstLine="720"/>
         <w:rPr>
           <w:rFonts w:ascii="Times New Roman" w:eastAsia="Times New Roman" w:hAnsi="Times New Roman" w:cs="Times New Roman"/>
-        </w:rPr>
-      </w:pPr>
-      <w:r>
-        <w:rPr>
-          <w:rFonts w:ascii="Times New Roman" w:eastAsia="Times New Roman" w:hAnsi="Times New Roman" w:cs="Times New Roman"/>
-        </w:rPr>
-        <w:t xml:space="preserve">En la actualidad, la gran mayoría de empresas almacenan datos relacionados con sus actividades. Por esta razón, la información generada es necesaria organizarla y prepararla de manera que facilite su consulta. A partir de este contexto, los Data </w:t>
+          <w:sz w:val="22"/>
+          <w:szCs w:val="22"/>
+        </w:rPr>
+      </w:pPr>
+      <w:r>
+        <w:rPr>
+          <w:rFonts w:ascii="Times New Roman" w:eastAsia="Times New Roman" w:hAnsi="Times New Roman" w:cs="Times New Roman"/>
+          <w:sz w:val="22"/>
+          <w:szCs w:val="22"/>
+        </w:rPr>
+        <w:t xml:space="preserve">En la actualidad, la gran mayoría de empresas almacenan datos relacionados con sus actividades. Por esta razón, la información generada es necesaria organizarla y prepararla de manera que facilite su consulta. A partir de este contexto, los Data Warehouse permiten almacenar información de manera organizada para facilitar su análisis y apoyar la toma de decisiones (Neural </w:t>
       </w:r>
       <w:proofErr w:type="spellStart"/>
       <w:r>
         <w:rPr>
           <w:rFonts w:ascii="Times New Roman" w:eastAsia="Times New Roman" w:hAnsi="Times New Roman" w:cs="Times New Roman"/>
-        </w:rPr>
-        <w:t>Warehouse</w:t>
+          <w:sz w:val="22"/>
+          <w:szCs w:val="22"/>
+        </w:rPr>
+        <w:t>Coders</w:t>
       </w:r>
       <w:proofErr w:type="spellEnd"/>
       <w:r>
         <w:rPr>
           <w:rFonts w:ascii="Times New Roman" w:eastAsia="Times New Roman" w:hAnsi="Times New Roman" w:cs="Times New Roman"/>
-        </w:rPr>
-        <w:t xml:space="preserve"> permiten almacenar información de manera organizada para facilitar su análisis y apoyar la toma de decisiones (Neural </w:t>
-      </w:r>
-      <w:proofErr w:type="spellStart"/>
-      <w:r>
-        <w:rPr>
-          <w:rFonts w:ascii="Times New Roman" w:eastAsia="Times New Roman" w:hAnsi="Times New Roman" w:cs="Times New Roman"/>
-        </w:rPr>
-        <w:t>Coders</w:t>
-      </w:r>
-      <w:proofErr w:type="spellEnd"/>
-      <w:r>
-        <w:rPr>
-          <w:rFonts w:ascii="Times New Roman" w:eastAsia="Times New Roman" w:hAnsi="Times New Roman" w:cs="Times New Roman"/>
+          <w:sz w:val="22"/>
+          <w:szCs w:val="22"/>
         </w:rPr>
         <w:t>, 2023).</w:t>
       </w:r>
@@ -1316,69 +1566,35 @@
         <w:ind w:firstLine="720"/>
         <w:rPr>
           <w:rFonts w:ascii="Times New Roman" w:eastAsia="Times New Roman" w:hAnsi="Times New Roman" w:cs="Times New Roman"/>
-        </w:rPr>
-      </w:pPr>
-      <w:r>
-        <w:rPr>
-          <w:rFonts w:ascii="Times New Roman" w:eastAsia="Times New Roman" w:hAnsi="Times New Roman" w:cs="Times New Roman"/>
-        </w:rPr>
-        <w:t xml:space="preserve">El siguiente proyecto tiene como finalidad desarrollar un Data </w:t>
+          <w:sz w:val="22"/>
+          <w:szCs w:val="22"/>
+        </w:rPr>
+      </w:pPr>
+      <w:r>
+        <w:rPr>
+          <w:rFonts w:ascii="Times New Roman" w:eastAsia="Times New Roman" w:hAnsi="Times New Roman" w:cs="Times New Roman"/>
+          <w:sz w:val="22"/>
+          <w:szCs w:val="22"/>
+        </w:rPr>
+        <w:t xml:space="preserve">El siguiente proyecto tiene como finalidad desarrollar un Data Warehouse para la empresa </w:t>
       </w:r>
       <w:proofErr w:type="spellStart"/>
       <w:r>
         <w:rPr>
           <w:rFonts w:ascii="Times New Roman" w:eastAsia="Times New Roman" w:hAnsi="Times New Roman" w:cs="Times New Roman"/>
-        </w:rPr>
-        <w:t>Warehouse</w:t>
+          <w:sz w:val="22"/>
+          <w:szCs w:val="22"/>
+        </w:rPr>
+        <w:t>Invacom</w:t>
       </w:r>
       <w:proofErr w:type="spellEnd"/>
       <w:r>
         <w:rPr>
           <w:rFonts w:ascii="Times New Roman" w:eastAsia="Times New Roman" w:hAnsi="Times New Roman" w:cs="Times New Roman"/>
-        </w:rPr>
-        <w:t xml:space="preserve"> para la empresa </w:t>
-      </w:r>
-      <w:proofErr w:type="spellStart"/>
-      <w:r>
-        <w:rPr>
-          <w:rFonts w:ascii="Times New Roman" w:eastAsia="Times New Roman" w:hAnsi="Times New Roman" w:cs="Times New Roman"/>
-        </w:rPr>
-        <w:t>Invacom</w:t>
-      </w:r>
-      <w:proofErr w:type="spellEnd"/>
-      <w:r>
-        <w:rPr>
-          <w:rFonts w:ascii="Times New Roman" w:eastAsia="Times New Roman" w:hAnsi="Times New Roman" w:cs="Times New Roman"/>
-        </w:rPr>
-        <w:t xml:space="preserve"> Inc. S.A., utilizando la base de datos </w:t>
-      </w:r>
-      <w:proofErr w:type="spellStart"/>
-      <w:r>
-        <w:rPr>
-          <w:rFonts w:ascii="Times New Roman" w:eastAsia="Times New Roman" w:hAnsi="Times New Roman" w:cs="Times New Roman"/>
-        </w:rPr>
-        <w:t>Dunnhumby</w:t>
-      </w:r>
-      <w:proofErr w:type="spellEnd"/>
-      <w:r>
-        <w:rPr>
-          <w:rFonts w:ascii="Times New Roman" w:eastAsia="Times New Roman" w:hAnsi="Times New Roman" w:cs="Times New Roman"/>
-        </w:rPr>
-        <w:t xml:space="preserve">, relacionada con el sector de supermercados y consumo masivo. Esta contiene información sobre las compras realizadas por 2.500 hogares en cadenas de supermercados, incluyendo registros de productos, transacciones, hogares, campañas promocionales y cupones. Considerando estos datos, se analizarán las tablas, sus relaciones y la calidad de la información para determinar cómo organizarla dentro del Data </w:t>
-      </w:r>
-      <w:proofErr w:type="spellStart"/>
-      <w:r>
-        <w:rPr>
-          <w:rFonts w:ascii="Times New Roman" w:eastAsia="Times New Roman" w:hAnsi="Times New Roman" w:cs="Times New Roman"/>
-        </w:rPr>
-        <w:t>Warehouse</w:t>
-      </w:r>
-      <w:proofErr w:type="spellEnd"/>
-      <w:r>
-        <w:rPr>
-          <w:rFonts w:ascii="Times New Roman" w:eastAsia="Times New Roman" w:hAnsi="Times New Roman" w:cs="Times New Roman"/>
-        </w:rPr>
-        <w:t>.</w:t>
+          <w:sz w:val="22"/>
+          <w:szCs w:val="22"/>
+        </w:rPr>
+        <w:t xml:space="preserve"> Inc. S.A., utilizando la base de datos Dunnhumby, relacionada con el sector de supermercados y consumo masivo. Esta contiene información sobre las compras realizadas por 2.500 hogares en cadenas de supermercados, incluyendo registros de productos, transacciones, hogares, campañas promocionales y cupones. Considerando estos datos, se analizarán las tablas, sus relaciones y la calidad de la información para determinar cómo organizarla dentro del Data Warehouse.</w:t>
       </w:r>
     </w:p>
     <w:p>
@@ -1387,55 +1603,17 @@
         <w:ind w:firstLine="720"/>
         <w:rPr>
           <w:rFonts w:ascii="Times New Roman" w:eastAsia="Times New Roman" w:hAnsi="Times New Roman" w:cs="Times New Roman"/>
-        </w:rPr>
-      </w:pPr>
-      <w:r>
-        <w:rPr>
-          <w:rFonts w:ascii="Times New Roman" w:eastAsia="Times New Roman" w:hAnsi="Times New Roman" w:cs="Times New Roman"/>
-        </w:rPr>
-        <w:t xml:space="preserve">Para desarrollar el proyecto, se usará PostgreSQL como gestor de bases de datos y </w:t>
-      </w:r>
-      <w:proofErr w:type="spellStart"/>
-      <w:r>
-        <w:rPr>
-          <w:rFonts w:ascii="Times New Roman" w:eastAsia="Times New Roman" w:hAnsi="Times New Roman" w:cs="Times New Roman"/>
-        </w:rPr>
-        <w:t>dbt</w:t>
-      </w:r>
-      <w:proofErr w:type="spellEnd"/>
-      <w:r>
-        <w:rPr>
-          <w:rFonts w:ascii="Times New Roman" w:eastAsia="Times New Roman" w:hAnsi="Times New Roman" w:cs="Times New Roman"/>
-        </w:rPr>
-        <w:t xml:space="preserve"> (Data </w:t>
-      </w:r>
-      <w:proofErr w:type="spellStart"/>
-      <w:r>
-        <w:rPr>
-          <w:rFonts w:ascii="Times New Roman" w:eastAsia="Times New Roman" w:hAnsi="Times New Roman" w:cs="Times New Roman"/>
-        </w:rPr>
-        <w:t>Build</w:t>
-      </w:r>
-      <w:proofErr w:type="spellEnd"/>
-      <w:r>
-        <w:rPr>
-          <w:rFonts w:ascii="Times New Roman" w:eastAsia="Times New Roman" w:hAnsi="Times New Roman" w:cs="Times New Roman"/>
-        </w:rPr>
-        <w:t xml:space="preserve"> Tool) como herramienta para transformar los datos. Según Gomstyn y McGrath (s.f.), el proceso ETL permite extraer, limpiar y organizar información de diferentes fuentes para posteriormente almacenarla en una base de datos o Data </w:t>
-      </w:r>
-      <w:proofErr w:type="spellStart"/>
-      <w:r>
-        <w:rPr>
-          <w:rFonts w:ascii="Times New Roman" w:eastAsia="Times New Roman" w:hAnsi="Times New Roman" w:cs="Times New Roman"/>
-        </w:rPr>
-        <w:t>Warehouse</w:t>
-      </w:r>
-      <w:proofErr w:type="spellEnd"/>
-      <w:r>
-        <w:rPr>
-          <w:rFonts w:ascii="Times New Roman" w:eastAsia="Times New Roman" w:hAnsi="Times New Roman" w:cs="Times New Roman"/>
-        </w:rPr>
-        <w:t>. Además, se diseñará un modelo dimensional mediante tablas de hechos y dimensiones, definiendo las medidas y el nivel de detalle que tendrá la información según las necesidades de la empresa.</w:t>
+          <w:sz w:val="22"/>
+          <w:szCs w:val="22"/>
+        </w:rPr>
+      </w:pPr>
+      <w:r>
+        <w:rPr>
+          <w:rFonts w:ascii="Times New Roman" w:eastAsia="Times New Roman" w:hAnsi="Times New Roman" w:cs="Times New Roman"/>
+          <w:sz w:val="22"/>
+          <w:szCs w:val="22"/>
+        </w:rPr>
+        <w:t>Para desarrollar el proyecto, se usará PostgreSQL como gestor de bases de datos y dbt (Data Build Tool) como herramienta para transformar los datos. Según Gomstyn y McGrath (s.f.), el proceso ETL permite extraer, limpiar y organizar información de diferentes fuentes para posteriormente almacenarla en una base de datos o Data Warehouse. Además, se diseñará un modelo dimensional mediante tablas de hechos y dimensiones, definiendo las medidas y el nivel de detalle que tendrá la información según las necesidades de la empresa.</w:t>
       </w:r>
     </w:p>
     <w:p>
@@ -1444,99 +1622,48 @@
         <w:ind w:firstLine="720"/>
         <w:rPr>
           <w:rFonts w:ascii="Times New Roman" w:eastAsia="Times New Roman" w:hAnsi="Times New Roman" w:cs="Times New Roman"/>
-        </w:rPr>
-      </w:pPr>
-      <w:r>
-        <w:rPr>
-          <w:rFonts w:ascii="Times New Roman" w:eastAsia="Times New Roman" w:hAnsi="Times New Roman" w:cs="Times New Roman"/>
-        </w:rPr>
-        <w:t xml:space="preserve">Finalmente, se busca desarrollar un Data </w:t>
-      </w:r>
-      <w:proofErr w:type="spellStart"/>
-      <w:r>
-        <w:rPr>
-          <w:rFonts w:ascii="Times New Roman" w:eastAsia="Times New Roman" w:hAnsi="Times New Roman" w:cs="Times New Roman"/>
-        </w:rPr>
-        <w:t>Warehouse</w:t>
-      </w:r>
-      <w:proofErr w:type="spellEnd"/>
-      <w:r>
-        <w:rPr>
-          <w:rFonts w:ascii="Times New Roman" w:eastAsia="Times New Roman" w:hAnsi="Times New Roman" w:cs="Times New Roman"/>
-        </w:rPr>
-        <w:t xml:space="preserve"> que permita realizar consultas y elaborar tablas dinámicas en Excel, facilitando el análisis de la información comercial y </w:t>
-      </w:r>
-      <w:r>
-        <w:rPr>
-          <w:rFonts w:ascii="Times New Roman" w:eastAsia="Times New Roman" w:hAnsi="Times New Roman" w:cs="Times New Roman"/>
-        </w:rPr>
+          <w:sz w:val="22"/>
+          <w:szCs w:val="22"/>
+        </w:rPr>
+      </w:pPr>
+      <w:r>
+        <w:rPr>
+          <w:rFonts w:ascii="Times New Roman" w:eastAsia="Times New Roman" w:hAnsi="Times New Roman" w:cs="Times New Roman"/>
+          <w:sz w:val="22"/>
+          <w:szCs w:val="22"/>
+        </w:rPr>
+        <w:t>Finalmente, se busca desarrollar un Data Warehouse que permita realizar consultas y elaborar tablas dinámicas en Excel, facilitando el análisis de la información comercial y apoyando la toma de decisiones de la empresa. De dicha manera, el proyecto también permitirá poner en práctica los conocimientos teóricos-prácticos adquiridos sobre bases de datos, procesos de transformación y modelado dimensional</w:t>
+      </w:r>
+      <w:r>
+        <w:rPr>
+          <w:rFonts w:ascii="Times New Roman" w:eastAsia="Times New Roman" w:hAnsi="Times New Roman" w:cs="Times New Roman"/>
+          <w:sz w:val="22"/>
+          <w:szCs w:val="22"/>
+        </w:rPr>
+        <w:t>.</w:t>
+      </w:r>
+    </w:p>
+    <w:p>
+      <w:pPr>
+        <w:pStyle w:val="Ttulo1"/>
+      </w:pPr>
+      <w:bookmarkStart w:id="4" w:name="_Toc243403962"/>
+      <w:r>
         <w:lastRenderedPageBreak/>
-        <w:t>apoyando la toma de decisiones de la empresa. De dicha manera, el proyecto también permitirá poner en práctica los conocimientos teóricos-prácticos adquiridos sobre bases de datos, procesos de transformación y modelado dimensional.</w:t>
-      </w:r>
-    </w:p>
-    <w:p>
-      <w:pPr>
-        <w:rPr>
-          <w:rFonts w:ascii="Times New Roman" w:eastAsia="Times New Roman" w:hAnsi="Times New Roman" w:cs="Times New Roman"/>
-        </w:rPr>
-      </w:pPr>
-    </w:p>
-    <w:p>
-      <w:pPr>
-        <w:shd w:val="clear" w:color="auto" w:fill="FFFFFF"/>
-        <w:spacing w:after="300" w:line="432" w:lineRule="auto"/>
-        <w:rPr>
-          <w:rFonts w:ascii="Times New Roman" w:eastAsia="Times New Roman" w:hAnsi="Times New Roman" w:cs="Times New Roman"/>
-          <w:b/>
-          <w:bCs/>
-        </w:rPr>
-      </w:pPr>
-    </w:p>
-    <w:p>
-      <w:pPr>
-        <w:shd w:val="clear" w:color="auto" w:fill="FFFFFF"/>
-        <w:spacing w:after="300" w:line="432" w:lineRule="auto"/>
-        <w:rPr>
-          <w:rFonts w:ascii="Times New Roman" w:eastAsia="Times New Roman" w:hAnsi="Times New Roman" w:cs="Times New Roman"/>
-          <w:b/>
-          <w:bCs/>
-        </w:rPr>
-      </w:pPr>
-    </w:p>
-    <w:p>
-      <w:pPr>
-        <w:pStyle w:val="Ttulo1"/>
-      </w:pPr>
-      <w:bookmarkStart w:id="1" w:name="_Toc243153604"/>
-      <w:r>
         <w:t>Enlace al repositorio de Git</w:t>
       </w:r>
-      <w:bookmarkEnd w:id="1"/>
-    </w:p>
-    <w:p>
-      <w:pPr>
-        <w:jc w:val="center"/>
-        <w:rPr>
-          <w:rFonts w:ascii="Times New Roman" w:eastAsia="Times New Roman" w:hAnsi="Times New Roman" w:cs="Times New Roman"/>
-          <w:b/>
-          <w:bCs/>
-        </w:rPr>
-      </w:pPr>
-    </w:p>
-    <w:p>
-      <w:pPr>
-        <w:rPr>
-          <w:rFonts w:ascii="Times New Roman" w:eastAsia="Times New Roman" w:hAnsi="Times New Roman" w:cs="Times New Roman"/>
-          <w:b/>
-          <w:bCs/>
+      <w:bookmarkEnd w:id="4"/>
+    </w:p>
+    <w:p>
+      <w:pPr>
+        <w:rPr>
+          <w:rFonts w:ascii="Times New Roman" w:eastAsia="Times New Roman" w:hAnsi="Times New Roman" w:cs="Times New Roman"/>
         </w:rPr>
       </w:pPr>
       <w:hyperlink r:id="rId10">
         <w:r>
           <w:rPr>
             <w:rFonts w:ascii="Times New Roman" w:eastAsia="Times New Roman" w:hAnsi="Times New Roman" w:cs="Times New Roman"/>
-            <w:b/>
-            <w:bCs/>
             <w:color w:val="1155CC"/>
             <w:u w:val="single"/>
           </w:rPr>
@@ -1696,17 +1823,83 @@
     </w:p>
     <w:p>
       <w:pPr>
+        <w:rPr>
+          <w:rFonts w:ascii="Times New Roman" w:eastAsia="Times New Roman" w:hAnsi="Times New Roman" w:cs="Times New Roman"/>
+          <w:b/>
+          <w:bCs/>
+        </w:rPr>
+      </w:pPr>
+    </w:p>
+    <w:p>
+      <w:pPr>
+        <w:rPr>
+          <w:rFonts w:ascii="Times New Roman" w:eastAsia="Times New Roman" w:hAnsi="Times New Roman" w:cs="Times New Roman"/>
+          <w:b/>
+          <w:bCs/>
+        </w:rPr>
+      </w:pPr>
+    </w:p>
+    <w:p>
+      <w:pPr>
+        <w:rPr>
+          <w:rFonts w:ascii="Times New Roman" w:eastAsia="Times New Roman" w:hAnsi="Times New Roman" w:cs="Times New Roman"/>
+          <w:b/>
+          <w:bCs/>
+        </w:rPr>
+      </w:pPr>
+    </w:p>
+    <w:p>
+      <w:pPr>
+        <w:rPr>
+          <w:rFonts w:ascii="Times New Roman" w:eastAsia="Times New Roman" w:hAnsi="Times New Roman" w:cs="Times New Roman"/>
+          <w:b/>
+          <w:bCs/>
+        </w:rPr>
+      </w:pPr>
+    </w:p>
+    <w:p>
+      <w:pPr>
+        <w:rPr>
+          <w:rFonts w:ascii="Times New Roman" w:eastAsia="Times New Roman" w:hAnsi="Times New Roman" w:cs="Times New Roman"/>
+          <w:b/>
+          <w:bCs/>
+        </w:rPr>
+      </w:pPr>
+    </w:p>
+    <w:p>
+      <w:pPr>
+        <w:rPr>
+          <w:rFonts w:ascii="Times New Roman" w:eastAsia="Times New Roman" w:hAnsi="Times New Roman" w:cs="Times New Roman"/>
+          <w:b/>
+          <w:bCs/>
+        </w:rPr>
+      </w:pPr>
+    </w:p>
+    <w:p>
+      <w:pPr>
         <w:pStyle w:val="Ttulo1"/>
-      </w:pPr>
-      <w:bookmarkStart w:id="2" w:name="_Toc243153605"/>
-      <w:r>
+        <w:rPr>
+          <w:szCs w:val="24"/>
+        </w:rPr>
+      </w:pPr>
+    </w:p>
+    <w:p/>
+    <w:p>
+      <w:pPr>
+        <w:pStyle w:val="Ttulo1"/>
+        <w:rPr>
+          <w:szCs w:val="24"/>
+        </w:rPr>
+      </w:pPr>
+      <w:bookmarkStart w:id="5" w:name="_Toc243403963"/>
+      <w:r>
+        <w:rPr>
+          <w:szCs w:val="24"/>
+        </w:rPr>
         <w:lastRenderedPageBreak/>
         <w:t>Enunciado del problema</w:t>
       </w:r>
-      <w:bookmarkEnd w:id="2"/>
-      <w:r>
-        <w:br/>
-      </w:r>
+      <w:bookmarkEnd w:id="5"/>
     </w:p>
     <w:p>
       <w:pPr>
@@ -1714,11 +1907,15 @@
         <w:ind w:firstLine="720"/>
         <w:rPr>
           <w:rFonts w:ascii="Times New Roman" w:eastAsia="Times New Roman" w:hAnsi="Times New Roman" w:cs="Times New Roman"/>
-        </w:rPr>
-      </w:pPr>
-      <w:r>
-        <w:rPr>
-          <w:rFonts w:ascii="Times New Roman" w:eastAsia="Times New Roman" w:hAnsi="Times New Roman" w:cs="Times New Roman"/>
+          <w:sz w:val="22"/>
+          <w:szCs w:val="22"/>
+        </w:rPr>
+      </w:pPr>
+      <w:r>
+        <w:rPr>
+          <w:rFonts w:ascii="Times New Roman" w:eastAsia="Times New Roman" w:hAnsi="Times New Roman" w:cs="Times New Roman"/>
+          <w:sz w:val="22"/>
+          <w:szCs w:val="22"/>
         </w:rPr>
         <w:t xml:space="preserve">Actualmente, </w:t>
       </w:r>
@@ -1726,6 +1923,8 @@
       <w:r>
         <w:rPr>
           <w:rFonts w:ascii="Times New Roman" w:eastAsia="Times New Roman" w:hAnsi="Times New Roman" w:cs="Times New Roman"/>
+          <w:sz w:val="22"/>
+          <w:szCs w:val="22"/>
         </w:rPr>
         <w:t>Invacom</w:t>
       </w:r>
@@ -1733,6 +1932,8 @@
       <w:r>
         <w:rPr>
           <w:rFonts w:ascii="Times New Roman" w:eastAsia="Times New Roman" w:hAnsi="Times New Roman" w:cs="Times New Roman"/>
+          <w:sz w:val="22"/>
+          <w:szCs w:val="22"/>
         </w:rPr>
         <w:t xml:space="preserve"> </w:t>
       </w:r>
@@ -1740,6 +1941,8 @@
       <w:r>
         <w:rPr>
           <w:rFonts w:ascii="Times New Roman" w:eastAsia="Times New Roman" w:hAnsi="Times New Roman" w:cs="Times New Roman"/>
+          <w:sz w:val="22"/>
+          <w:szCs w:val="22"/>
         </w:rPr>
         <w:t>Inc</w:t>
       </w:r>
@@ -1747,6 +1950,8 @@
       <w:r>
         <w:rPr>
           <w:rFonts w:ascii="Times New Roman" w:eastAsia="Times New Roman" w:hAnsi="Times New Roman" w:cs="Times New Roman"/>
+          <w:sz w:val="22"/>
+          <w:szCs w:val="22"/>
         </w:rPr>
         <w:t xml:space="preserve"> S.A. como organización del sector de supermercados y consumo masivo enfrenta el reto de gestionar y procesar grandes volúmenes de información fragmentada en múltiples archivos CSV. La </w:t>
       </w:r>
@@ -1754,6 +1959,8 @@
       <w:r>
         <w:rPr>
           <w:rFonts w:ascii="Times New Roman" w:eastAsia="Times New Roman" w:hAnsi="Times New Roman" w:cs="Times New Roman"/>
+          <w:sz w:val="22"/>
+          <w:szCs w:val="22"/>
         </w:rPr>
         <w:t>cual</w:t>
       </w:r>
@@ -1761,6 +1968,8 @@
       <w:r>
         <w:rPr>
           <w:rFonts w:ascii="Times New Roman" w:eastAsia="Times New Roman" w:hAnsi="Times New Roman" w:cs="Times New Roman"/>
+          <w:sz w:val="22"/>
+          <w:szCs w:val="22"/>
         </w:rPr>
         <w:t xml:space="preserve"> mediante una revisión, se detectaron deficiencias críticas en la estructura y calidad de los datos:</w:t>
       </w:r>
@@ -1774,19 +1983,25 @@
         <w:spacing w:after="0" w:line="480" w:lineRule="auto"/>
         <w:rPr>
           <w:rFonts w:ascii="Times New Roman" w:eastAsia="Times New Roman" w:hAnsi="Times New Roman" w:cs="Times New Roman"/>
-        </w:rPr>
-      </w:pPr>
-      <w:r>
-        <w:rPr>
-          <w:rFonts w:ascii="Times New Roman" w:eastAsia="Times New Roman" w:hAnsi="Times New Roman" w:cs="Times New Roman"/>
-          <w:b/>
-          <w:bCs/>
+          <w:sz w:val="22"/>
+          <w:szCs w:val="22"/>
+        </w:rPr>
+      </w:pPr>
+      <w:r>
+        <w:rPr>
+          <w:rFonts w:ascii="Times New Roman" w:eastAsia="Times New Roman" w:hAnsi="Times New Roman" w:cs="Times New Roman"/>
+          <w:b/>
+          <w:bCs/>
+          <w:sz w:val="22"/>
+          <w:szCs w:val="22"/>
         </w:rPr>
         <w:t>Inconsistencias y espacios en blanco:</w:t>
       </w:r>
       <w:r>
         <w:rPr>
           <w:rFonts w:ascii="Times New Roman" w:eastAsia="Times New Roman" w:hAnsi="Times New Roman" w:cs="Times New Roman"/>
+          <w:sz w:val="22"/>
+          <w:szCs w:val="22"/>
         </w:rPr>
         <w:t xml:space="preserve"> Presencia de registros incompletos y espacios vacíos en columnas clave, lo que puede afectar los cálculos de las métricas.</w:t>
       </w:r>
@@ -1800,19 +2015,25 @@
         <w:spacing w:after="0" w:line="480" w:lineRule="auto"/>
         <w:rPr>
           <w:rFonts w:ascii="Times New Roman" w:eastAsia="Times New Roman" w:hAnsi="Times New Roman" w:cs="Times New Roman"/>
-        </w:rPr>
-      </w:pPr>
-      <w:r>
-        <w:rPr>
-          <w:rFonts w:ascii="Times New Roman" w:eastAsia="Times New Roman" w:hAnsi="Times New Roman" w:cs="Times New Roman"/>
-          <w:b/>
-          <w:bCs/>
+          <w:sz w:val="22"/>
+          <w:szCs w:val="22"/>
+        </w:rPr>
+      </w:pPr>
+      <w:r>
+        <w:rPr>
+          <w:rFonts w:ascii="Times New Roman" w:eastAsia="Times New Roman" w:hAnsi="Times New Roman" w:cs="Times New Roman"/>
+          <w:b/>
+          <w:bCs/>
+          <w:sz w:val="22"/>
+          <w:szCs w:val="22"/>
         </w:rPr>
         <w:t>Nombre de columnas ambiguos:</w:t>
       </w:r>
       <w:r>
         <w:rPr>
           <w:rFonts w:ascii="Times New Roman" w:eastAsia="Times New Roman" w:hAnsi="Times New Roman" w:cs="Times New Roman"/>
+          <w:sz w:val="22"/>
+          <w:szCs w:val="22"/>
         </w:rPr>
         <w:t xml:space="preserve"> Múltiples encabezados de columnas se presentan cortados o con nomenclaturas poco descriptivas, dificultando la comprensión del significado del dato por parte de los analistas.</w:t>
       </w:r>
@@ -1826,11 +2047,15 @@
         <w:spacing w:line="480" w:lineRule="auto"/>
         <w:rPr>
           <w:rFonts w:ascii="Times New Roman" w:eastAsia="Times New Roman" w:hAnsi="Times New Roman" w:cs="Times New Roman"/>
-        </w:rPr>
-      </w:pPr>
-      <w:r>
-        <w:rPr>
-          <w:rFonts w:ascii="Times New Roman" w:eastAsia="Times New Roman" w:hAnsi="Times New Roman" w:cs="Times New Roman"/>
+          <w:sz w:val="22"/>
+          <w:szCs w:val="22"/>
+        </w:rPr>
+      </w:pPr>
+      <w:r>
+        <w:rPr>
+          <w:rFonts w:ascii="Times New Roman" w:eastAsia="Times New Roman" w:hAnsi="Times New Roman" w:cs="Times New Roman"/>
+          <w:sz w:val="22"/>
+          <w:szCs w:val="22"/>
         </w:rPr>
         <w:t xml:space="preserve"> </w:t>
       </w:r>
@@ -1839,12 +2064,16 @@
           <w:rFonts w:ascii="Times New Roman" w:eastAsia="Times New Roman" w:hAnsi="Times New Roman" w:cs="Times New Roman"/>
           <w:b/>
           <w:bCs/>
+          <w:sz w:val="22"/>
+          <w:szCs w:val="22"/>
         </w:rPr>
         <w:t>Ausencia de integridad referencial:</w:t>
       </w:r>
       <w:r>
         <w:rPr>
           <w:rFonts w:ascii="Times New Roman" w:eastAsia="Times New Roman" w:hAnsi="Times New Roman" w:cs="Times New Roman"/>
+          <w:sz w:val="22"/>
+          <w:szCs w:val="22"/>
         </w:rPr>
         <w:t xml:space="preserve"> Al tratarse de archivos CSV aislados, no existe relaciones o claves primarias/foráneas definidas explícitamente entres los archivos.</w:t>
       </w:r>
@@ -1940,43 +2169,41 @@
     </w:p>
     <w:p>
       <w:pPr>
+        <w:rPr>
+          <w:rFonts w:ascii="Times New Roman" w:eastAsia="Times New Roman" w:hAnsi="Times New Roman" w:cs="Times New Roman"/>
+          <w:b/>
+          <w:bCs/>
+        </w:rPr>
+      </w:pPr>
+    </w:p>
+    <w:p>
+      <w:pPr>
         <w:pStyle w:val="Ttulo1"/>
       </w:pPr>
-      <w:bookmarkStart w:id="3" w:name="_Toc243153606"/>
+      <w:bookmarkStart w:id="6" w:name="_Toc243403964"/>
       <w:r>
         <w:lastRenderedPageBreak/>
         <w:t>Objetivos</w:t>
       </w:r>
-      <w:bookmarkEnd w:id="3"/>
-    </w:p>
-    <w:p>
-      <w:pPr>
-        <w:jc w:val="center"/>
-        <w:rPr>
-          <w:rFonts w:ascii="Times New Roman" w:eastAsia="Times New Roman" w:hAnsi="Times New Roman" w:cs="Times New Roman"/>
-          <w:b/>
-          <w:bCs/>
-        </w:rPr>
-      </w:pPr>
+      <w:bookmarkEnd w:id="6"/>
     </w:p>
     <w:p>
       <w:pPr>
         <w:pStyle w:val="Ttulo2"/>
-      </w:pPr>
-      <w:bookmarkStart w:id="4" w:name="_Toc243153607"/>
-      <w:r>
+        <w:rPr>
+          <w:sz w:val="22"/>
+          <w:szCs w:val="22"/>
+        </w:rPr>
+      </w:pPr>
+      <w:bookmarkStart w:id="7" w:name="_Toc243403965"/>
+      <w:r>
+        <w:rPr>
+          <w:sz w:val="22"/>
+          <w:szCs w:val="22"/>
+        </w:rPr>
         <w:t>Objetivo General</w:t>
       </w:r>
-      <w:bookmarkEnd w:id="4"/>
-    </w:p>
-    <w:p>
-      <w:pPr>
-        <w:rPr>
-          <w:rFonts w:ascii="Times New Roman" w:eastAsia="Times New Roman" w:hAnsi="Times New Roman" w:cs="Times New Roman"/>
-          <w:b/>
-          <w:bCs/>
-        </w:rPr>
-      </w:pPr>
+      <w:bookmarkEnd w:id="7"/>
     </w:p>
     <w:p>
       <w:pPr>
@@ -1984,130 +2211,97 @@
         <w:ind w:firstLine="720"/>
         <w:rPr>
           <w:rFonts w:ascii="Times New Roman" w:eastAsia="Times New Roman" w:hAnsi="Times New Roman" w:cs="Times New Roman"/>
-        </w:rPr>
-      </w:pPr>
-      <w:r>
-        <w:rPr>
-          <w:rFonts w:ascii="Times New Roman" w:eastAsia="Times New Roman" w:hAnsi="Times New Roman" w:cs="Times New Roman"/>
-        </w:rPr>
-        <w:t xml:space="preserve">Desarrollar un Data </w:t>
+          <w:sz w:val="22"/>
+          <w:szCs w:val="22"/>
+        </w:rPr>
+      </w:pPr>
+      <w:r>
+        <w:rPr>
+          <w:rFonts w:ascii="Times New Roman" w:eastAsia="Times New Roman" w:hAnsi="Times New Roman" w:cs="Times New Roman"/>
+          <w:sz w:val="22"/>
+          <w:szCs w:val="22"/>
+        </w:rPr>
+        <w:t xml:space="preserve">Desarrollar un Data Warehouse con modelado dimensional para la empresa </w:t>
       </w:r>
       <w:proofErr w:type="spellStart"/>
       <w:r>
         <w:rPr>
           <w:rFonts w:ascii="Times New Roman" w:eastAsia="Times New Roman" w:hAnsi="Times New Roman" w:cs="Times New Roman"/>
-        </w:rPr>
-        <w:t>Warehouse</w:t>
+          <w:sz w:val="22"/>
+          <w:szCs w:val="22"/>
+        </w:rPr>
+        <w:t>Invacom</w:t>
       </w:r>
       <w:proofErr w:type="spellEnd"/>
       <w:r>
         <w:rPr>
           <w:rFonts w:ascii="Times New Roman" w:eastAsia="Times New Roman" w:hAnsi="Times New Roman" w:cs="Times New Roman"/>
-        </w:rPr>
-        <w:t xml:space="preserve"> con modelado dimensional para la empresa </w:t>
+          <w:sz w:val="22"/>
+          <w:szCs w:val="22"/>
+        </w:rPr>
+        <w:t xml:space="preserve"> </w:t>
       </w:r>
       <w:proofErr w:type="spellStart"/>
       <w:r>
         <w:rPr>
           <w:rFonts w:ascii="Times New Roman" w:eastAsia="Times New Roman" w:hAnsi="Times New Roman" w:cs="Times New Roman"/>
-        </w:rPr>
-        <w:t>Invacom</w:t>
+          <w:sz w:val="22"/>
+          <w:szCs w:val="22"/>
+        </w:rPr>
+        <w:t>Inc</w:t>
       </w:r>
       <w:proofErr w:type="spellEnd"/>
       <w:r>
         <w:rPr>
           <w:rFonts w:ascii="Times New Roman" w:eastAsia="Times New Roman" w:hAnsi="Times New Roman" w:cs="Times New Roman"/>
-        </w:rPr>
-        <w:t xml:space="preserve"> </w:t>
-      </w:r>
-      <w:proofErr w:type="spellStart"/>
-      <w:r>
-        <w:rPr>
-          <w:rFonts w:ascii="Times New Roman" w:eastAsia="Times New Roman" w:hAnsi="Times New Roman" w:cs="Times New Roman"/>
-        </w:rPr>
-        <w:t>Inc</w:t>
-      </w:r>
-      <w:proofErr w:type="spellEnd"/>
-      <w:r>
-        <w:rPr>
-          <w:rFonts w:ascii="Times New Roman" w:eastAsia="Times New Roman" w:hAnsi="Times New Roman" w:cs="Times New Roman"/>
-        </w:rPr>
-        <w:t xml:space="preserve"> S.A., implementando un proceso ETL con PostgreSQL y </w:t>
-      </w:r>
-      <w:proofErr w:type="spellStart"/>
-      <w:r>
-        <w:rPr>
-          <w:rFonts w:ascii="Times New Roman" w:eastAsia="Times New Roman" w:hAnsi="Times New Roman" w:cs="Times New Roman"/>
-        </w:rPr>
-        <w:t>dbt</w:t>
-      </w:r>
-      <w:proofErr w:type="spellEnd"/>
-      <w:r>
-        <w:rPr>
-          <w:rFonts w:ascii="Times New Roman" w:eastAsia="Times New Roman" w:hAnsi="Times New Roman" w:cs="Times New Roman"/>
-        </w:rPr>
-        <w:t xml:space="preserve"> (Data </w:t>
-      </w:r>
-      <w:proofErr w:type="spellStart"/>
-      <w:r>
-        <w:rPr>
-          <w:rFonts w:ascii="Times New Roman" w:eastAsia="Times New Roman" w:hAnsi="Times New Roman" w:cs="Times New Roman"/>
-        </w:rPr>
-        <w:t>Build</w:t>
-      </w:r>
-      <w:proofErr w:type="spellEnd"/>
-      <w:r>
-        <w:rPr>
-          <w:rFonts w:ascii="Times New Roman" w:eastAsia="Times New Roman" w:hAnsi="Times New Roman" w:cs="Times New Roman"/>
-        </w:rPr>
-        <w:t xml:space="preserve"> Tool) sobre la base de datos </w:t>
-      </w:r>
-      <w:proofErr w:type="spellStart"/>
-      <w:r>
-        <w:rPr>
-          <w:rFonts w:ascii="Times New Roman" w:eastAsia="Times New Roman" w:hAnsi="Times New Roman" w:cs="Times New Roman"/>
-        </w:rPr>
-        <w:t>Dunnhumby</w:t>
-      </w:r>
-      <w:proofErr w:type="spellEnd"/>
-      <w:r>
-        <w:rPr>
-          <w:rFonts w:ascii="Times New Roman" w:eastAsia="Times New Roman" w:hAnsi="Times New Roman" w:cs="Times New Roman"/>
-        </w:rPr>
-        <w:t>, con el propósito de conectar informes en Excel que faciliten el análisis comercial y la toma de decisiones estratégicas.</w:t>
-      </w:r>
-    </w:p>
-    <w:p>
-      <w:pPr>
-        <w:rPr>
-          <w:rFonts w:ascii="Times New Roman" w:eastAsia="Times New Roman" w:hAnsi="Times New Roman" w:cs="Times New Roman"/>
-          <w:b/>
-          <w:bCs/>
+          <w:sz w:val="22"/>
+          <w:szCs w:val="22"/>
+        </w:rPr>
+        <w:t xml:space="preserve"> S.A., implementando un proceso ETL con PostgreSQL y dbt (Data Build Tool) sobre la base de datos Dunnhumby, con el propósito de conectar informes en Excel que faciliten el análisis comercial y la toma de decisiones estratégicas.</w:t>
+      </w:r>
+    </w:p>
+    <w:p>
+      <w:pPr>
+        <w:rPr>
+          <w:rFonts w:ascii="Times New Roman" w:eastAsia="Times New Roman" w:hAnsi="Times New Roman" w:cs="Times New Roman"/>
+          <w:b/>
+          <w:bCs/>
+          <w:sz w:val="22"/>
+          <w:szCs w:val="22"/>
         </w:rPr>
       </w:pPr>
     </w:p>
     <w:p>
       <w:pPr>
         <w:pStyle w:val="Ttulo2"/>
-      </w:pPr>
-      <w:bookmarkStart w:id="5" w:name="_Toc243153608"/>
-      <w:r>
+        <w:rPr>
+          <w:sz w:val="22"/>
+          <w:szCs w:val="22"/>
+        </w:rPr>
+      </w:pPr>
+      <w:bookmarkStart w:id="8" w:name="_Toc243403966"/>
+      <w:r>
+        <w:rPr>
+          <w:sz w:val="22"/>
+          <w:szCs w:val="22"/>
+        </w:rPr>
         <w:t>Ob</w:t>
       </w:r>
       <w:r>
+        <w:rPr>
+          <w:sz w:val="22"/>
+          <w:szCs w:val="22"/>
+        </w:rPr>
         <w:t>jetiv</w:t>
       </w:r>
       <w:r>
+        <w:rPr>
+          <w:sz w:val="22"/>
+          <w:szCs w:val="22"/>
+        </w:rPr>
         <w:t>os Específicos</w:t>
       </w:r>
-      <w:bookmarkEnd w:id="5"/>
-    </w:p>
-    <w:p>
-      <w:pPr>
-        <w:rPr>
-          <w:rFonts w:ascii="Times New Roman" w:eastAsia="Times New Roman" w:hAnsi="Times New Roman" w:cs="Times New Roman"/>
-        </w:rPr>
-      </w:pPr>
+      <w:bookmarkEnd w:id="8"/>
     </w:p>
     <w:p>
       <w:pPr>
@@ -2119,27 +2313,17 @@
         <w:spacing w:line="480" w:lineRule="auto"/>
         <w:rPr>
           <w:rFonts w:ascii="Times New Roman" w:eastAsia="Times New Roman" w:hAnsi="Times New Roman" w:cs="Times New Roman"/>
-        </w:rPr>
-      </w:pPr>
-      <w:r>
-        <w:rPr>
-          <w:rFonts w:ascii="Times New Roman" w:eastAsia="Times New Roman" w:hAnsi="Times New Roman" w:cs="Times New Roman"/>
-        </w:rPr>
-        <w:t xml:space="preserve">Evaluar la calidad de la información de las ocho tablas de la base de datos </w:t>
-      </w:r>
-      <w:proofErr w:type="spellStart"/>
-      <w:r>
-        <w:rPr>
-          <w:rFonts w:ascii="Times New Roman" w:eastAsia="Times New Roman" w:hAnsi="Times New Roman" w:cs="Times New Roman"/>
-        </w:rPr>
-        <w:t>Dunnhumby</w:t>
-      </w:r>
-      <w:proofErr w:type="spellEnd"/>
-      <w:r>
-        <w:rPr>
-          <w:rFonts w:ascii="Times New Roman" w:eastAsia="Times New Roman" w:hAnsi="Times New Roman" w:cs="Times New Roman"/>
-        </w:rPr>
-        <w:t>, mediante consultas que permitan identificar y cuantificar valores nulos, registros duplicados e inconsistencias en los datos.</w:t>
+          <w:sz w:val="22"/>
+          <w:szCs w:val="22"/>
+        </w:rPr>
+      </w:pPr>
+      <w:r>
+        <w:rPr>
+          <w:rFonts w:ascii="Times New Roman" w:eastAsia="Times New Roman" w:hAnsi="Times New Roman" w:cs="Times New Roman"/>
+          <w:sz w:val="22"/>
+          <w:szCs w:val="22"/>
+        </w:rPr>
+        <w:t>Evaluar la calidad de la información de las ocho tablas de la base de datos Dunnhumby, mediante consultas que permitan identificar y cuantificar valores nulos, registros duplicados e inconsistencias en los datos.</w:t>
       </w:r>
     </w:p>
     <w:p>
@@ -2152,11 +2336,15 @@
         <w:spacing w:line="480" w:lineRule="auto"/>
         <w:rPr>
           <w:rFonts w:ascii="Times New Roman" w:eastAsia="Times New Roman" w:hAnsi="Times New Roman" w:cs="Times New Roman"/>
-        </w:rPr>
-      </w:pPr>
-      <w:r>
-        <w:rPr>
-          <w:rFonts w:ascii="Times New Roman" w:eastAsia="Times New Roman" w:hAnsi="Times New Roman" w:cs="Times New Roman"/>
+          <w:sz w:val="22"/>
+          <w:szCs w:val="22"/>
+        </w:rPr>
+      </w:pPr>
+      <w:r>
+        <w:rPr>
+          <w:rFonts w:ascii="Times New Roman" w:eastAsia="Times New Roman" w:hAnsi="Times New Roman" w:cs="Times New Roman"/>
+          <w:sz w:val="22"/>
+          <w:szCs w:val="22"/>
         </w:rPr>
         <w:t>Diseñar un modelo dimensional para la empresa, identificando las tablas de hechos, dimensiones, medidas y granularidad necesarias para el análisis de la información comercial.</w:t>
       </w:r>
@@ -2170,55 +2358,17 @@
         <w:spacing w:after="0" w:line="480" w:lineRule="auto"/>
         <w:rPr>
           <w:rFonts w:ascii="Times New Roman" w:eastAsia="Times New Roman" w:hAnsi="Times New Roman" w:cs="Times New Roman"/>
-        </w:rPr>
-      </w:pPr>
-      <w:r>
-        <w:rPr>
-          <w:rFonts w:ascii="Times New Roman" w:eastAsia="Times New Roman" w:hAnsi="Times New Roman" w:cs="Times New Roman"/>
-        </w:rPr>
-        <w:t xml:space="preserve">Implementar el Data </w:t>
-      </w:r>
-      <w:proofErr w:type="spellStart"/>
-      <w:r>
-        <w:rPr>
-          <w:rFonts w:ascii="Times New Roman" w:eastAsia="Times New Roman" w:hAnsi="Times New Roman" w:cs="Times New Roman"/>
-        </w:rPr>
-        <w:t>Warehouse</w:t>
-      </w:r>
-      <w:proofErr w:type="spellEnd"/>
-      <w:r>
-        <w:rPr>
-          <w:rFonts w:ascii="Times New Roman" w:eastAsia="Times New Roman" w:hAnsi="Times New Roman" w:cs="Times New Roman"/>
-        </w:rPr>
-        <w:t xml:space="preserve"> utilizando PostgreSQL y </w:t>
-      </w:r>
-      <w:proofErr w:type="spellStart"/>
-      <w:r>
-        <w:rPr>
-          <w:rFonts w:ascii="Times New Roman" w:eastAsia="Times New Roman" w:hAnsi="Times New Roman" w:cs="Times New Roman"/>
-        </w:rPr>
-        <w:t>dbt</w:t>
-      </w:r>
-      <w:proofErr w:type="spellEnd"/>
-      <w:r>
-        <w:rPr>
-          <w:rFonts w:ascii="Times New Roman" w:eastAsia="Times New Roman" w:hAnsi="Times New Roman" w:cs="Times New Roman"/>
-        </w:rPr>
-        <w:t xml:space="preserve"> (Data </w:t>
-      </w:r>
-      <w:proofErr w:type="spellStart"/>
-      <w:r>
-        <w:rPr>
-          <w:rFonts w:ascii="Times New Roman" w:eastAsia="Times New Roman" w:hAnsi="Times New Roman" w:cs="Times New Roman"/>
-        </w:rPr>
-        <w:t>Build</w:t>
-      </w:r>
-      <w:proofErr w:type="spellEnd"/>
-      <w:r>
-        <w:rPr>
-          <w:rFonts w:ascii="Times New Roman" w:eastAsia="Times New Roman" w:hAnsi="Times New Roman" w:cs="Times New Roman"/>
-        </w:rPr>
-        <w:t xml:space="preserve"> Tool), verificando la ejecución correcta de las transformaciones y la carga de los datos en las tablas del modelo dimensional.</w:t>
+          <w:sz w:val="22"/>
+          <w:szCs w:val="22"/>
+        </w:rPr>
+      </w:pPr>
+      <w:r>
+        <w:rPr>
+          <w:rFonts w:ascii="Times New Roman" w:eastAsia="Times New Roman" w:hAnsi="Times New Roman" w:cs="Times New Roman"/>
+          <w:sz w:val="22"/>
+          <w:szCs w:val="22"/>
+        </w:rPr>
+        <w:t>Implementar el Data Warehouse utilizando PostgreSQL y dbt (Data Build Tool), verificando la ejecución correcta de las transformaciones y la carga de los datos en las tablas del modelo dimensional.</w:t>
       </w:r>
     </w:p>
     <w:p>
@@ -2230,49 +2380,977 @@
         <w:spacing w:after="0" w:line="480" w:lineRule="auto"/>
         <w:rPr>
           <w:rFonts w:ascii="Times New Roman" w:eastAsia="Times New Roman" w:hAnsi="Times New Roman" w:cs="Times New Roman"/>
-        </w:rPr>
-      </w:pPr>
-      <w:r>
-        <w:rPr>
-          <w:rFonts w:ascii="Times New Roman" w:eastAsia="Times New Roman" w:hAnsi="Times New Roman" w:cs="Times New Roman"/>
-        </w:rPr>
-        <w:t xml:space="preserve">Elaborar informes mediante tablas dinámicas en Excel conectadas al Data </w:t>
+          <w:sz w:val="22"/>
+          <w:szCs w:val="22"/>
+        </w:rPr>
+      </w:pPr>
+      <w:r>
+        <w:rPr>
+          <w:rFonts w:ascii="Times New Roman" w:eastAsia="Times New Roman" w:hAnsi="Times New Roman" w:cs="Times New Roman"/>
+          <w:sz w:val="22"/>
+          <w:szCs w:val="22"/>
+        </w:rPr>
+        <w:t>Elaborar informes mediante tablas dinámicas en Excel conectadas al Data Warehouse, que permitan consultar y analizar indicadores comerciales y verificar que la información se obtiene correctamente.</w:t>
+      </w:r>
+    </w:p>
+    <w:p>
+      <w:pPr>
+        <w:pStyle w:val="Ttulo1"/>
+        <w:rPr>
+          <w:sz w:val="22"/>
+          <w:szCs w:val="22"/>
+        </w:rPr>
+      </w:pPr>
+      <w:bookmarkStart w:id="9" w:name="_Toc243403967"/>
+      <w:r>
+        <w:rPr>
+          <w:sz w:val="22"/>
+          <w:szCs w:val="22"/>
+        </w:rPr>
+        <w:t>Identificación de stakeholders y necesidades de análisis</w:t>
+      </w:r>
+      <w:bookmarkEnd w:id="9"/>
+    </w:p>
+    <w:p>
+      <w:pPr>
+        <w:spacing w:after="0" w:line="480" w:lineRule="auto"/>
+        <w:ind w:firstLine="720"/>
+        <w:rPr>
+          <w:rFonts w:ascii="Times New Roman" w:eastAsia="Times New Roman" w:hAnsi="Times New Roman" w:cs="Times New Roman"/>
+          <w:sz w:val="22"/>
+          <w:szCs w:val="22"/>
+        </w:rPr>
+      </w:pPr>
+      <w:r>
+        <w:rPr>
+          <w:rFonts w:ascii="Times New Roman" w:eastAsia="Times New Roman" w:hAnsi="Times New Roman" w:cs="Times New Roman"/>
+          <w:sz w:val="22"/>
+          <w:szCs w:val="22"/>
+        </w:rPr>
+        <w:t xml:space="preserve">Para el desarrollo del Data Warehouse de </w:t>
       </w:r>
       <w:proofErr w:type="spellStart"/>
       <w:r>
         <w:rPr>
           <w:rFonts w:ascii="Times New Roman" w:eastAsia="Times New Roman" w:hAnsi="Times New Roman" w:cs="Times New Roman"/>
-        </w:rPr>
-        <w:t>Warehouse</w:t>
+          <w:sz w:val="22"/>
+          <w:szCs w:val="22"/>
+        </w:rPr>
+        <w:t>Invacom</w:t>
       </w:r>
       <w:proofErr w:type="spellEnd"/>
       <w:r>
         <w:rPr>
           <w:rFonts w:ascii="Times New Roman" w:eastAsia="Times New Roman" w:hAnsi="Times New Roman" w:cs="Times New Roman"/>
-        </w:rPr>
-        <w:t>, que permitan consultar y analizar indicadores comerciales y verificar que la información se obtiene correctamente.</w:t>
-      </w:r>
+          <w:sz w:val="22"/>
+          <w:szCs w:val="22"/>
+        </w:rPr>
+        <w:t xml:space="preserve"> Inc. S.A., se identifican los principales interesados y sus necesidades de información. A partir de estas necesidades, se proponen consultas para analizar las ventas, los productos, las campañas, los cupones y el comportamiento de compra de los hogares.</w:t>
+      </w:r>
+    </w:p>
+    <w:p>
+      <w:pPr>
+        <w:pStyle w:val="Descripcin"/>
+        <w:keepNext/>
+        <w:rPr>
+          <w:rFonts w:ascii="Times New Roman" w:eastAsiaTheme="minorHAnsi" w:hAnsi="Times New Roman" w:cs="Times New Roman"/>
+          <w:b/>
+          <w:bCs/>
+          <w:i w:val="0"/>
+          <w:iCs w:val="0"/>
+          <w:color w:val="auto"/>
+          <w:kern w:val="2"/>
+          <w:sz w:val="22"/>
+          <w:szCs w:val="22"/>
+          <w:lang w:eastAsia="en-US"/>
+          <w14:ligatures w14:val="standardContextual"/>
+        </w:rPr>
+      </w:pPr>
+      <w:bookmarkStart w:id="10" w:name="_Toc243396385"/>
+      <w:r>
+        <w:rPr>
+          <w:rFonts w:ascii="Times New Roman" w:eastAsiaTheme="minorHAnsi" w:hAnsi="Times New Roman" w:cs="Times New Roman"/>
+          <w:b/>
+          <w:bCs/>
+          <w:i w:val="0"/>
+          <w:iCs w:val="0"/>
+          <w:color w:val="auto"/>
+          <w:kern w:val="2"/>
+          <w:sz w:val="22"/>
+          <w:szCs w:val="22"/>
+          <w:lang w:eastAsia="en-US"/>
+          <w14:ligatures w14:val="standardContextual"/>
+        </w:rPr>
+        <w:lastRenderedPageBreak/>
+        <w:t xml:space="preserve">Tabla </w:t>
+      </w:r>
+      <w:r>
+        <w:rPr>
+          <w:rFonts w:ascii="Times New Roman" w:eastAsiaTheme="minorHAnsi" w:hAnsi="Times New Roman" w:cs="Times New Roman"/>
+          <w:b/>
+          <w:bCs/>
+          <w:i w:val="0"/>
+          <w:iCs w:val="0"/>
+          <w:color w:val="auto"/>
+          <w:kern w:val="2"/>
+          <w:sz w:val="22"/>
+          <w:szCs w:val="22"/>
+          <w:lang w:eastAsia="en-US"/>
+          <w14:ligatures w14:val="standardContextual"/>
+        </w:rPr>
+        <w:fldChar w:fldCharType="begin"/>
+      </w:r>
+      <w:r>
+        <w:rPr>
+          <w:rFonts w:ascii="Times New Roman" w:eastAsiaTheme="minorHAnsi" w:hAnsi="Times New Roman" w:cs="Times New Roman"/>
+          <w:b/>
+          <w:bCs/>
+          <w:i w:val="0"/>
+          <w:iCs w:val="0"/>
+          <w:color w:val="auto"/>
+          <w:kern w:val="2"/>
+          <w:sz w:val="22"/>
+          <w:szCs w:val="22"/>
+          <w:lang w:eastAsia="en-US"/>
+          <w14:ligatures w14:val="standardContextual"/>
+        </w:rPr>
+        <w:instrText xml:space="preserve"> SEQ Tabla \* ARABIC </w:instrText>
+      </w:r>
+      <w:r>
+        <w:rPr>
+          <w:rFonts w:ascii="Times New Roman" w:eastAsiaTheme="minorHAnsi" w:hAnsi="Times New Roman" w:cs="Times New Roman"/>
+          <w:b/>
+          <w:bCs/>
+          <w:i w:val="0"/>
+          <w:iCs w:val="0"/>
+          <w:color w:val="auto"/>
+          <w:kern w:val="2"/>
+          <w:sz w:val="22"/>
+          <w:szCs w:val="22"/>
+          <w:lang w:eastAsia="en-US"/>
+          <w14:ligatures w14:val="standardContextual"/>
+        </w:rPr>
+        <w:fldChar w:fldCharType="separate"/>
+      </w:r>
+      <w:r>
+        <w:rPr>
+          <w:rFonts w:ascii="Times New Roman" w:eastAsiaTheme="minorHAnsi" w:hAnsi="Times New Roman" w:cs="Times New Roman"/>
+          <w:b/>
+          <w:bCs/>
+          <w:i w:val="0"/>
+          <w:iCs w:val="0"/>
+          <w:color w:val="auto"/>
+          <w:kern w:val="2"/>
+          <w:sz w:val="22"/>
+          <w:szCs w:val="22"/>
+          <w:lang w:eastAsia="en-US"/>
+          <w14:ligatures w14:val="standardContextual"/>
+        </w:rPr>
+        <w:t>1</w:t>
+      </w:r>
+      <w:r>
+        <w:rPr>
+          <w:rFonts w:ascii="Times New Roman" w:eastAsiaTheme="minorHAnsi" w:hAnsi="Times New Roman" w:cs="Times New Roman"/>
+          <w:b/>
+          <w:bCs/>
+          <w:i w:val="0"/>
+          <w:iCs w:val="0"/>
+          <w:color w:val="auto"/>
+          <w:kern w:val="2"/>
+          <w:sz w:val="22"/>
+          <w:szCs w:val="22"/>
+          <w:lang w:eastAsia="en-US"/>
+          <w14:ligatures w14:val="standardContextual"/>
+        </w:rPr>
+        <w:fldChar w:fldCharType="end"/>
+      </w:r>
+      <w:r>
+        <w:rPr>
+          <w:rFonts w:ascii="Times New Roman" w:eastAsiaTheme="minorHAnsi" w:hAnsi="Times New Roman" w:cs="Times New Roman"/>
+          <w:b/>
+          <w:bCs/>
+          <w:i w:val="0"/>
+          <w:iCs w:val="0"/>
+          <w:color w:val="auto"/>
+          <w:kern w:val="2"/>
+          <w:sz w:val="22"/>
+          <w:szCs w:val="22"/>
+          <w:lang w:eastAsia="en-US"/>
+          <w14:ligatures w14:val="standardContextual"/>
+        </w:rPr>
+        <w:tab/>
+        <w:t xml:space="preserve">                                                                                                                              </w:t>
+      </w:r>
+      <w:r>
+        <w:rPr>
+          <w:rFonts w:ascii="Times New Roman" w:eastAsiaTheme="minorHAnsi" w:hAnsi="Times New Roman" w:cs="Times New Roman"/>
+          <w:color w:val="auto"/>
+          <w:kern w:val="2"/>
+          <w:sz w:val="22"/>
+          <w:szCs w:val="22"/>
+          <w:lang w:eastAsia="en-US"/>
+          <w14:ligatures w14:val="standardContextual"/>
+        </w:rPr>
+        <w:t>Stakeholders, necesidades de análisis</w:t>
+      </w:r>
+      <w:bookmarkEnd w:id="10"/>
+    </w:p>
+    <w:tbl>
+      <w:tblPr>
+        <w:tblW w:w="9781" w:type="dxa"/>
+        <w:tblBorders>
+          <w:top w:val="single" w:sz="4" w:space="0" w:color="auto"/>
+          <w:bottom w:val="single" w:sz="4" w:space="0" w:color="auto"/>
+        </w:tblBorders>
+        <w:shd w:val="clear" w:color="auto" w:fill="FFFFFF"/>
+        <w:tblLook w:val="04A0" w:firstRow="1" w:lastRow="0" w:firstColumn="1" w:lastColumn="0" w:noHBand="0" w:noVBand="1"/>
+      </w:tblPr>
+      <w:tblGrid>
+        <w:gridCol w:w="1843"/>
+        <w:gridCol w:w="3686"/>
+        <w:gridCol w:w="4252"/>
+      </w:tblGrid>
+      <w:tr>
+        <w:trPr>
+          <w:trHeight w:val="31"/>
+        </w:trPr>
+        <w:tc>
+          <w:tcPr>
+            <w:tcW w:w="1843" w:type="dxa"/>
+            <w:tcBorders>
+              <w:top w:val="single" w:sz="4" w:space="0" w:color="auto"/>
+              <w:bottom w:val="single" w:sz="4" w:space="0" w:color="auto"/>
+            </w:tcBorders>
+            <w:shd w:val="clear" w:color="auto" w:fill="FFFFFF"/>
+            <w:tcMar>
+              <w:top w:w="0" w:type="dxa"/>
+              <w:left w:w="0" w:type="dxa"/>
+              <w:bottom w:w="0" w:type="dxa"/>
+              <w:right w:w="0" w:type="dxa"/>
+            </w:tcMar>
+            <w:vAlign w:val="center"/>
+            <w:hideMark/>
+          </w:tcPr>
+          <w:p>
+            <w:pPr>
+              <w:spacing w:line="360" w:lineRule="auto"/>
+              <w:jc w:val="center"/>
+              <w:rPr>
+                <w:rFonts w:ascii="Times New Roman" w:eastAsia="Times New Roman" w:hAnsi="Times New Roman" w:cs="Times New Roman"/>
+                <w:sz w:val="22"/>
+                <w:szCs w:val="22"/>
+              </w:rPr>
+            </w:pPr>
+            <w:r>
+              <w:rPr>
+                <w:rFonts w:ascii="Times New Roman" w:eastAsia="Times New Roman" w:hAnsi="Times New Roman" w:cs="Times New Roman"/>
+                <w:b/>
+                <w:bCs/>
+                <w:sz w:val="22"/>
+                <w:szCs w:val="22"/>
+              </w:rPr>
+              <w:t>Stakeholder</w:t>
+            </w:r>
+          </w:p>
+        </w:tc>
+        <w:tc>
+          <w:tcPr>
+            <w:tcW w:w="3686" w:type="dxa"/>
+            <w:tcBorders>
+              <w:top w:val="single" w:sz="4" w:space="0" w:color="auto"/>
+              <w:bottom w:val="single" w:sz="4" w:space="0" w:color="auto"/>
+            </w:tcBorders>
+            <w:shd w:val="clear" w:color="auto" w:fill="FFFFFF"/>
+            <w:tcMar>
+              <w:top w:w="0" w:type="dxa"/>
+              <w:left w:w="0" w:type="dxa"/>
+              <w:bottom w:w="0" w:type="dxa"/>
+              <w:right w:w="0" w:type="dxa"/>
+            </w:tcMar>
+            <w:vAlign w:val="center"/>
+            <w:hideMark/>
+          </w:tcPr>
+          <w:p>
+            <w:pPr>
+              <w:spacing w:line="360" w:lineRule="auto"/>
+              <w:ind w:firstLine="720"/>
+              <w:jc w:val="center"/>
+              <w:rPr>
+                <w:rFonts w:ascii="Times New Roman" w:eastAsia="Times New Roman" w:hAnsi="Times New Roman" w:cs="Times New Roman"/>
+                <w:sz w:val="22"/>
+                <w:szCs w:val="22"/>
+              </w:rPr>
+            </w:pPr>
+            <w:r>
+              <w:rPr>
+                <w:rFonts w:ascii="Times New Roman" w:eastAsia="Times New Roman" w:hAnsi="Times New Roman" w:cs="Times New Roman"/>
+                <w:b/>
+                <w:bCs/>
+                <w:sz w:val="22"/>
+                <w:szCs w:val="22"/>
+              </w:rPr>
+              <w:t>Necesidad de análisis</w:t>
+            </w:r>
+          </w:p>
+        </w:tc>
+        <w:tc>
+          <w:tcPr>
+            <w:tcW w:w="4252" w:type="dxa"/>
+            <w:tcBorders>
+              <w:top w:val="single" w:sz="4" w:space="0" w:color="auto"/>
+              <w:bottom w:val="single" w:sz="4" w:space="0" w:color="auto"/>
+            </w:tcBorders>
+            <w:shd w:val="clear" w:color="auto" w:fill="FFFFFF"/>
+            <w:tcMar>
+              <w:top w:w="0" w:type="dxa"/>
+              <w:left w:w="0" w:type="dxa"/>
+              <w:bottom w:w="0" w:type="dxa"/>
+              <w:right w:w="0" w:type="dxa"/>
+            </w:tcMar>
+            <w:vAlign w:val="center"/>
+            <w:hideMark/>
+          </w:tcPr>
+          <w:p>
+            <w:pPr>
+              <w:spacing w:line="360" w:lineRule="auto"/>
+              <w:ind w:firstLine="720"/>
+              <w:jc w:val="center"/>
+              <w:rPr>
+                <w:rFonts w:ascii="Times New Roman" w:eastAsia="Times New Roman" w:hAnsi="Times New Roman" w:cs="Times New Roman"/>
+                <w:sz w:val="22"/>
+                <w:szCs w:val="22"/>
+              </w:rPr>
+            </w:pPr>
+            <w:r>
+              <w:rPr>
+                <w:rFonts w:ascii="Times New Roman" w:eastAsia="Times New Roman" w:hAnsi="Times New Roman" w:cs="Times New Roman"/>
+                <w:b/>
+                <w:bCs/>
+                <w:sz w:val="22"/>
+                <w:szCs w:val="22"/>
+              </w:rPr>
+              <w:t>Consultas que se implementarán</w:t>
+            </w:r>
+          </w:p>
+        </w:tc>
+      </w:tr>
+      <w:tr>
+        <w:trPr>
+          <w:trHeight w:val="78"/>
+        </w:trPr>
+        <w:tc>
+          <w:tcPr>
+            <w:tcW w:w="1843" w:type="dxa"/>
+            <w:tcBorders>
+              <w:top w:val="single" w:sz="4" w:space="0" w:color="auto"/>
+            </w:tcBorders>
+            <w:shd w:val="clear" w:color="auto" w:fill="FFFFFF"/>
+            <w:tcMar>
+              <w:top w:w="0" w:type="dxa"/>
+              <w:left w:w="0" w:type="dxa"/>
+              <w:bottom w:w="0" w:type="dxa"/>
+              <w:right w:w="0" w:type="dxa"/>
+            </w:tcMar>
+            <w:vAlign w:val="center"/>
+            <w:hideMark/>
+          </w:tcPr>
+          <w:p>
+            <w:pPr>
+              <w:spacing w:line="360" w:lineRule="auto"/>
+              <w:rPr>
+                <w:rFonts w:ascii="Times New Roman" w:eastAsia="Times New Roman" w:hAnsi="Times New Roman" w:cs="Times New Roman"/>
+                <w:sz w:val="22"/>
+                <w:szCs w:val="22"/>
+              </w:rPr>
+            </w:pPr>
+            <w:r>
+              <w:rPr>
+                <w:rFonts w:ascii="Times New Roman" w:eastAsia="Times New Roman" w:hAnsi="Times New Roman" w:cs="Times New Roman"/>
+                <w:sz w:val="22"/>
+                <w:szCs w:val="22"/>
+              </w:rPr>
+              <w:t>Gerencia general</w:t>
+            </w:r>
+          </w:p>
+        </w:tc>
+        <w:tc>
+          <w:tcPr>
+            <w:tcW w:w="3686" w:type="dxa"/>
+            <w:tcBorders>
+              <w:top w:val="single" w:sz="4" w:space="0" w:color="auto"/>
+            </w:tcBorders>
+            <w:shd w:val="clear" w:color="auto" w:fill="FFFFFF"/>
+            <w:tcMar>
+              <w:top w:w="0" w:type="dxa"/>
+              <w:left w:w="0" w:type="dxa"/>
+              <w:bottom w:w="0" w:type="dxa"/>
+              <w:right w:w="0" w:type="dxa"/>
+            </w:tcMar>
+            <w:vAlign w:val="center"/>
+            <w:hideMark/>
+          </w:tcPr>
+          <w:p>
+            <w:pPr>
+              <w:spacing w:line="360" w:lineRule="auto"/>
+              <w:rPr>
+                <w:rFonts w:ascii="Times New Roman" w:eastAsia="Times New Roman" w:hAnsi="Times New Roman" w:cs="Times New Roman"/>
+                <w:sz w:val="22"/>
+                <w:szCs w:val="22"/>
+              </w:rPr>
+            </w:pPr>
+            <w:r>
+              <w:rPr>
+                <w:rFonts w:ascii="Times New Roman" w:eastAsia="Times New Roman" w:hAnsi="Times New Roman" w:cs="Times New Roman"/>
+                <w:sz w:val="22"/>
+                <w:szCs w:val="22"/>
+              </w:rPr>
+              <w:t>Conocer el comportamiento general de las ventas para apoyar la toma de decisiones comerciales y evaluar su relación con las promociones.</w:t>
+            </w:r>
+          </w:p>
+        </w:tc>
+        <w:tc>
+          <w:tcPr>
+            <w:tcW w:w="4252" w:type="dxa"/>
+            <w:tcBorders>
+              <w:top w:val="single" w:sz="4" w:space="0" w:color="auto"/>
+            </w:tcBorders>
+            <w:shd w:val="clear" w:color="auto" w:fill="FFFFFF"/>
+            <w:tcMar>
+              <w:top w:w="0" w:type="dxa"/>
+              <w:left w:w="0" w:type="dxa"/>
+              <w:bottom w:w="0" w:type="dxa"/>
+              <w:right w:w="0" w:type="dxa"/>
+            </w:tcMar>
+            <w:vAlign w:val="center"/>
+            <w:hideMark/>
+          </w:tcPr>
+          <w:p>
+            <w:pPr>
+              <w:spacing w:line="360" w:lineRule="auto"/>
+              <w:rPr>
+                <w:rFonts w:ascii="Times New Roman" w:eastAsia="Times New Roman" w:hAnsi="Times New Roman" w:cs="Times New Roman"/>
+                <w:sz w:val="22"/>
+                <w:szCs w:val="22"/>
+              </w:rPr>
+            </w:pPr>
+            <w:proofErr w:type="gramStart"/>
+            <w:r>
+              <w:rPr>
+                <w:rFonts w:ascii="Times New Roman" w:eastAsia="Times New Roman" w:hAnsi="Times New Roman" w:cs="Times New Roman"/>
+                <w:sz w:val="22"/>
+                <w:szCs w:val="22"/>
+              </w:rPr>
+              <w:t>Total</w:t>
+            </w:r>
+            <w:proofErr w:type="gramEnd"/>
+            <w:r>
+              <w:rPr>
+                <w:rFonts w:ascii="Times New Roman" w:eastAsia="Times New Roman" w:hAnsi="Times New Roman" w:cs="Times New Roman"/>
+                <w:sz w:val="22"/>
+                <w:szCs w:val="22"/>
+              </w:rPr>
+              <w:t xml:space="preserve"> de ventas por período; comparación de ventas entre tiendas; productos que generan mayores ingresos; ventas con y sin actividad promocional identificada.</w:t>
+            </w:r>
+          </w:p>
+        </w:tc>
+      </w:tr>
+      <w:tr>
+        <w:trPr>
+          <w:trHeight w:val="78"/>
+        </w:trPr>
+        <w:tc>
+          <w:tcPr>
+            <w:tcW w:w="1843" w:type="dxa"/>
+            <w:shd w:val="clear" w:color="auto" w:fill="FFFFFF"/>
+            <w:tcMar>
+              <w:top w:w="0" w:type="dxa"/>
+              <w:left w:w="0" w:type="dxa"/>
+              <w:bottom w:w="0" w:type="dxa"/>
+              <w:right w:w="0" w:type="dxa"/>
+            </w:tcMar>
+            <w:vAlign w:val="center"/>
+            <w:hideMark/>
+          </w:tcPr>
+          <w:p>
+            <w:pPr>
+              <w:spacing w:line="360" w:lineRule="auto"/>
+              <w:rPr>
+                <w:rFonts w:ascii="Times New Roman" w:eastAsia="Times New Roman" w:hAnsi="Times New Roman" w:cs="Times New Roman"/>
+                <w:sz w:val="22"/>
+                <w:szCs w:val="22"/>
+              </w:rPr>
+            </w:pPr>
+            <w:r>
+              <w:rPr>
+                <w:rFonts w:ascii="Times New Roman" w:eastAsia="Times New Roman" w:hAnsi="Times New Roman" w:cs="Times New Roman"/>
+                <w:sz w:val="22"/>
+                <w:szCs w:val="22"/>
+              </w:rPr>
+              <w:t>Departamento de ventas</w:t>
+            </w:r>
+          </w:p>
+        </w:tc>
+        <w:tc>
+          <w:tcPr>
+            <w:tcW w:w="3686" w:type="dxa"/>
+            <w:shd w:val="clear" w:color="auto" w:fill="FFFFFF"/>
+            <w:tcMar>
+              <w:top w:w="0" w:type="dxa"/>
+              <w:left w:w="0" w:type="dxa"/>
+              <w:bottom w:w="0" w:type="dxa"/>
+              <w:right w:w="0" w:type="dxa"/>
+            </w:tcMar>
+            <w:vAlign w:val="center"/>
+            <w:hideMark/>
+          </w:tcPr>
+          <w:p>
+            <w:pPr>
+              <w:spacing w:line="360" w:lineRule="auto"/>
+              <w:rPr>
+                <w:rFonts w:ascii="Times New Roman" w:eastAsia="Times New Roman" w:hAnsi="Times New Roman" w:cs="Times New Roman"/>
+                <w:sz w:val="22"/>
+                <w:szCs w:val="22"/>
+              </w:rPr>
+            </w:pPr>
+            <w:r>
+              <w:rPr>
+                <w:rFonts w:ascii="Times New Roman" w:eastAsia="Times New Roman" w:hAnsi="Times New Roman" w:cs="Times New Roman"/>
+                <w:sz w:val="22"/>
+                <w:szCs w:val="22"/>
+              </w:rPr>
+              <w:t>Analizar el desempeño de los productos y las tiendas para identificar tendencias de compra y productos con mayor demanda.</w:t>
+            </w:r>
+          </w:p>
+        </w:tc>
+        <w:tc>
+          <w:tcPr>
+            <w:tcW w:w="4252" w:type="dxa"/>
+            <w:shd w:val="clear" w:color="auto" w:fill="FFFFFF"/>
+            <w:tcMar>
+              <w:top w:w="0" w:type="dxa"/>
+              <w:left w:w="0" w:type="dxa"/>
+              <w:bottom w:w="0" w:type="dxa"/>
+              <w:right w:w="0" w:type="dxa"/>
+            </w:tcMar>
+            <w:vAlign w:val="center"/>
+            <w:hideMark/>
+          </w:tcPr>
+          <w:p>
+            <w:pPr>
+              <w:spacing w:line="360" w:lineRule="auto"/>
+              <w:rPr>
+                <w:rFonts w:ascii="Times New Roman" w:eastAsia="Times New Roman" w:hAnsi="Times New Roman" w:cs="Times New Roman"/>
+                <w:sz w:val="22"/>
+                <w:szCs w:val="22"/>
+              </w:rPr>
+            </w:pPr>
+            <w:r>
+              <w:rPr>
+                <w:rFonts w:ascii="Times New Roman" w:eastAsia="Times New Roman" w:hAnsi="Times New Roman" w:cs="Times New Roman"/>
+                <w:sz w:val="22"/>
+                <w:szCs w:val="22"/>
+              </w:rPr>
+              <w:t>Ventas por producto, categoría y tienda; productos más vendidos; cantidades vendidas por período; comparación de ventas entre tiendas.</w:t>
+            </w:r>
+          </w:p>
+        </w:tc>
+      </w:tr>
+      <w:tr>
+        <w:trPr>
+          <w:trHeight w:val="78"/>
+        </w:trPr>
+        <w:tc>
+          <w:tcPr>
+            <w:tcW w:w="1843" w:type="dxa"/>
+            <w:shd w:val="clear" w:color="auto" w:fill="FFFFFF"/>
+            <w:tcMar>
+              <w:top w:w="0" w:type="dxa"/>
+              <w:left w:w="0" w:type="dxa"/>
+              <w:bottom w:w="0" w:type="dxa"/>
+              <w:right w:w="0" w:type="dxa"/>
+            </w:tcMar>
+            <w:vAlign w:val="center"/>
+            <w:hideMark/>
+          </w:tcPr>
+          <w:p>
+            <w:pPr>
+              <w:spacing w:line="360" w:lineRule="auto"/>
+              <w:rPr>
+                <w:rFonts w:ascii="Times New Roman" w:eastAsia="Times New Roman" w:hAnsi="Times New Roman" w:cs="Times New Roman"/>
+                <w:sz w:val="22"/>
+                <w:szCs w:val="22"/>
+              </w:rPr>
+            </w:pPr>
+            <w:r>
+              <w:rPr>
+                <w:rFonts w:ascii="Times New Roman" w:eastAsia="Times New Roman" w:hAnsi="Times New Roman" w:cs="Times New Roman"/>
+                <w:sz w:val="22"/>
+                <w:szCs w:val="22"/>
+              </w:rPr>
+              <w:t>Departamento de marketing</w:t>
+            </w:r>
+          </w:p>
+        </w:tc>
+        <w:tc>
+          <w:tcPr>
+            <w:tcW w:w="3686" w:type="dxa"/>
+            <w:shd w:val="clear" w:color="auto" w:fill="FFFFFF"/>
+            <w:tcMar>
+              <w:top w:w="0" w:type="dxa"/>
+              <w:left w:w="0" w:type="dxa"/>
+              <w:bottom w:w="0" w:type="dxa"/>
+              <w:right w:w="0" w:type="dxa"/>
+            </w:tcMar>
+            <w:vAlign w:val="center"/>
+            <w:hideMark/>
+          </w:tcPr>
+          <w:p>
+            <w:pPr>
+              <w:spacing w:line="360" w:lineRule="auto"/>
+              <w:rPr>
+                <w:rFonts w:ascii="Times New Roman" w:eastAsia="Times New Roman" w:hAnsi="Times New Roman" w:cs="Times New Roman"/>
+                <w:sz w:val="22"/>
+                <w:szCs w:val="22"/>
+              </w:rPr>
+            </w:pPr>
+            <w:r>
+              <w:rPr>
+                <w:rFonts w:ascii="Times New Roman" w:eastAsia="Times New Roman" w:hAnsi="Times New Roman" w:cs="Times New Roman"/>
+                <w:sz w:val="22"/>
+                <w:szCs w:val="22"/>
+              </w:rPr>
+              <w:t>Analizar el comportamiento de compra de los hogares asociados a campañas promocionales para identificar patrones de consumo.</w:t>
+            </w:r>
+          </w:p>
+        </w:tc>
+        <w:tc>
+          <w:tcPr>
+            <w:tcW w:w="4252" w:type="dxa"/>
+            <w:shd w:val="clear" w:color="auto" w:fill="FFFFFF"/>
+            <w:tcMar>
+              <w:top w:w="0" w:type="dxa"/>
+              <w:left w:w="0" w:type="dxa"/>
+              <w:bottom w:w="0" w:type="dxa"/>
+              <w:right w:w="0" w:type="dxa"/>
+            </w:tcMar>
+            <w:vAlign w:val="center"/>
+            <w:hideMark/>
+          </w:tcPr>
+          <w:p>
+            <w:pPr>
+              <w:spacing w:line="360" w:lineRule="auto"/>
+              <w:rPr>
+                <w:rFonts w:ascii="Times New Roman" w:eastAsia="Times New Roman" w:hAnsi="Times New Roman" w:cs="Times New Roman"/>
+                <w:sz w:val="22"/>
+                <w:szCs w:val="22"/>
+              </w:rPr>
+            </w:pPr>
+            <w:r>
+              <w:rPr>
+                <w:rFonts w:ascii="Times New Roman" w:eastAsia="Times New Roman" w:hAnsi="Times New Roman" w:cs="Times New Roman"/>
+                <w:sz w:val="22"/>
+                <w:szCs w:val="22"/>
+              </w:rPr>
+              <w:t>Ventas de hogares asociados a campañas vigentes; comparación de compras de hogares con y sin campañas activas; gasto durante períodos promocionales.</w:t>
+            </w:r>
+          </w:p>
+        </w:tc>
+      </w:tr>
+      <w:tr>
+        <w:trPr>
+          <w:trHeight w:val="76"/>
+        </w:trPr>
+        <w:tc>
+          <w:tcPr>
+            <w:tcW w:w="1843" w:type="dxa"/>
+            <w:shd w:val="clear" w:color="auto" w:fill="FFFFFF"/>
+            <w:tcMar>
+              <w:top w:w="0" w:type="dxa"/>
+              <w:left w:w="0" w:type="dxa"/>
+              <w:bottom w:w="0" w:type="dxa"/>
+              <w:right w:w="0" w:type="dxa"/>
+            </w:tcMar>
+            <w:vAlign w:val="center"/>
+            <w:hideMark/>
+          </w:tcPr>
+          <w:p>
+            <w:pPr>
+              <w:spacing w:line="360" w:lineRule="auto"/>
+              <w:rPr>
+                <w:rFonts w:ascii="Times New Roman" w:eastAsia="Times New Roman" w:hAnsi="Times New Roman" w:cs="Times New Roman"/>
+                <w:sz w:val="22"/>
+                <w:szCs w:val="22"/>
+              </w:rPr>
+            </w:pPr>
+            <w:r>
+              <w:rPr>
+                <w:rFonts w:ascii="Times New Roman" w:eastAsia="Times New Roman" w:hAnsi="Times New Roman" w:cs="Times New Roman"/>
+                <w:sz w:val="22"/>
+                <w:szCs w:val="22"/>
+              </w:rPr>
+              <w:t>Encargados de promociones y cupones</w:t>
+            </w:r>
+          </w:p>
+        </w:tc>
+        <w:tc>
+          <w:tcPr>
+            <w:tcW w:w="3686" w:type="dxa"/>
+            <w:shd w:val="clear" w:color="auto" w:fill="FFFFFF"/>
+            <w:tcMar>
+              <w:top w:w="0" w:type="dxa"/>
+              <w:left w:w="0" w:type="dxa"/>
+              <w:bottom w:w="0" w:type="dxa"/>
+              <w:right w:w="0" w:type="dxa"/>
+            </w:tcMar>
+            <w:vAlign w:val="center"/>
+            <w:hideMark/>
+          </w:tcPr>
+          <w:p>
+            <w:pPr>
+              <w:spacing w:line="360" w:lineRule="auto"/>
+              <w:rPr>
+                <w:rFonts w:ascii="Times New Roman" w:eastAsia="Times New Roman" w:hAnsi="Times New Roman" w:cs="Times New Roman"/>
+                <w:sz w:val="22"/>
+                <w:szCs w:val="22"/>
+              </w:rPr>
+            </w:pPr>
+            <w:r>
+              <w:rPr>
+                <w:rFonts w:ascii="Times New Roman" w:eastAsia="Times New Roman" w:hAnsi="Times New Roman" w:cs="Times New Roman"/>
+                <w:sz w:val="22"/>
+                <w:szCs w:val="22"/>
+              </w:rPr>
+              <w:t>Evaluar los descuentos y la actividad promocional relacionada con las ventas para identificar oportunidades de mejora.</w:t>
+            </w:r>
+          </w:p>
+        </w:tc>
+        <w:tc>
+          <w:tcPr>
+            <w:tcW w:w="4252" w:type="dxa"/>
+            <w:shd w:val="clear" w:color="auto" w:fill="FFFFFF"/>
+            <w:tcMar>
+              <w:top w:w="0" w:type="dxa"/>
+              <w:left w:w="0" w:type="dxa"/>
+              <w:bottom w:w="0" w:type="dxa"/>
+              <w:right w:w="0" w:type="dxa"/>
+            </w:tcMar>
+            <w:vAlign w:val="center"/>
+            <w:hideMark/>
+          </w:tcPr>
+          <w:p>
+            <w:pPr>
+              <w:spacing w:line="360" w:lineRule="auto"/>
+              <w:rPr>
+                <w:rFonts w:ascii="Times New Roman" w:eastAsia="Times New Roman" w:hAnsi="Times New Roman" w:cs="Times New Roman"/>
+                <w:sz w:val="22"/>
+                <w:szCs w:val="22"/>
+              </w:rPr>
+            </w:pPr>
+            <w:r>
+              <w:rPr>
+                <w:rFonts w:ascii="Times New Roman" w:eastAsia="Times New Roman" w:hAnsi="Times New Roman" w:cs="Times New Roman"/>
+                <w:sz w:val="22"/>
+                <w:szCs w:val="22"/>
+              </w:rPr>
+              <w:t>Descuentos por producto y período; ventas de productos con actividad promocional; compras de hogares con redenciones registradas; ventas de productos asociados a cupones de campañas vigentes.</w:t>
+            </w:r>
+          </w:p>
+        </w:tc>
+      </w:tr>
+      <w:tr>
+        <w:trPr>
+          <w:trHeight w:val="78"/>
+        </w:trPr>
+        <w:tc>
+          <w:tcPr>
+            <w:tcW w:w="1843" w:type="dxa"/>
+            <w:shd w:val="clear" w:color="auto" w:fill="FFFFFF"/>
+            <w:tcMar>
+              <w:top w:w="0" w:type="dxa"/>
+              <w:left w:w="0" w:type="dxa"/>
+              <w:bottom w:w="0" w:type="dxa"/>
+              <w:right w:w="0" w:type="dxa"/>
+            </w:tcMar>
+            <w:vAlign w:val="center"/>
+            <w:hideMark/>
+          </w:tcPr>
+          <w:p>
+            <w:pPr>
+              <w:spacing w:line="360" w:lineRule="auto"/>
+              <w:rPr>
+                <w:rFonts w:ascii="Times New Roman" w:eastAsia="Times New Roman" w:hAnsi="Times New Roman" w:cs="Times New Roman"/>
+                <w:sz w:val="22"/>
+                <w:szCs w:val="22"/>
+              </w:rPr>
+            </w:pPr>
+            <w:r>
+              <w:rPr>
+                <w:rFonts w:ascii="Times New Roman" w:eastAsia="Times New Roman" w:hAnsi="Times New Roman" w:cs="Times New Roman"/>
+                <w:sz w:val="22"/>
+                <w:szCs w:val="22"/>
+              </w:rPr>
+              <w:t>Departamento de análisis comercial</w:t>
+            </w:r>
+          </w:p>
+        </w:tc>
+        <w:tc>
+          <w:tcPr>
+            <w:tcW w:w="3686" w:type="dxa"/>
+            <w:shd w:val="clear" w:color="auto" w:fill="FFFFFF"/>
+            <w:tcMar>
+              <w:top w:w="0" w:type="dxa"/>
+              <w:left w:w="0" w:type="dxa"/>
+              <w:bottom w:w="0" w:type="dxa"/>
+              <w:right w:w="0" w:type="dxa"/>
+            </w:tcMar>
+            <w:hideMark/>
+          </w:tcPr>
+          <w:p>
+            <w:pPr>
+              <w:spacing w:line="360" w:lineRule="auto"/>
+              <w:rPr>
+                <w:rFonts w:ascii="Times New Roman" w:eastAsia="Times New Roman" w:hAnsi="Times New Roman" w:cs="Times New Roman"/>
+                <w:sz w:val="22"/>
+                <w:szCs w:val="22"/>
+              </w:rPr>
+            </w:pPr>
+            <w:r>
+              <w:rPr>
+                <w:rFonts w:ascii="Times New Roman" w:hAnsi="Times New Roman" w:cs="Times New Roman"/>
+                <w:sz w:val="22"/>
+                <w:szCs w:val="22"/>
+              </w:rPr>
+              <w:t>Identificar patrones de compra y diferencias de consumo entre los hogares según sus características demográficas.</w:t>
+            </w:r>
+          </w:p>
+        </w:tc>
+        <w:tc>
+          <w:tcPr>
+            <w:tcW w:w="4252" w:type="dxa"/>
+            <w:shd w:val="clear" w:color="auto" w:fill="FFFFFF"/>
+            <w:tcMar>
+              <w:top w:w="0" w:type="dxa"/>
+              <w:left w:w="0" w:type="dxa"/>
+              <w:bottom w:w="0" w:type="dxa"/>
+              <w:right w:w="0" w:type="dxa"/>
+            </w:tcMar>
+            <w:hideMark/>
+          </w:tcPr>
+          <w:p>
+            <w:pPr>
+              <w:spacing w:line="360" w:lineRule="auto"/>
+              <w:rPr>
+                <w:rFonts w:ascii="Times New Roman" w:eastAsia="Times New Roman" w:hAnsi="Times New Roman" w:cs="Times New Roman"/>
+                <w:sz w:val="22"/>
+                <w:szCs w:val="22"/>
+              </w:rPr>
+            </w:pPr>
+            <w:r>
+              <w:rPr>
+                <w:rFonts w:ascii="Times New Roman" w:hAnsi="Times New Roman" w:cs="Times New Roman"/>
+                <w:sz w:val="22"/>
+                <w:szCs w:val="22"/>
+              </w:rPr>
+              <w:t>Frecuencia de compra por hogar; gasto por grupo demográfico; categorías de productos más compradas; comparación del comportamiento de compra entre grupos de hogares.</w:t>
+            </w:r>
+          </w:p>
+        </w:tc>
+      </w:tr>
+    </w:tbl>
+    <w:p>
+      <w:pPr>
+        <w:spacing w:before="120" w:after="240" w:line="259" w:lineRule="auto"/>
+        <w:rPr>
+          <w:rFonts w:ascii="Times New Roman" w:eastAsia="Times New Roman" w:hAnsi="Times New Roman" w:cs="Times New Roman"/>
+          <w:kern w:val="2"/>
+          <w:sz w:val="22"/>
+          <w:szCs w:val="22"/>
+          <w:lang w:eastAsia="en-US"/>
+          <w14:ligatures w14:val="standardContextual"/>
+        </w:rPr>
+      </w:pPr>
+      <w:r>
+        <w:rPr>
+          <w:rFonts w:ascii="Times New Roman" w:eastAsia="Times New Roman" w:hAnsi="Times New Roman" w:cs="Times New Roman"/>
+          <w:i/>
+          <w:iCs/>
+          <w:kern w:val="2"/>
+          <w:sz w:val="22"/>
+          <w:szCs w:val="22"/>
+          <w:lang w:eastAsia="en-US"/>
+          <w14:ligatures w14:val="standardContextual"/>
+        </w:rPr>
+        <w:t>Nota</w:t>
+      </w:r>
+      <w:r>
+        <w:rPr>
+          <w:rFonts w:ascii="Times New Roman" w:eastAsia="Times New Roman" w:hAnsi="Times New Roman" w:cs="Times New Roman"/>
+          <w:kern w:val="2"/>
+          <w:sz w:val="22"/>
+          <w:szCs w:val="22"/>
+          <w:lang w:eastAsia="en-US"/>
+          <w14:ligatures w14:val="standardContextual"/>
+        </w:rPr>
+        <w:t>. Las consultas propuestas orientarán el diseño del modelo dimensional y su implementación mediante dbt. Los informes se elaborarán con tablas dinámicas en Excel.</w:t>
+      </w:r>
+    </w:p>
+    <w:p>
+      <w:pPr>
+        <w:spacing w:before="120" w:after="240" w:line="259" w:lineRule="auto"/>
+        <w:ind w:firstLine="720"/>
+        <w:rPr>
+          <w:rFonts w:ascii="Times New Roman" w:eastAsia="Times New Roman" w:hAnsi="Times New Roman" w:cs="Times New Roman"/>
+          <w:kern w:val="2"/>
+          <w:sz w:val="22"/>
+          <w:szCs w:val="22"/>
+          <w:lang w:eastAsia="en-US"/>
+          <w14:ligatures w14:val="standardContextual"/>
+        </w:rPr>
+      </w:pPr>
+      <w:r>
+        <w:rPr>
+          <w:rFonts w:ascii="Times New Roman" w:eastAsia="Times New Roman" w:hAnsi="Times New Roman" w:cs="Times New Roman"/>
+          <w:kern w:val="2"/>
+          <w:sz w:val="22"/>
+          <w:szCs w:val="22"/>
+          <w:lang w:eastAsia="en-US"/>
+          <w14:ligatures w14:val="standardContextual"/>
+        </w:rPr>
+        <w:t>Estas necesidades permiten definir las medidas, dimensiones e indicadores comerciales del Data Warehouse, de acuerdo con la información disponible en las tablas de Dunnhumby.</w:t>
+      </w:r>
+    </w:p>
+    <w:p>
+      <w:pPr>
+        <w:spacing w:before="120" w:after="240" w:line="259" w:lineRule="auto"/>
+        <w:ind w:firstLine="720"/>
+        <w:rPr>
+          <w:rFonts w:ascii="Times New Roman" w:eastAsia="Times New Roman" w:hAnsi="Times New Roman" w:cs="Times New Roman"/>
+          <w:kern w:val="2"/>
+          <w:sz w:val="22"/>
+          <w:szCs w:val="22"/>
+          <w:lang w:eastAsia="en-US"/>
+          <w14:ligatures w14:val="standardContextual"/>
+        </w:rPr>
+      </w:pPr>
     </w:p>
     <w:p>
       <w:pPr>
         <w:pStyle w:val="Ttulo1"/>
-      </w:pPr>
-      <w:bookmarkStart w:id="6" w:name="_Toc243153609"/>
-      <w:r>
+        <w:rPr>
+          <w:sz w:val="22"/>
+          <w:szCs w:val="22"/>
+        </w:rPr>
+      </w:pPr>
+      <w:bookmarkStart w:id="11" w:name="_Toc243403968"/>
+      <w:r>
+        <w:rPr>
+          <w:sz w:val="22"/>
+          <w:szCs w:val="22"/>
+        </w:rPr>
         <w:lastRenderedPageBreak/>
         <w:t>Descripción de la solución</w:t>
       </w:r>
-      <w:bookmarkEnd w:id="6"/>
-    </w:p>
-    <w:p>
-      <w:pPr>
-        <w:jc w:val="center"/>
-        <w:rPr>
-          <w:rFonts w:ascii="Times New Roman" w:eastAsia="Times New Roman" w:hAnsi="Times New Roman" w:cs="Times New Roman"/>
-          <w:b/>
-          <w:bCs/>
-        </w:rPr>
-      </w:pPr>
+      <w:bookmarkEnd w:id="11"/>
     </w:p>
     <w:p>
       <w:pPr>
@@ -2282,220 +3360,172 @@
           <w:rFonts w:ascii="Times New Roman" w:eastAsia="Times New Roman" w:hAnsi="Times New Roman" w:cs="Times New Roman"/>
           <w:b/>
           <w:bCs/>
-        </w:rPr>
-      </w:pPr>
-      <w:r>
-        <w:rPr>
-          <w:rFonts w:ascii="Times New Roman" w:eastAsia="Times New Roman" w:hAnsi="Times New Roman" w:cs="Times New Roman"/>
-        </w:rPr>
-        <w:t xml:space="preserve">Debido a las carencias presentadas, la empresa nos ha contratado para implementar la herramienta </w:t>
-      </w:r>
-      <w:proofErr w:type="spellStart"/>
-      <w:r>
-        <w:rPr>
-          <w:rFonts w:ascii="Times New Roman" w:eastAsia="Times New Roman" w:hAnsi="Times New Roman" w:cs="Times New Roman"/>
-        </w:rPr>
-        <w:t>dbt</w:t>
-      </w:r>
-      <w:proofErr w:type="spellEnd"/>
-      <w:r>
-        <w:rPr>
-          <w:rFonts w:ascii="Times New Roman" w:eastAsia="Times New Roman" w:hAnsi="Times New Roman" w:cs="Times New Roman"/>
-        </w:rPr>
-        <w:t xml:space="preserve"> (Data </w:t>
-      </w:r>
-      <w:proofErr w:type="spellStart"/>
-      <w:r>
-        <w:rPr>
-          <w:rFonts w:ascii="Times New Roman" w:eastAsia="Times New Roman" w:hAnsi="Times New Roman" w:cs="Times New Roman"/>
-        </w:rPr>
-        <w:t>Build</w:t>
-      </w:r>
-      <w:proofErr w:type="spellEnd"/>
-      <w:r>
-        <w:rPr>
-          <w:rFonts w:ascii="Times New Roman" w:eastAsia="Times New Roman" w:hAnsi="Times New Roman" w:cs="Times New Roman"/>
-        </w:rPr>
-        <w:t xml:space="preserve"> Tool), permitiendo ejecutar las transformaciones dentro del motor de Data </w:t>
-      </w:r>
-      <w:proofErr w:type="spellStart"/>
-      <w:r>
-        <w:rPr>
-          <w:rFonts w:ascii="Times New Roman" w:eastAsia="Times New Roman" w:hAnsi="Times New Roman" w:cs="Times New Roman"/>
-        </w:rPr>
-        <w:t>Warehouse</w:t>
-      </w:r>
-      <w:proofErr w:type="spellEnd"/>
-      <w:r>
-        <w:rPr>
-          <w:rFonts w:ascii="Times New Roman" w:eastAsia="Times New Roman" w:hAnsi="Times New Roman" w:cs="Times New Roman"/>
-        </w:rPr>
-        <w:t xml:space="preserve"> a través de sentencias SQL gestionando dependencias. Así mismo, es necesario analizar la base de datos proporcionada e identificar las tablas, campos y estructuras más adecuadas para el Data </w:t>
-      </w:r>
-      <w:proofErr w:type="spellStart"/>
-      <w:r>
-        <w:rPr>
-          <w:rFonts w:ascii="Times New Roman" w:eastAsia="Times New Roman" w:hAnsi="Times New Roman" w:cs="Times New Roman"/>
-        </w:rPr>
-        <w:t>Warehouse</w:t>
-      </w:r>
-      <w:proofErr w:type="spellEnd"/>
-      <w:r>
-        <w:rPr>
-          <w:rFonts w:ascii="Times New Roman" w:eastAsia="Times New Roman" w:hAnsi="Times New Roman" w:cs="Times New Roman"/>
-        </w:rPr>
-        <w:t xml:space="preserve">; para lo </w:t>
-      </w:r>
-      <w:r>
-        <w:rPr>
-          <w:rFonts w:ascii="Times New Roman" w:eastAsia="Times New Roman" w:hAnsi="Times New Roman" w:cs="Times New Roman"/>
+          <w:sz w:val="22"/>
+          <w:szCs w:val="22"/>
+        </w:rPr>
+      </w:pPr>
+      <w:r>
+        <w:rPr>
+          <w:rFonts w:ascii="Times New Roman" w:eastAsia="Times New Roman" w:hAnsi="Times New Roman" w:cs="Times New Roman"/>
+          <w:sz w:val="22"/>
+          <w:szCs w:val="22"/>
+        </w:rPr>
+        <w:t xml:space="preserve">Debido a las carencias presentadas, la empresa nos ha contratado para implementar la herramienta dbt (Data Build Tool), permitiendo ejecutar las transformaciones dentro del motor de Data Warehouse a través de sentencias SQL gestionando dependencias. Así mismo, es necesario analizar la base de datos proporcionada e identificar las tablas, campos y estructuras más adecuadas para el Data Warehouse; para lo </w:t>
+      </w:r>
+      <w:r>
+        <w:rPr>
+          <w:rFonts w:ascii="Times New Roman" w:eastAsia="Times New Roman" w:hAnsi="Times New Roman" w:cs="Times New Roman"/>
+          <w:sz w:val="22"/>
+          <w:szCs w:val="22"/>
         </w:rPr>
         <w:t>cual</w:t>
       </w:r>
       <w:r>
         <w:rPr>
           <w:rFonts w:ascii="Times New Roman" w:eastAsia="Times New Roman" w:hAnsi="Times New Roman" w:cs="Times New Roman"/>
-        </w:rPr>
-        <w:t xml:space="preserve">, es fundamental establecer el esquema, dimensiones y medidas oportunas para una granularidad en los datos. Lo anterior con el propósito final de proveer a la organización una solución analítica integrada mediante informes y consultas con tablas dinámicas en Excel conectadas al Data </w:t>
-      </w:r>
-      <w:proofErr w:type="spellStart"/>
-      <w:r>
-        <w:rPr>
-          <w:rFonts w:ascii="Times New Roman" w:eastAsia="Times New Roman" w:hAnsi="Times New Roman" w:cs="Times New Roman"/>
-        </w:rPr>
-        <w:t>Warehouse</w:t>
-      </w:r>
-      <w:proofErr w:type="spellEnd"/>
-      <w:r>
-        <w:rPr>
-          <w:rFonts w:ascii="Times New Roman" w:eastAsia="Times New Roman" w:hAnsi="Times New Roman" w:cs="Times New Roman"/>
-        </w:rPr>
-        <w:t>.</w:t>
-      </w:r>
-    </w:p>
-    <w:p>
-      <w:pPr>
-        <w:jc w:val="center"/>
-        <w:rPr>
-          <w:rFonts w:ascii="Times New Roman" w:eastAsia="Times New Roman" w:hAnsi="Times New Roman" w:cs="Times New Roman"/>
-          <w:b/>
-          <w:bCs/>
-        </w:rPr>
-      </w:pPr>
-    </w:p>
-    <w:p>
-      <w:pPr>
-        <w:jc w:val="center"/>
-        <w:rPr>
-          <w:rFonts w:ascii="Times New Roman" w:eastAsia="Times New Roman" w:hAnsi="Times New Roman" w:cs="Times New Roman"/>
-          <w:b/>
-          <w:bCs/>
-        </w:rPr>
-      </w:pPr>
-    </w:p>
-    <w:p>
-      <w:pPr>
-        <w:jc w:val="center"/>
-        <w:rPr>
-          <w:rFonts w:ascii="Times New Roman" w:eastAsia="Times New Roman" w:hAnsi="Times New Roman" w:cs="Times New Roman"/>
-          <w:b/>
-          <w:bCs/>
-        </w:rPr>
-      </w:pPr>
-    </w:p>
-    <w:p>
-      <w:pPr>
-        <w:jc w:val="center"/>
-        <w:rPr>
-          <w:rFonts w:ascii="Times New Roman" w:eastAsia="Times New Roman" w:hAnsi="Times New Roman" w:cs="Times New Roman"/>
-          <w:b/>
-          <w:bCs/>
-        </w:rPr>
-      </w:pPr>
-    </w:p>
-    <w:p>
-      <w:pPr>
-        <w:jc w:val="center"/>
-        <w:rPr>
-          <w:rFonts w:ascii="Times New Roman" w:eastAsia="Times New Roman" w:hAnsi="Times New Roman" w:cs="Times New Roman"/>
-          <w:b/>
-          <w:bCs/>
-        </w:rPr>
-      </w:pPr>
-    </w:p>
-    <w:p>
-      <w:pPr>
-        <w:jc w:val="center"/>
-        <w:rPr>
-          <w:rFonts w:ascii="Times New Roman" w:eastAsia="Times New Roman" w:hAnsi="Times New Roman" w:cs="Times New Roman"/>
-          <w:b/>
-          <w:bCs/>
-        </w:rPr>
-      </w:pPr>
-    </w:p>
-    <w:p>
-      <w:pPr>
-        <w:jc w:val="center"/>
-        <w:rPr>
-          <w:rFonts w:ascii="Times New Roman" w:eastAsia="Times New Roman" w:hAnsi="Times New Roman" w:cs="Times New Roman"/>
-          <w:b/>
-          <w:bCs/>
-        </w:rPr>
-      </w:pPr>
-    </w:p>
-    <w:p>
-      <w:pPr>
-        <w:jc w:val="center"/>
-        <w:rPr>
-          <w:rFonts w:ascii="Times New Roman" w:eastAsia="Times New Roman" w:hAnsi="Times New Roman" w:cs="Times New Roman"/>
-          <w:b/>
-          <w:bCs/>
-        </w:rPr>
-      </w:pPr>
-    </w:p>
-    <w:p>
-      <w:pPr>
-        <w:jc w:val="center"/>
-        <w:rPr>
-          <w:rFonts w:ascii="Times New Roman" w:eastAsia="Times New Roman" w:hAnsi="Times New Roman" w:cs="Times New Roman"/>
-          <w:b/>
-          <w:bCs/>
-        </w:rPr>
-      </w:pPr>
-    </w:p>
-    <w:p>
-      <w:pPr>
-        <w:jc w:val="center"/>
-        <w:rPr>
-          <w:rFonts w:ascii="Times New Roman" w:eastAsia="Times New Roman" w:hAnsi="Times New Roman" w:cs="Times New Roman"/>
-          <w:b/>
-          <w:bCs/>
-        </w:rPr>
-      </w:pPr>
-    </w:p>
-    <w:p>
-      <w:pPr>
-        <w:jc w:val="center"/>
-        <w:rPr>
-          <w:rFonts w:ascii="Times New Roman" w:eastAsia="Times New Roman" w:hAnsi="Times New Roman" w:cs="Times New Roman"/>
-          <w:b/>
-          <w:bCs/>
-        </w:rPr>
-      </w:pPr>
-    </w:p>
-    <w:p>
-      <w:pPr>
-        <w:jc w:val="center"/>
-        <w:rPr>
-          <w:rFonts w:ascii="Times New Roman" w:eastAsia="Times New Roman" w:hAnsi="Times New Roman" w:cs="Times New Roman"/>
-          <w:b/>
-          <w:bCs/>
-        </w:rPr>
-      </w:pPr>
-    </w:p>
-    <w:p>
-      <w:pPr>
-        <w:jc w:val="center"/>
+          <w:sz w:val="22"/>
+          <w:szCs w:val="22"/>
+        </w:rPr>
+        <w:t>, es fundamental establecer el esquema, dimensiones y medidas oportunas para una granularidad en los datos. Lo anterior con el propósito final de proveer a la organización una solución analítica integrada mediante informes y consultas con tablas dinámicas en Excel conectadas al Data Warehouse.</w:t>
+      </w:r>
+    </w:p>
+    <w:p>
+      <w:pPr>
+        <w:jc w:val="center"/>
+        <w:rPr>
+          <w:rFonts w:ascii="Times New Roman" w:eastAsia="Times New Roman" w:hAnsi="Times New Roman" w:cs="Times New Roman"/>
+          <w:b/>
+          <w:bCs/>
+        </w:rPr>
+      </w:pPr>
+    </w:p>
+    <w:p>
+      <w:pPr>
+        <w:jc w:val="center"/>
+        <w:rPr>
+          <w:rFonts w:ascii="Times New Roman" w:eastAsia="Times New Roman" w:hAnsi="Times New Roman" w:cs="Times New Roman"/>
+          <w:b/>
+          <w:bCs/>
+        </w:rPr>
+      </w:pPr>
+    </w:p>
+    <w:p>
+      <w:pPr>
+        <w:jc w:val="center"/>
+        <w:rPr>
+          <w:rFonts w:ascii="Times New Roman" w:eastAsia="Times New Roman" w:hAnsi="Times New Roman" w:cs="Times New Roman"/>
+          <w:b/>
+          <w:bCs/>
+        </w:rPr>
+      </w:pPr>
+    </w:p>
+    <w:p>
+      <w:pPr>
+        <w:jc w:val="center"/>
+        <w:rPr>
+          <w:rFonts w:ascii="Times New Roman" w:eastAsia="Times New Roman" w:hAnsi="Times New Roman" w:cs="Times New Roman"/>
+          <w:b/>
+          <w:bCs/>
+        </w:rPr>
+      </w:pPr>
+    </w:p>
+    <w:p>
+      <w:pPr>
+        <w:jc w:val="center"/>
+        <w:rPr>
+          <w:rFonts w:ascii="Times New Roman" w:eastAsia="Times New Roman" w:hAnsi="Times New Roman" w:cs="Times New Roman"/>
+          <w:b/>
+          <w:bCs/>
+        </w:rPr>
+      </w:pPr>
+    </w:p>
+    <w:p>
+      <w:pPr>
+        <w:jc w:val="center"/>
+        <w:rPr>
+          <w:rFonts w:ascii="Times New Roman" w:eastAsia="Times New Roman" w:hAnsi="Times New Roman" w:cs="Times New Roman"/>
+          <w:b/>
+          <w:bCs/>
+        </w:rPr>
+      </w:pPr>
+    </w:p>
+    <w:p>
+      <w:pPr>
+        <w:jc w:val="center"/>
+        <w:rPr>
+          <w:rFonts w:ascii="Times New Roman" w:eastAsia="Times New Roman" w:hAnsi="Times New Roman" w:cs="Times New Roman"/>
+          <w:b/>
+          <w:bCs/>
+        </w:rPr>
+      </w:pPr>
+    </w:p>
+    <w:p>
+      <w:pPr>
+        <w:jc w:val="center"/>
+        <w:rPr>
+          <w:rFonts w:ascii="Times New Roman" w:eastAsia="Times New Roman" w:hAnsi="Times New Roman" w:cs="Times New Roman"/>
+          <w:b/>
+          <w:bCs/>
+        </w:rPr>
+      </w:pPr>
+    </w:p>
+    <w:p>
+      <w:pPr>
+        <w:jc w:val="center"/>
+        <w:rPr>
+          <w:rFonts w:ascii="Times New Roman" w:eastAsia="Times New Roman" w:hAnsi="Times New Roman" w:cs="Times New Roman"/>
+          <w:b/>
+          <w:bCs/>
+        </w:rPr>
+      </w:pPr>
+    </w:p>
+    <w:p>
+      <w:pPr>
+        <w:rPr>
+          <w:rFonts w:ascii="Times New Roman" w:eastAsia="Times New Roman" w:hAnsi="Times New Roman" w:cs="Times New Roman"/>
+          <w:b/>
+          <w:bCs/>
+        </w:rPr>
+      </w:pPr>
+    </w:p>
+    <w:p>
+      <w:pPr>
+        <w:rPr>
+          <w:rFonts w:ascii="Times New Roman" w:eastAsia="Times New Roman" w:hAnsi="Times New Roman" w:cs="Times New Roman"/>
+          <w:b/>
+          <w:bCs/>
+        </w:rPr>
+      </w:pPr>
+    </w:p>
+    <w:p>
+      <w:pPr>
+        <w:rPr>
+          <w:rFonts w:ascii="Times New Roman" w:eastAsia="Times New Roman" w:hAnsi="Times New Roman" w:cs="Times New Roman"/>
+          <w:b/>
+          <w:bCs/>
+        </w:rPr>
+      </w:pPr>
+    </w:p>
+    <w:p>
+      <w:pPr>
+        <w:rPr>
+          <w:rFonts w:ascii="Times New Roman" w:eastAsia="Times New Roman" w:hAnsi="Times New Roman" w:cs="Times New Roman"/>
+          <w:b/>
+          <w:bCs/>
+        </w:rPr>
+      </w:pPr>
+    </w:p>
+    <w:p>
+      <w:pPr>
+        <w:rPr>
+          <w:rFonts w:ascii="Times New Roman" w:eastAsia="Times New Roman" w:hAnsi="Times New Roman" w:cs="Times New Roman"/>
+          <w:b/>
+          <w:bCs/>
+        </w:rPr>
+      </w:pPr>
+    </w:p>
+    <w:p>
+      <w:pPr>
         <w:rPr>
           <w:rFonts w:ascii="Times New Roman" w:eastAsia="Times New Roman" w:hAnsi="Times New Roman" w:cs="Times New Roman"/>
           <w:b/>
@@ -2516,12 +3546,12 @@
       <w:pPr>
         <w:pStyle w:val="Ttulo1"/>
       </w:pPr>
-      <w:bookmarkStart w:id="7" w:name="_Toc243153610"/>
+      <w:bookmarkStart w:id="12" w:name="_Toc243403969"/>
       <w:r>
         <w:lastRenderedPageBreak/>
         <w:t>Diagrama del Modelo Dimensional (Esquema Estrella o Copo de Nieve)</w:t>
       </w:r>
-      <w:bookmarkEnd w:id="7"/>
+      <w:bookmarkEnd w:id="12"/>
     </w:p>
     <w:p>
       <w:pPr>
@@ -2787,12 +3817,12 @@
       <w:pPr>
         <w:pStyle w:val="Ttulo1"/>
       </w:pPr>
-      <w:bookmarkStart w:id="8" w:name="_Toc243153611"/>
+      <w:bookmarkStart w:id="13" w:name="_Toc243403970"/>
       <w:r>
         <w:lastRenderedPageBreak/>
         <w:t>Conclusión</w:t>
       </w:r>
-      <w:bookmarkEnd w:id="8"/>
+      <w:bookmarkEnd w:id="13"/>
     </w:p>
     <w:p>
       <w:pPr>
@@ -3058,12 +4088,12 @@
       <w:pPr>
         <w:pStyle w:val="Ttulo1"/>
       </w:pPr>
-      <w:bookmarkStart w:id="9" w:name="_Toc243153612"/>
+      <w:bookmarkStart w:id="14" w:name="_Toc243403971"/>
       <w:r>
         <w:lastRenderedPageBreak/>
         <w:t>Bibliografía</w:t>
       </w:r>
-      <w:bookmarkEnd w:id="9"/>
+      <w:bookmarkEnd w:id="14"/>
     </w:p>
     <w:p>
       <w:pPr>
@@ -3118,27 +4148,7 @@
           <w:iCs/>
           <w:color w:val="0A0F0D"/>
         </w:rPr>
-        <w:t xml:space="preserve">¿Qué es un Data </w:t>
-      </w:r>
-      <w:proofErr w:type="spellStart"/>
-      <w:r>
-        <w:rPr>
-          <w:rFonts w:ascii="Times New Roman" w:eastAsia="Times New Roman" w:hAnsi="Times New Roman" w:cs="Times New Roman"/>
-          <w:i/>
-          <w:iCs/>
-          <w:color w:val="0A0F0D"/>
-        </w:rPr>
-        <w:t>Warehouse</w:t>
-      </w:r>
-      <w:proofErr w:type="spellEnd"/>
-      <w:r>
-        <w:rPr>
-          <w:rFonts w:ascii="Times New Roman" w:eastAsia="Times New Roman" w:hAnsi="Times New Roman" w:cs="Times New Roman"/>
-          <w:i/>
-          <w:iCs/>
-          <w:color w:val="0A0F0D"/>
-        </w:rPr>
-        <w:t xml:space="preserve"> y por qué es importante</w:t>
+        <w:t>¿Qué es un Data Warehouse y por qué es importante</w:t>
       </w:r>
       <w:r>
         <w:rPr>
@@ -3186,6 +4196,8 @@
         <w:ind w:left="720" w:hanging="720"/>
         <w:rPr>
           <w:rFonts w:ascii="Times New Roman" w:eastAsia="Times New Roman" w:hAnsi="Times New Roman" w:cs="Times New Roman"/>
+          <w:color w:val="1155CC"/>
+          <w:u w:val="single"/>
           <w:lang w:val="en-US"/>
         </w:rPr>
       </w:pPr>
@@ -3216,13 +4228,21 @@
           <w:rFonts w:ascii="Times New Roman" w:eastAsia="Times New Roman" w:hAnsi="Times New Roman" w:cs="Times New Roman"/>
           <w:lang w:val="en-US"/>
         </w:rPr>
-        <w:t xml:space="preserve">IBM. </w:t>
+        <w:t>IBM.</w:t>
+      </w:r>
+      <w:r>
+        <w:rPr>
+          <w:rFonts w:ascii="Times New Roman" w:eastAsia="Times New Roman" w:hAnsi="Times New Roman" w:cs="Times New Roman"/>
+          <w:color w:val="0A0F0D"/>
+        </w:rPr>
+        <w:t xml:space="preserve"> </w:t>
       </w:r>
       <w:hyperlink r:id="rId12" w:history="1">
         <w:r>
           <w:rPr>
-            <w:rStyle w:val="Hipervnculo"/>
             <w:rFonts w:ascii="Times New Roman" w:eastAsia="Times New Roman" w:hAnsi="Times New Roman" w:cs="Times New Roman"/>
+            <w:color w:val="1155CC"/>
+            <w:u w:val="single"/>
             <w:lang w:val="en-US"/>
           </w:rPr>
           <w:t>https://www.ibm.com/mx-es/think/topics/etl</w:t>
@@ -3330,98 +4350,41 @@
 
 <file path=word/header1.xml><?xml version="1.0" encoding="utf-8"?>
 <w:hdr xmlns:wpc="http://schemas.microsoft.com/office/word/2010/wordprocessingCanvas" xmlns:cx="http://schemas.microsoft.com/office/drawing/2014/chartex" xmlns:cx1="http://schemas.microsoft.com/office/drawing/2015/9/8/chartex" xmlns:cx2="http://schemas.microsoft.com/office/drawing/2015/10/21/chartex" xmlns:cx3="http://schemas.microsoft.com/office/drawing/2016/5/9/chartex" xmlns:cx4="http://schemas.microsoft.com/office/drawing/2016/5/10/chartex" xmlns:cx5="http://schemas.microsoft.com/office/drawing/2016/5/11/chartex" xmlns:cx6="http://schemas.microsoft.com/office/drawing/2016/5/12/chartex" xmlns:cx7="http://schemas.microsoft.com/office/drawing/2016/5/13/chartex" xmlns:cx8="http://schemas.microsoft.com/office/drawing/2016/5/14/chartex" xmlns:mc="http://schemas.openxmlformats.org/markup-compatibility/2006" xmlns:aink="http://schemas.microsoft.com/office/drawing/2016/ink" xmlns:am3d="http://schemas.microsoft.com/office/drawing/2017/model3d" xmlns:o="urn:schemas-microsoft-com:office:office" xmlns:oel="http://schemas.microsoft.com/office/2019/extlst" xmlns:r="http://schemas.openxmlformats.org/officeDocument/2006/relationships" xmlns:m="http://schemas.openxmlformats.org/officeDocument/2006/math" xmlns:v="urn:schemas-microsoft-com:vml" xmlns:wp14="http://schemas.microsoft.com/office/word/2010/wordprocessingDrawing" xmlns:wp="http://schemas.openxmlformats.org/drawingml/2006/wordprocessingDrawing" xmlns:w10="urn:schemas-microsoft-com:office:word" xmlns:w="http://schemas.openxmlformats.org/wordprocessingml/2006/main" xmlns:w14="http://schemas.microsoft.com/office/word/2010/wordml" xmlns:w15="http://schemas.microsoft.com/office/word/2012/wordml" xmlns:w16cex="http://schemas.microsoft.com/office/word/2018/wordml/cex" xmlns:w16cid="http://schemas.microsoft.com/office/word/2016/wordml/cid" xmlns:w16="http://schemas.microsoft.com/office/word/2018/wordml" xmlns:w16du="http://schemas.microsoft.com/office/word/2023/wordml/word16du" xmlns:w16sdtdh="http://schemas.microsoft.com/office/word/2020/wordml/sdtdatahash" xmlns:w16sdtfl="http://schemas.microsoft.com/office/word/2024/wordml/sdtformatlock" xmlns:w16se="http://schemas.microsoft.com/office/word/2015/wordml/symex" xmlns:wpg="http://schemas.microsoft.com/office/word/2010/wordprocessingGroup" xmlns:wpi="http://schemas.microsoft.com/office/word/2010/wordprocessingInk" xmlns:wne="http://schemas.microsoft.com/office/word/2006/wordml" xmlns:wps="http://schemas.microsoft.com/office/word/2010/wordprocessingShape" mc:Ignorable="w14 w15 w16se w16cid w16 w16cex w16sdtdh w16sdtfl w16du wp14">
-  <w:tbl>
-    <w:tblPr>
-      <w:tblW w:w="5000" w:type="pct"/>
-      <w:tblCellMar>
-        <w:left w:w="0" w:type="dxa"/>
-        <w:right w:w="0" w:type="dxa"/>
-      </w:tblCellMar>
-      <w:tblLook w:val="04A0" w:firstRow="1" w:lastRow="0" w:firstColumn="1" w:lastColumn="0" w:noHBand="0" w:noVBand="1"/>
-    </w:tblPr>
-    <w:tblGrid>
-      <w:gridCol w:w="2946"/>
-      <w:gridCol w:w="2947"/>
-      <w:gridCol w:w="2945"/>
-    </w:tblGrid>
-    <w:tr>
-      <w:trPr>
-        <w:trHeight w:val="720"/>
-      </w:trPr>
-      <w:tc>
-        <w:tcPr>
-          <w:tcW w:w="1667" w:type="pct"/>
-        </w:tcPr>
-        <w:p>
-          <w:pPr>
-            <w:pStyle w:val="Encabezado"/>
-            <w:rPr>
-              <w:color w:val="156082" w:themeColor="accent1"/>
-            </w:rPr>
-          </w:pPr>
-        </w:p>
-      </w:tc>
-      <w:tc>
-        <w:tcPr>
-          <w:tcW w:w="1667" w:type="pct"/>
-        </w:tcPr>
-        <w:p>
-          <w:pPr>
-            <w:pStyle w:val="Encabezado"/>
-            <w:jc w:val="center"/>
-            <w:rPr>
-              <w:color w:val="156082" w:themeColor="accent1"/>
-            </w:rPr>
-          </w:pPr>
-        </w:p>
-      </w:tc>
-      <w:tc>
-        <w:tcPr>
-          <w:tcW w:w="1666" w:type="pct"/>
-        </w:tcPr>
-        <w:p>
-          <w:pPr>
-            <w:pStyle w:val="Encabezado"/>
-            <w:jc w:val="right"/>
-            <w:rPr>
-              <w:rFonts w:ascii="Times New Roman" w:hAnsi="Times New Roman" w:cs="Times New Roman"/>
-            </w:rPr>
-          </w:pPr>
-          <w:r>
-            <w:rPr>
-              <w:rFonts w:ascii="Times New Roman" w:hAnsi="Times New Roman" w:cs="Times New Roman"/>
-            </w:rPr>
-            <w:fldChar w:fldCharType="begin"/>
-          </w:r>
-          <w:r>
-            <w:rPr>
-              <w:rFonts w:ascii="Times New Roman" w:hAnsi="Times New Roman" w:cs="Times New Roman"/>
-            </w:rPr>
-            <w:instrText>PAGE   \* MERGEFORMAT</w:instrText>
-          </w:r>
-          <w:r>
-            <w:rPr>
-              <w:rFonts w:ascii="Times New Roman" w:hAnsi="Times New Roman" w:cs="Times New Roman"/>
-            </w:rPr>
-            <w:fldChar w:fldCharType="separate"/>
-          </w:r>
-          <w:r>
-            <w:rPr>
-              <w:rFonts w:ascii="Times New Roman" w:hAnsi="Times New Roman" w:cs="Times New Roman"/>
-              <w:lang w:val="es-ES"/>
-            </w:rPr>
-            <w:t>0</w:t>
-          </w:r>
-          <w:r>
-            <w:rPr>
-              <w:rFonts w:ascii="Times New Roman" w:hAnsi="Times New Roman" w:cs="Times New Roman"/>
-            </w:rPr>
-            <w:fldChar w:fldCharType="end"/>
-          </w:r>
-        </w:p>
-      </w:tc>
-    </w:tr>
-  </w:tbl>
+  <w:sdt>
+    <w:sdtPr>
+      <w:id w:val="1470250664"/>
+      <w:docPartObj>
+        <w:docPartGallery w:val="Page Numbers (Top of Page)"/>
+        <w:docPartUnique/>
+      </w:docPartObj>
+    </w:sdtPr>
+    <w:sdtContent>
+      <w:p>
+        <w:pPr>
+          <w:pStyle w:val="Encabezado"/>
+          <w:jc w:val="right"/>
+        </w:pPr>
+        <w:r>
+          <w:fldChar w:fldCharType="begin"/>
+        </w:r>
+        <w:r>
+          <w:instrText>PAGE   \* MERGEFORMAT</w:instrText>
+        </w:r>
+        <w:r>
+          <w:fldChar w:fldCharType="separate"/>
+        </w:r>
+        <w:r>
+          <w:rPr>
+            <w:lang w:val="es-MX"/>
+          </w:rPr>
+          <w:t>2</w:t>
+        </w:r>
+        <w:r>
+          <w:fldChar w:fldCharType="end"/>
+        </w:r>
+      </w:p>
+    </w:sdtContent>
+  </w:sdt>
   <w:p>
     <w:pPr>
       <w:pStyle w:val="Encabezado"/>
@@ -4487,7 +5450,6 @@
   <w:style w:type="character" w:default="1" w:styleId="Fuentedeprrafopredeter">
     <w:name w:val="Default Paragraph Font"/>
     <w:uiPriority w:val="1"/>
-    <w:semiHidden/>
     <w:unhideWhenUsed/>
   </w:style>
   <w:style w:type="table" w:default="1" w:styleId="Tablanormal">
@@ -4903,6 +5865,36 @@
     <w:uiPriority w:val="99"/>
     <w:rsid w:val="000A33BC"/>
   </w:style>
+  <w:style w:type="paragraph" w:styleId="Descripcin">
+    <w:name w:val="caption"/>
+    <w:basedOn w:val="Normal"/>
+    <w:next w:val="Normal"/>
+    <w:uiPriority w:val="35"/>
+    <w:unhideWhenUsed/>
+    <w:qFormat/>
+    <w:rsid w:val="00AF53BE"/>
+    <w:pPr>
+      <w:spacing w:after="200" w:line="240" w:lineRule="auto"/>
+    </w:pPr>
+    <w:rPr>
+      <w:i/>
+      <w:iCs/>
+      <w:color w:val="0E2841" w:themeColor="text2"/>
+      <w:sz w:val="18"/>
+      <w:szCs w:val="18"/>
+    </w:rPr>
+  </w:style>
+  <w:style w:type="paragraph" w:styleId="Tabladeilustraciones">
+    <w:name w:val="table of figures"/>
+    <w:basedOn w:val="Normal"/>
+    <w:next w:val="Normal"/>
+    <w:uiPriority w:val="99"/>
+    <w:unhideWhenUsed/>
+    <w:rsid w:val="00AF53BE"/>
+    <w:pPr>
+      <w:spacing w:after="0"/>
+    </w:pPr>
+  </w:style>
 </w:styles>
 </file>
 
@@ -5222,28 +6214,28 @@
 </file>
 
 <file path=customXml/item1.xml><?xml version="1.0" encoding="utf-8"?>
+<b:Sources xmlns:b="http://schemas.openxmlformats.org/officeDocument/2006/bibliography" xmlns="http://schemas.openxmlformats.org/officeDocument/2006/bibliography" SelectedStyle="\APASixthEditionOfficeOnline.xsl" StyleName="APA" Version="6"/>
+</file>
+
+<file path=customXml/item2.xml><?xml version="1.0" encoding="utf-8"?>
 <go:gDocsCustomXmlDataStorage xmlns:go="http://customooxmlschemas.google.com/" xmlns:r="http://schemas.openxmlformats.org/officeDocument/2006/relationships" uri="GoogleDocsCustomDataVersion2">
   <go:docsCustomData xmlns:go="http://customooxmlschemas.google.com/" roundtripDataSignature="AMtx7mgNEoP3Kwq+1LxZPzAZXi8V9NcnBA==">CgMxLjA4AHIhMWZGMDk1QVlYQkZjVDI5RnR4bmhOaUp4VnZIVnd1WC1Y</go:docsCustomData>
 </go:gDocsCustomXmlDataStorage>
 </file>
 
-<file path=customXml/item2.xml><?xml version="1.0" encoding="utf-8"?>
-<b:Sources xmlns:b="http://schemas.openxmlformats.org/officeDocument/2006/bibliography" xmlns="http://schemas.openxmlformats.org/officeDocument/2006/bibliography" SelectedStyle="\APASixthEditionOfficeOnline.xsl" StyleName="APA" Version="6"/>
+<file path=customXml/itemProps1.xml><?xml version="1.0" encoding="utf-8"?>
+<ds:datastoreItem xmlns:ds="http://schemas.openxmlformats.org/officeDocument/2006/customXml" ds:itemID="{1ABD5AAA-B4E8-496F-AB7C-4CB05F8790EB}">
+  <ds:schemaRefs>
+    <ds:schemaRef ds:uri="http://schemas.openxmlformats.org/officeDocument/2006/bibliography"/>
+  </ds:schemaRefs>
+</ds:datastoreItem>
 </file>
 
-<file path=customXml/itemProps1.xml><?xml version="1.0" encoding="utf-8"?>
+<file path=customXml/itemProps2.xml><?xml version="1.0" encoding="utf-8"?>
 <ds:datastoreItem xmlns:ds="http://schemas.openxmlformats.org/officeDocument/2006/customXml" ds:itemID="{11111111-1234-1234-1234-123412341234}">
   <ds:schemaRefs>
     <ds:schemaRef ds:uri="http://customooxmlschemas.google.com/"/>
     <ds:schemaRef ds:uri="http://schemas.openxmlformats.org/officeDocument/2006/relationships"/>
   </ds:schemaRefs>
 </ds:datastoreItem>
-</file>
-
-<file path=customXml/itemProps2.xml><?xml version="1.0" encoding="utf-8"?>
-<ds:datastoreItem xmlns:ds="http://schemas.openxmlformats.org/officeDocument/2006/customXml" ds:itemID="{1ABD5AAA-B4E8-496F-AB7C-4CB05F8790EB}">
-  <ds:schemaRefs>
-    <ds:schemaRef ds:uri="http://schemas.openxmlformats.org/officeDocument/2006/bibliography"/>
-  </ds:schemaRefs>
-</ds:datastoreItem>
 </file>
</xml_diff>

<commit_message>
Agrega diagrama del modelo estrella del Data Warehouse
</commit_message>
<xml_diff>
--- a/docs/Documento escrito.docx
+++ b/docs/Documento escrito.docx
@@ -322,7 +322,7 @@
       <w:sdtContent>
         <w:p>
           <w:pPr>
-            <w:pStyle w:val="TtuloTDC"/>
+            <w:pStyle w:val="TOCHeading"/>
             <w:rPr>
               <w:sz w:val="22"/>
               <w:szCs w:val="22"/>
@@ -331,7 +331,7 @@
         </w:p>
         <w:p>
           <w:pPr>
-            <w:pStyle w:val="TDC1"/>
+            <w:pStyle w:val="TOC1"/>
             <w:tabs>
               <w:tab w:val="right" w:leader="dot" w:pos="8828"/>
             </w:tabs>
@@ -369,7 +369,7 @@
           <w:hyperlink w:anchor="_Toc243403960" w:history="1">
             <w:r>
               <w:rPr>
-                <w:rStyle w:val="Hipervnculo"/>
+                <w:rStyle w:val="Hyperlink"/>
                 <w:rFonts w:cs="Times New Roman"/>
                 <w:noProof/>
               </w:rPr>
@@ -427,7 +427,7 @@
         </w:p>
         <w:p>
           <w:pPr>
-            <w:pStyle w:val="TDC1"/>
+            <w:pStyle w:val="TOC1"/>
             <w:tabs>
               <w:tab w:val="right" w:leader="dot" w:pos="8828"/>
             </w:tabs>
@@ -441,7 +441,7 @@
           <w:hyperlink w:anchor="_Toc243403961" w:history="1">
             <w:r>
               <w:rPr>
-                <w:rStyle w:val="Hipervnculo"/>
+                <w:rStyle w:val="Hyperlink"/>
                 <w:noProof/>
               </w:rPr>
               <w:t>Introducción</w:t>
@@ -498,7 +498,7 @@
         </w:p>
         <w:p>
           <w:pPr>
-            <w:pStyle w:val="TDC1"/>
+            <w:pStyle w:val="TOC1"/>
             <w:tabs>
               <w:tab w:val="right" w:leader="dot" w:pos="8828"/>
             </w:tabs>
@@ -512,7 +512,7 @@
           <w:hyperlink w:anchor="_Toc243403962" w:history="1">
             <w:r>
               <w:rPr>
-                <w:rStyle w:val="Hipervnculo"/>
+                <w:rStyle w:val="Hyperlink"/>
                 <w:noProof/>
               </w:rPr>
               <w:t>Enlace al repositorio de Git</w:t>
@@ -569,7 +569,7 @@
         </w:p>
         <w:p>
           <w:pPr>
-            <w:pStyle w:val="TDC1"/>
+            <w:pStyle w:val="TOC1"/>
             <w:tabs>
               <w:tab w:val="right" w:leader="dot" w:pos="8828"/>
             </w:tabs>
@@ -583,7 +583,7 @@
           <w:hyperlink w:anchor="_Toc243403963" w:history="1">
             <w:r>
               <w:rPr>
-                <w:rStyle w:val="Hipervnculo"/>
+                <w:rStyle w:val="Hyperlink"/>
                 <w:noProof/>
               </w:rPr>
               <w:t>Enunciado del problema</w:t>
@@ -640,7 +640,7 @@
         </w:p>
         <w:p>
           <w:pPr>
-            <w:pStyle w:val="TDC1"/>
+            <w:pStyle w:val="TOC1"/>
             <w:tabs>
               <w:tab w:val="right" w:leader="dot" w:pos="8828"/>
             </w:tabs>
@@ -654,7 +654,7 @@
           <w:hyperlink w:anchor="_Toc243403964" w:history="1">
             <w:r>
               <w:rPr>
-                <w:rStyle w:val="Hipervnculo"/>
+                <w:rStyle w:val="Hyperlink"/>
                 <w:noProof/>
               </w:rPr>
               <w:t>Objetivos</w:t>
@@ -711,7 +711,7 @@
         </w:p>
         <w:p>
           <w:pPr>
-            <w:pStyle w:val="TDC2"/>
+            <w:pStyle w:val="TOC2"/>
             <w:tabs>
               <w:tab w:val="right" w:leader="dot" w:pos="8828"/>
             </w:tabs>
@@ -725,7 +725,7 @@
           <w:hyperlink w:anchor="_Toc243403965" w:history="1">
             <w:r>
               <w:rPr>
-                <w:rStyle w:val="Hipervnculo"/>
+                <w:rStyle w:val="Hyperlink"/>
                 <w:noProof/>
               </w:rPr>
               <w:t>Objetivo General</w:t>
@@ -782,7 +782,7 @@
         </w:p>
         <w:p>
           <w:pPr>
-            <w:pStyle w:val="TDC2"/>
+            <w:pStyle w:val="TOC2"/>
             <w:tabs>
               <w:tab w:val="right" w:leader="dot" w:pos="8828"/>
             </w:tabs>
@@ -796,7 +796,7 @@
           <w:hyperlink w:anchor="_Toc243403966" w:history="1">
             <w:r>
               <w:rPr>
-                <w:rStyle w:val="Hipervnculo"/>
+                <w:rStyle w:val="Hyperlink"/>
                 <w:noProof/>
               </w:rPr>
               <w:t>Objetivos Específicos</w:t>
@@ -853,7 +853,7 @@
         </w:p>
         <w:p>
           <w:pPr>
-            <w:pStyle w:val="TDC1"/>
+            <w:pStyle w:val="TOC1"/>
             <w:tabs>
               <w:tab w:val="right" w:leader="dot" w:pos="8828"/>
             </w:tabs>
@@ -867,7 +867,7 @@
           <w:hyperlink w:anchor="_Toc243403967" w:history="1">
             <w:r>
               <w:rPr>
-                <w:rStyle w:val="Hipervnculo"/>
+                <w:rStyle w:val="Hyperlink"/>
                 <w:noProof/>
               </w:rPr>
               <w:t>Identificación de stakeholders y necesidades de análisis</w:t>
@@ -924,7 +924,7 @@
         </w:p>
         <w:p>
           <w:pPr>
-            <w:pStyle w:val="TDC1"/>
+            <w:pStyle w:val="TOC1"/>
             <w:tabs>
               <w:tab w:val="right" w:leader="dot" w:pos="8828"/>
             </w:tabs>
@@ -938,7 +938,7 @@
           <w:hyperlink w:anchor="_Toc243403968" w:history="1">
             <w:r>
               <w:rPr>
-                <w:rStyle w:val="Hipervnculo"/>
+                <w:rStyle w:val="Hyperlink"/>
                 <w:noProof/>
               </w:rPr>
               <w:t>Descripción de la solución</w:t>
@@ -995,7 +995,7 @@
         </w:p>
         <w:p>
           <w:pPr>
-            <w:pStyle w:val="TDC1"/>
+            <w:pStyle w:val="TOC1"/>
             <w:tabs>
               <w:tab w:val="right" w:leader="dot" w:pos="8828"/>
             </w:tabs>
@@ -1009,7 +1009,7 @@
           <w:hyperlink w:anchor="_Toc243403969" w:history="1">
             <w:r>
               <w:rPr>
-                <w:rStyle w:val="Hipervnculo"/>
+                <w:rStyle w:val="Hyperlink"/>
                 <w:noProof/>
               </w:rPr>
               <w:t>Diagrama del Modelo Dimensional (Esquema Estrella o Copo de Nieve)</w:t>
@@ -1066,7 +1066,7 @@
         </w:p>
         <w:p>
           <w:pPr>
-            <w:pStyle w:val="TDC1"/>
+            <w:pStyle w:val="TOC1"/>
             <w:tabs>
               <w:tab w:val="right" w:leader="dot" w:pos="8828"/>
             </w:tabs>
@@ -1080,7 +1080,7 @@
           <w:hyperlink w:anchor="_Toc243403970" w:history="1">
             <w:r>
               <w:rPr>
-                <w:rStyle w:val="Hipervnculo"/>
+                <w:rStyle w:val="Hyperlink"/>
                 <w:noProof/>
               </w:rPr>
               <w:t>Conclusión</w:t>
@@ -1137,7 +1137,7 @@
         </w:p>
         <w:p>
           <w:pPr>
-            <w:pStyle w:val="TDC1"/>
+            <w:pStyle w:val="TOC1"/>
             <w:tabs>
               <w:tab w:val="right" w:leader="dot" w:pos="8828"/>
             </w:tabs>
@@ -1151,7 +1151,7 @@
           <w:hyperlink w:anchor="_Toc243403971" w:history="1">
             <w:r>
               <w:rPr>
-                <w:rStyle w:val="Hipervnculo"/>
+                <w:rStyle w:val="Hyperlink"/>
                 <w:noProof/>
               </w:rPr>
               <w:t>Bibliografía</w:t>
@@ -1232,7 +1232,7 @@
     </w:p>
     <w:p>
       <w:pPr>
-        <w:pStyle w:val="Ttulo1"/>
+        <w:pStyle w:val="Heading1"/>
         <w:rPr>
           <w:rFonts w:cs="Times New Roman"/>
           <w:sz w:val="22"/>
@@ -1264,7 +1264,7 @@
     </w:p>
     <w:p>
       <w:pPr>
-        <w:pStyle w:val="Tabladeilustraciones"/>
+        <w:pStyle w:val="TableofFigures"/>
         <w:tabs>
           <w:tab w:val="left" w:pos="1200"/>
           <w:tab w:val="right" w:leader="dot" w:pos="8828"/>
@@ -1311,7 +1311,7 @@
       <w:hyperlink w:anchor="_Toc243396385" w:history="1">
         <w:r>
           <w:rPr>
-            <w:rStyle w:val="Hipervnculo"/>
+            <w:rStyle w:val="Hyperlink"/>
             <w:rFonts w:ascii="Times New Roman" w:eastAsiaTheme="minorHAnsi" w:hAnsi="Times New Roman" w:cs="Times New Roman"/>
             <w:b/>
             <w:bCs/>
@@ -1335,7 +1335,7 @@
         </w:r>
         <w:r>
           <w:rPr>
-            <w:rStyle w:val="Hipervnculo"/>
+            <w:rStyle w:val="Hyperlink"/>
             <w:rFonts w:ascii="Times New Roman" w:eastAsiaTheme="minorHAnsi" w:hAnsi="Times New Roman" w:cs="Times New Roman"/>
             <w:b/>
             <w:bCs/>
@@ -1348,7 +1348,7 @@
         </w:r>
         <w:r>
           <w:rPr>
-            <w:rStyle w:val="Hipervnculo"/>
+            <w:rStyle w:val="Hyperlink"/>
             <w:rFonts w:ascii="Times New Roman" w:eastAsiaTheme="minorHAnsi" w:hAnsi="Times New Roman" w:cs="Times New Roman"/>
             <w:noProof/>
             <w:sz w:val="22"/>
@@ -1514,7 +1514,7 @@
     </w:p>
     <w:p>
       <w:pPr>
-        <w:pStyle w:val="Ttulo1"/>
+        <w:pStyle w:val="Heading1"/>
       </w:pPr>
       <w:bookmarkStart w:id="3" w:name="_Toc243403961"/>
       <w:r>
@@ -1645,7 +1645,7 @@
     </w:p>
     <w:p>
       <w:pPr>
-        <w:pStyle w:val="Ttulo1"/>
+        <w:pStyle w:val="Heading1"/>
       </w:pPr>
       <w:bookmarkStart w:id="4" w:name="_Toc243403962"/>
       <w:r>
@@ -1877,7 +1877,7 @@
     </w:p>
     <w:p>
       <w:pPr>
-        <w:pStyle w:val="Ttulo1"/>
+        <w:pStyle w:val="Heading1"/>
         <w:rPr>
           <w:szCs w:val="24"/>
         </w:rPr>
@@ -1886,7 +1886,7 @@
     <w:p/>
     <w:p>
       <w:pPr>
-        <w:pStyle w:val="Ttulo1"/>
+        <w:pStyle w:val="Heading1"/>
         <w:rPr>
           <w:szCs w:val="24"/>
         </w:rPr>
@@ -2178,7 +2178,7 @@
     </w:p>
     <w:p>
       <w:pPr>
-        <w:pStyle w:val="Ttulo1"/>
+        <w:pStyle w:val="Heading1"/>
       </w:pPr>
       <w:bookmarkStart w:id="6" w:name="_Toc243403964"/>
       <w:r>
@@ -2189,7 +2189,7 @@
     </w:p>
     <w:p>
       <w:pPr>
-        <w:pStyle w:val="Ttulo2"/>
+        <w:pStyle w:val="Heading2"/>
         <w:rPr>
           <w:sz w:val="22"/>
           <w:szCs w:val="22"/>
@@ -2273,7 +2273,7 @@
     </w:p>
     <w:p>
       <w:pPr>
-        <w:pStyle w:val="Ttulo2"/>
+        <w:pStyle w:val="Heading2"/>
         <w:rPr>
           <w:sz w:val="22"/>
           <w:szCs w:val="22"/>
@@ -2305,7 +2305,7 @@
     </w:p>
     <w:p>
       <w:pPr>
-        <w:pStyle w:val="Prrafodelista"/>
+        <w:pStyle w:val="ListParagraph"/>
         <w:numPr>
           <w:ilvl w:val="0"/>
           <w:numId w:val="3"/>
@@ -2328,7 +2328,7 @@
     </w:p>
     <w:p>
       <w:pPr>
-        <w:pStyle w:val="Prrafodelista"/>
+        <w:pStyle w:val="ListParagraph"/>
         <w:numPr>
           <w:ilvl w:val="0"/>
           <w:numId w:val="3"/>
@@ -2395,7 +2395,7 @@
     </w:p>
     <w:p>
       <w:pPr>
-        <w:pStyle w:val="Ttulo1"/>
+        <w:pStyle w:val="Heading1"/>
         <w:rPr>
           <w:sz w:val="22"/>
           <w:szCs w:val="22"/>
@@ -2427,7 +2427,7 @@
           <w:sz w:val="22"/>
           <w:szCs w:val="22"/>
         </w:rPr>
-        <w:t xml:space="preserve">Para el desarrollo del Data Warehouse de </w:t>
+        <w:t xml:space="preserve">Para el desarrollo del Data </w:t>
       </w:r>
       <w:proofErr w:type="spellStart"/>
       <w:r>
@@ -2436,6 +2436,24 @@
           <w:sz w:val="22"/>
           <w:szCs w:val="22"/>
         </w:rPr>
+        <w:t>Warehouse</w:t>
+      </w:r>
+      <w:proofErr w:type="spellEnd"/>
+      <w:r>
+        <w:rPr>
+          <w:rFonts w:ascii="Times New Roman" w:eastAsia="Times New Roman" w:hAnsi="Times New Roman" w:cs="Times New Roman"/>
+          <w:sz w:val="22"/>
+          <w:szCs w:val="22"/>
+        </w:rPr>
+        <w:t xml:space="preserve"> de </w:t>
+      </w:r>
+      <w:proofErr w:type="spellStart"/>
+      <w:r>
+        <w:rPr>
+          <w:rFonts w:ascii="Times New Roman" w:eastAsia="Times New Roman" w:hAnsi="Times New Roman" w:cs="Times New Roman"/>
+          <w:sz w:val="22"/>
+          <w:szCs w:val="22"/>
+        </w:rPr>
         <w:t>Invacom</w:t>
       </w:r>
       <w:proofErr w:type="spellEnd"/>
@@ -2450,7 +2468,7 @@
     </w:p>
     <w:p>
       <w:pPr>
-        <w:pStyle w:val="Descripcin"/>
+        <w:pStyle w:val="Caption"/>
         <w:keepNext/>
         <w:rPr>
           <w:rFonts w:ascii="Times New Roman" w:eastAsiaTheme="minorHAnsi" w:hAnsi="Times New Roman" w:cs="Times New Roman"/>
@@ -3335,7 +3353,7 @@
     </w:p>
     <w:p>
       <w:pPr>
-        <w:pStyle w:val="Ttulo1"/>
+        <w:pStyle w:val="Heading1"/>
         <w:rPr>
           <w:sz w:val="22"/>
           <w:szCs w:val="22"/>
@@ -3544,282 +3562,335 @@
     </w:p>
     <w:p>
       <w:pPr>
-        <w:pStyle w:val="Ttulo1"/>
+        <w:pStyle w:val="Heading1"/>
       </w:pPr>
       <w:bookmarkStart w:id="12" w:name="_Toc243403969"/>
       <w:r>
         <w:lastRenderedPageBreak/>
-        <w:t>Diagrama del Modelo Dimensional (Esquema Estrella o Copo de Nieve)</w:t>
+        <w:t>Diagrama del Modelo Dimensional (Esquema Estrella)</w:t>
       </w:r>
       <w:bookmarkEnd w:id="12"/>
     </w:p>
-    <w:p>
-      <w:pPr>
-        <w:jc w:val="center"/>
-        <w:rPr>
-          <w:rFonts w:ascii="Times New Roman" w:eastAsia="Times New Roman" w:hAnsi="Times New Roman" w:cs="Times New Roman"/>
-          <w:b/>
-          <w:bCs/>
-        </w:rPr>
-      </w:pPr>
-    </w:p>
-    <w:p>
-      <w:pPr>
-        <w:jc w:val="center"/>
-        <w:rPr>
-          <w:rFonts w:ascii="Times New Roman" w:eastAsia="Times New Roman" w:hAnsi="Times New Roman" w:cs="Times New Roman"/>
-          <w:b/>
-          <w:bCs/>
-        </w:rPr>
-      </w:pPr>
-    </w:p>
-    <w:p>
-      <w:pPr>
-        <w:jc w:val="center"/>
-        <w:rPr>
-          <w:rFonts w:ascii="Times New Roman" w:eastAsia="Times New Roman" w:hAnsi="Times New Roman" w:cs="Times New Roman"/>
-          <w:b/>
-          <w:bCs/>
-        </w:rPr>
-      </w:pPr>
-    </w:p>
-    <w:p>
-      <w:pPr>
-        <w:jc w:val="center"/>
-        <w:rPr>
-          <w:rFonts w:ascii="Times New Roman" w:eastAsia="Times New Roman" w:hAnsi="Times New Roman" w:cs="Times New Roman"/>
-          <w:b/>
-          <w:bCs/>
-        </w:rPr>
-      </w:pPr>
-    </w:p>
-    <w:p>
-      <w:pPr>
-        <w:jc w:val="center"/>
-        <w:rPr>
-          <w:rFonts w:ascii="Times New Roman" w:eastAsia="Times New Roman" w:hAnsi="Times New Roman" w:cs="Times New Roman"/>
-          <w:b/>
-          <w:bCs/>
-        </w:rPr>
-      </w:pPr>
-    </w:p>
-    <w:p>
-      <w:pPr>
-        <w:jc w:val="center"/>
-        <w:rPr>
-          <w:rFonts w:ascii="Times New Roman" w:eastAsia="Times New Roman" w:hAnsi="Times New Roman" w:cs="Times New Roman"/>
-          <w:b/>
-          <w:bCs/>
-        </w:rPr>
-      </w:pPr>
-    </w:p>
-    <w:p>
-      <w:pPr>
-        <w:jc w:val="center"/>
-        <w:rPr>
-          <w:rFonts w:ascii="Times New Roman" w:eastAsia="Times New Roman" w:hAnsi="Times New Roman" w:cs="Times New Roman"/>
-          <w:b/>
-          <w:bCs/>
-        </w:rPr>
-      </w:pPr>
-    </w:p>
-    <w:p>
-      <w:pPr>
-        <w:jc w:val="center"/>
-        <w:rPr>
-          <w:rFonts w:ascii="Times New Roman" w:eastAsia="Times New Roman" w:hAnsi="Times New Roman" w:cs="Times New Roman"/>
-          <w:b/>
-          <w:bCs/>
-        </w:rPr>
-      </w:pPr>
-    </w:p>
-    <w:p>
-      <w:pPr>
-        <w:jc w:val="center"/>
-        <w:rPr>
-          <w:rFonts w:ascii="Times New Roman" w:eastAsia="Times New Roman" w:hAnsi="Times New Roman" w:cs="Times New Roman"/>
-          <w:b/>
-          <w:bCs/>
-        </w:rPr>
-      </w:pPr>
-    </w:p>
-    <w:p>
-      <w:pPr>
-        <w:jc w:val="center"/>
-        <w:rPr>
-          <w:rFonts w:ascii="Times New Roman" w:eastAsia="Times New Roman" w:hAnsi="Times New Roman" w:cs="Times New Roman"/>
-          <w:b/>
-          <w:bCs/>
-        </w:rPr>
-      </w:pPr>
-    </w:p>
-    <w:p>
-      <w:pPr>
-        <w:jc w:val="center"/>
-        <w:rPr>
-          <w:rFonts w:ascii="Times New Roman" w:eastAsia="Times New Roman" w:hAnsi="Times New Roman" w:cs="Times New Roman"/>
-          <w:b/>
-          <w:bCs/>
-        </w:rPr>
-      </w:pPr>
-    </w:p>
-    <w:p>
-      <w:pPr>
-        <w:jc w:val="center"/>
-        <w:rPr>
-          <w:rFonts w:ascii="Times New Roman" w:eastAsia="Times New Roman" w:hAnsi="Times New Roman" w:cs="Times New Roman"/>
-          <w:b/>
-          <w:bCs/>
-        </w:rPr>
-      </w:pPr>
-    </w:p>
-    <w:p>
-      <w:pPr>
-        <w:jc w:val="center"/>
-        <w:rPr>
-          <w:rFonts w:ascii="Times New Roman" w:eastAsia="Times New Roman" w:hAnsi="Times New Roman" w:cs="Times New Roman"/>
-          <w:b/>
-          <w:bCs/>
-        </w:rPr>
-      </w:pPr>
-    </w:p>
-    <w:p>
-      <w:pPr>
-        <w:jc w:val="center"/>
-        <w:rPr>
-          <w:rFonts w:ascii="Times New Roman" w:eastAsia="Times New Roman" w:hAnsi="Times New Roman" w:cs="Times New Roman"/>
-          <w:b/>
-          <w:bCs/>
-        </w:rPr>
-      </w:pPr>
-    </w:p>
-    <w:p>
-      <w:pPr>
-        <w:jc w:val="center"/>
-        <w:rPr>
-          <w:rFonts w:ascii="Times New Roman" w:eastAsia="Times New Roman" w:hAnsi="Times New Roman" w:cs="Times New Roman"/>
-          <w:b/>
-          <w:bCs/>
-        </w:rPr>
-      </w:pPr>
-    </w:p>
-    <w:p>
-      <w:pPr>
-        <w:jc w:val="center"/>
-        <w:rPr>
-          <w:rFonts w:ascii="Times New Roman" w:eastAsia="Times New Roman" w:hAnsi="Times New Roman" w:cs="Times New Roman"/>
-          <w:b/>
-          <w:bCs/>
-        </w:rPr>
-      </w:pPr>
-    </w:p>
-    <w:p>
-      <w:pPr>
-        <w:jc w:val="center"/>
-        <w:rPr>
-          <w:rFonts w:ascii="Times New Roman" w:eastAsia="Times New Roman" w:hAnsi="Times New Roman" w:cs="Times New Roman"/>
-          <w:b/>
-          <w:bCs/>
-        </w:rPr>
-      </w:pPr>
-    </w:p>
-    <w:p>
-      <w:pPr>
-        <w:jc w:val="center"/>
-        <w:rPr>
-          <w:rFonts w:ascii="Times New Roman" w:eastAsia="Times New Roman" w:hAnsi="Times New Roman" w:cs="Times New Roman"/>
-          <w:b/>
-          <w:bCs/>
-        </w:rPr>
-      </w:pPr>
-    </w:p>
-    <w:p>
-      <w:pPr>
-        <w:jc w:val="center"/>
-        <w:rPr>
-          <w:rFonts w:ascii="Times New Roman" w:eastAsia="Times New Roman" w:hAnsi="Times New Roman" w:cs="Times New Roman"/>
-          <w:b/>
-          <w:bCs/>
-        </w:rPr>
-      </w:pPr>
-    </w:p>
-    <w:p>
-      <w:pPr>
-        <w:jc w:val="center"/>
-        <w:rPr>
-          <w:rFonts w:ascii="Times New Roman" w:eastAsia="Times New Roman" w:hAnsi="Times New Roman" w:cs="Times New Roman"/>
-          <w:b/>
-          <w:bCs/>
-        </w:rPr>
-      </w:pPr>
-    </w:p>
-    <w:p>
-      <w:pPr>
-        <w:jc w:val="center"/>
-        <w:rPr>
-          <w:rFonts w:ascii="Times New Roman" w:eastAsia="Times New Roman" w:hAnsi="Times New Roman" w:cs="Times New Roman"/>
-          <w:b/>
-          <w:bCs/>
-        </w:rPr>
-      </w:pPr>
-    </w:p>
-    <w:p>
-      <w:pPr>
-        <w:jc w:val="center"/>
-        <w:rPr>
-          <w:rFonts w:ascii="Times New Roman" w:eastAsia="Times New Roman" w:hAnsi="Times New Roman" w:cs="Times New Roman"/>
-          <w:b/>
-          <w:bCs/>
-        </w:rPr>
-      </w:pPr>
-    </w:p>
-    <w:p>
-      <w:pPr>
-        <w:jc w:val="center"/>
-        <w:rPr>
-          <w:rFonts w:ascii="Times New Roman" w:eastAsia="Times New Roman" w:hAnsi="Times New Roman" w:cs="Times New Roman"/>
-          <w:b/>
-          <w:bCs/>
-        </w:rPr>
-      </w:pPr>
-    </w:p>
-    <w:p>
-      <w:pPr>
-        <w:jc w:val="center"/>
-        <w:rPr>
-          <w:rFonts w:ascii="Times New Roman" w:eastAsia="Times New Roman" w:hAnsi="Times New Roman" w:cs="Times New Roman"/>
-          <w:b/>
-          <w:bCs/>
-        </w:rPr>
-      </w:pPr>
-    </w:p>
-    <w:p>
-      <w:pPr>
-        <w:jc w:val="center"/>
-        <w:rPr>
-          <w:rFonts w:ascii="Times New Roman" w:eastAsia="Times New Roman" w:hAnsi="Times New Roman" w:cs="Times New Roman"/>
-          <w:b/>
-          <w:bCs/>
-        </w:rPr>
-      </w:pPr>
-    </w:p>
-    <w:p>
-      <w:pPr>
-        <w:jc w:val="center"/>
-        <w:rPr>
-          <w:rFonts w:ascii="Times New Roman" w:eastAsia="Times New Roman" w:hAnsi="Times New Roman" w:cs="Times New Roman"/>
-          <w:b/>
-          <w:bCs/>
-        </w:rPr>
-      </w:pPr>
-    </w:p>
-    <w:p>
-      <w:pPr>
-        <w:pStyle w:val="Ttulo1"/>
+    <w:p/>
+    <w:p>
+      <w:pPr>
+        <w:jc w:val="center"/>
+        <w:rPr>
+          <w:rFonts w:ascii="Times New Roman" w:eastAsia="Times New Roman" w:hAnsi="Times New Roman" w:cs="Times New Roman"/>
+          <w:b/>
+          <w:bCs/>
+        </w:rPr>
+      </w:pPr>
+      <w:r>
+        <w:rPr>
+          <w:noProof/>
+        </w:rPr>
+        <w:drawing>
+          <wp:inline distT="0" distB="0" distL="0" distR="0" wp14:anchorId="10C3C9F6" wp14:editId="25C77EF8">
+            <wp:extent cx="5688636" cy="3498273"/>
+            <wp:effectExtent l="0" t="0" r="7620" b="6985"/>
+            <wp:docPr id="2136304022" name="Picture 3" descr="This diagram is a complex data structure that appears to represent a database schema, containing various fields related to products, promotions, customer information, and sales data.&#10;&#10;AI-generated content may be incorrect."/>
+            <wp:cNvGraphicFramePr>
+              <a:graphicFrameLocks xmlns:a="http://schemas.openxmlformats.org/drawingml/2006/main" noChangeAspect="1"/>
+            </wp:cNvGraphicFramePr>
+            <a:graphic xmlns:a="http://schemas.openxmlformats.org/drawingml/2006/main">
+              <a:graphicData uri="http://schemas.openxmlformats.org/drawingml/2006/picture">
+                <pic:pic xmlns:pic="http://schemas.openxmlformats.org/drawingml/2006/picture">
+                  <pic:nvPicPr>
+                    <pic:cNvPr id="2136304022" name="Picture 3" descr="This diagram is a complex data structure that appears to represent a database schema, containing various fields related to products, promotions, customer information, and sales data.&#10;&#10;AI-generated content may be incorrect."/>
+                    <pic:cNvPicPr>
+                      <a:picLocks noChangeAspect="1" noChangeArrowheads="1"/>
+                    </pic:cNvPicPr>
+                  </pic:nvPicPr>
+                  <pic:blipFill>
+                    <a:blip r:embed="rId11" cstate="print">
+                      <a:extLst>
+                        <a:ext uri="{28A0092B-C50C-407E-A947-70E740481C1C}">
+                          <a14:useLocalDpi xmlns:a14="http://schemas.microsoft.com/office/drawing/2010/main" val="0"/>
+                        </a:ext>
+                      </a:extLst>
+                    </a:blip>
+                    <a:srcRect/>
+                    <a:stretch>
+                      <a:fillRect/>
+                    </a:stretch>
+                  </pic:blipFill>
+                  <pic:spPr bwMode="auto">
+                    <a:xfrm>
+                      <a:off x="0" y="0"/>
+                      <a:ext cx="5690546" cy="3499448"/>
+                    </a:xfrm>
+                    <a:prstGeom prst="rect">
+                      <a:avLst/>
+                    </a:prstGeom>
+                    <a:noFill/>
+                    <a:ln>
+                      <a:noFill/>
+                    </a:ln>
+                  </pic:spPr>
+                </pic:pic>
+              </a:graphicData>
+            </a:graphic>
+          </wp:inline>
+        </w:drawing>
+      </w:r>
+    </w:p>
+    <w:p>
+      <w:pPr>
+        <w:jc w:val="center"/>
+        <w:rPr>
+          <w:rFonts w:ascii="Times New Roman" w:eastAsia="Times New Roman" w:hAnsi="Times New Roman" w:cs="Times New Roman"/>
+          <w:b/>
+          <w:bCs/>
+        </w:rPr>
+      </w:pPr>
+    </w:p>
+    <w:p>
+      <w:pPr>
+        <w:jc w:val="center"/>
+        <w:rPr>
+          <w:rFonts w:ascii="Times New Roman" w:eastAsia="Times New Roman" w:hAnsi="Times New Roman" w:cs="Times New Roman"/>
+          <w:b/>
+          <w:bCs/>
+        </w:rPr>
+      </w:pPr>
+    </w:p>
+    <w:p>
+      <w:pPr>
+        <w:jc w:val="center"/>
+        <w:rPr>
+          <w:rFonts w:ascii="Times New Roman" w:eastAsia="Times New Roman" w:hAnsi="Times New Roman" w:cs="Times New Roman"/>
+          <w:b/>
+          <w:bCs/>
+        </w:rPr>
+      </w:pPr>
+    </w:p>
+    <w:p>
+      <w:pPr>
+        <w:jc w:val="center"/>
+        <w:rPr>
+          <w:rFonts w:ascii="Times New Roman" w:eastAsia="Times New Roman" w:hAnsi="Times New Roman" w:cs="Times New Roman"/>
+          <w:b/>
+          <w:bCs/>
+        </w:rPr>
+      </w:pPr>
+    </w:p>
+    <w:p>
+      <w:pPr>
+        <w:jc w:val="center"/>
+        <w:rPr>
+          <w:rFonts w:ascii="Times New Roman" w:eastAsia="Times New Roman" w:hAnsi="Times New Roman" w:cs="Times New Roman"/>
+          <w:b/>
+          <w:bCs/>
+        </w:rPr>
+      </w:pPr>
+    </w:p>
+    <w:p>
+      <w:pPr>
+        <w:jc w:val="center"/>
+        <w:rPr>
+          <w:rFonts w:ascii="Times New Roman" w:eastAsia="Times New Roman" w:hAnsi="Times New Roman" w:cs="Times New Roman"/>
+          <w:b/>
+          <w:bCs/>
+        </w:rPr>
+      </w:pPr>
+    </w:p>
+    <w:p>
+      <w:pPr>
+        <w:jc w:val="center"/>
+        <w:rPr>
+          <w:rFonts w:ascii="Times New Roman" w:eastAsia="Times New Roman" w:hAnsi="Times New Roman" w:cs="Times New Roman"/>
+          <w:b/>
+          <w:bCs/>
+        </w:rPr>
+      </w:pPr>
+    </w:p>
+    <w:p>
+      <w:pPr>
+        <w:jc w:val="center"/>
+        <w:rPr>
+          <w:rFonts w:ascii="Times New Roman" w:eastAsia="Times New Roman" w:hAnsi="Times New Roman" w:cs="Times New Roman"/>
+          <w:b/>
+          <w:bCs/>
+        </w:rPr>
+      </w:pPr>
+    </w:p>
+    <w:p>
+      <w:pPr>
+        <w:jc w:val="center"/>
+        <w:rPr>
+          <w:rFonts w:ascii="Times New Roman" w:eastAsia="Times New Roman" w:hAnsi="Times New Roman" w:cs="Times New Roman"/>
+          <w:b/>
+          <w:bCs/>
+        </w:rPr>
+      </w:pPr>
+    </w:p>
+    <w:p>
+      <w:pPr>
+        <w:jc w:val="center"/>
+        <w:rPr>
+          <w:rFonts w:ascii="Times New Roman" w:eastAsia="Times New Roman" w:hAnsi="Times New Roman" w:cs="Times New Roman"/>
+          <w:b/>
+          <w:bCs/>
+        </w:rPr>
+      </w:pPr>
+    </w:p>
+    <w:p>
+      <w:pPr>
+        <w:jc w:val="center"/>
+        <w:rPr>
+          <w:rFonts w:ascii="Times New Roman" w:eastAsia="Times New Roman" w:hAnsi="Times New Roman" w:cs="Times New Roman"/>
+          <w:b/>
+          <w:bCs/>
+        </w:rPr>
+      </w:pPr>
+    </w:p>
+    <w:p>
+      <w:pPr>
+        <w:jc w:val="center"/>
+        <w:rPr>
+          <w:rFonts w:ascii="Times New Roman" w:eastAsia="Times New Roman" w:hAnsi="Times New Roman" w:cs="Times New Roman"/>
+          <w:b/>
+          <w:bCs/>
+        </w:rPr>
+      </w:pPr>
+    </w:p>
+    <w:p>
+      <w:pPr>
+        <w:jc w:val="center"/>
+        <w:rPr>
+          <w:rFonts w:ascii="Times New Roman" w:eastAsia="Times New Roman" w:hAnsi="Times New Roman" w:cs="Times New Roman"/>
+          <w:b/>
+          <w:bCs/>
+        </w:rPr>
+      </w:pPr>
+    </w:p>
+    <w:p>
+      <w:pPr>
+        <w:jc w:val="center"/>
+        <w:rPr>
+          <w:rFonts w:ascii="Times New Roman" w:eastAsia="Times New Roman" w:hAnsi="Times New Roman" w:cs="Times New Roman"/>
+          <w:b/>
+          <w:bCs/>
+        </w:rPr>
+      </w:pPr>
+    </w:p>
+    <w:p>
+      <w:pPr>
+        <w:jc w:val="center"/>
+        <w:rPr>
+          <w:rFonts w:ascii="Times New Roman" w:eastAsia="Times New Roman" w:hAnsi="Times New Roman" w:cs="Times New Roman"/>
+          <w:b/>
+          <w:bCs/>
+        </w:rPr>
+      </w:pPr>
+    </w:p>
+    <w:p>
+      <w:pPr>
+        <w:jc w:val="center"/>
+        <w:rPr>
+          <w:rFonts w:ascii="Times New Roman" w:eastAsia="Times New Roman" w:hAnsi="Times New Roman" w:cs="Times New Roman"/>
+          <w:b/>
+          <w:bCs/>
+        </w:rPr>
+      </w:pPr>
+    </w:p>
+    <w:p>
+      <w:pPr>
+        <w:jc w:val="center"/>
+        <w:rPr>
+          <w:rFonts w:ascii="Times New Roman" w:eastAsia="Times New Roman" w:hAnsi="Times New Roman" w:cs="Times New Roman"/>
+          <w:b/>
+          <w:bCs/>
+        </w:rPr>
+      </w:pPr>
+    </w:p>
+    <w:p>
+      <w:pPr>
+        <w:jc w:val="center"/>
+        <w:rPr>
+          <w:rFonts w:ascii="Times New Roman" w:eastAsia="Times New Roman" w:hAnsi="Times New Roman" w:cs="Times New Roman"/>
+          <w:b/>
+          <w:bCs/>
+        </w:rPr>
+      </w:pPr>
+    </w:p>
+    <w:p>
+      <w:pPr>
+        <w:jc w:val="center"/>
+        <w:rPr>
+          <w:rFonts w:ascii="Times New Roman" w:eastAsia="Times New Roman" w:hAnsi="Times New Roman" w:cs="Times New Roman"/>
+          <w:b/>
+          <w:bCs/>
+        </w:rPr>
+      </w:pPr>
+    </w:p>
+    <w:p>
+      <w:pPr>
+        <w:jc w:val="center"/>
+        <w:rPr>
+          <w:rFonts w:ascii="Times New Roman" w:eastAsia="Times New Roman" w:hAnsi="Times New Roman" w:cs="Times New Roman"/>
+          <w:b/>
+          <w:bCs/>
+        </w:rPr>
+      </w:pPr>
+    </w:p>
+    <w:p>
+      <w:pPr>
+        <w:jc w:val="center"/>
+        <w:rPr>
+          <w:rFonts w:ascii="Times New Roman" w:eastAsia="Times New Roman" w:hAnsi="Times New Roman" w:cs="Times New Roman"/>
+          <w:b/>
+          <w:bCs/>
+        </w:rPr>
+      </w:pPr>
+    </w:p>
+    <w:p>
+      <w:pPr>
+        <w:jc w:val="center"/>
+        <w:rPr>
+          <w:rFonts w:ascii="Times New Roman" w:eastAsia="Times New Roman" w:hAnsi="Times New Roman" w:cs="Times New Roman"/>
+          <w:b/>
+          <w:bCs/>
+        </w:rPr>
+      </w:pPr>
+    </w:p>
+    <w:p>
+      <w:pPr>
+        <w:jc w:val="center"/>
+        <w:rPr>
+          <w:rFonts w:ascii="Times New Roman" w:eastAsia="Times New Roman" w:hAnsi="Times New Roman" w:cs="Times New Roman"/>
+          <w:b/>
+          <w:bCs/>
+        </w:rPr>
+      </w:pPr>
+    </w:p>
+    <w:p>
+      <w:pPr>
+        <w:jc w:val="center"/>
+        <w:rPr>
+          <w:rFonts w:ascii="Times New Roman" w:eastAsia="Times New Roman" w:hAnsi="Times New Roman" w:cs="Times New Roman"/>
+          <w:b/>
+          <w:bCs/>
+        </w:rPr>
+      </w:pPr>
+    </w:p>
+    <w:p>
+      <w:pPr>
+        <w:jc w:val="center"/>
+        <w:rPr>
+          <w:rFonts w:ascii="Times New Roman" w:eastAsia="Times New Roman" w:hAnsi="Times New Roman" w:cs="Times New Roman"/>
+          <w:b/>
+          <w:bCs/>
+        </w:rPr>
+      </w:pPr>
+    </w:p>
+    <w:p>
+      <w:pPr>
+        <w:pStyle w:val="Heading1"/>
       </w:pPr>
       <w:bookmarkStart w:id="13" w:name="_Toc243403970"/>
       <w:r>
-        <w:lastRenderedPageBreak/>
         <w:t>Conclusión</w:t>
       </w:r>
       <w:bookmarkEnd w:id="13"/>
@@ -4086,11 +4157,10 @@
     </w:p>
     <w:p>
       <w:pPr>
-        <w:pStyle w:val="Ttulo1"/>
+        <w:pStyle w:val="Heading1"/>
       </w:pPr>
       <w:bookmarkStart w:id="14" w:name="_Toc243403971"/>
       <w:r>
-        <w:lastRenderedPageBreak/>
         <w:t>Bibliografía</w:t>
       </w:r>
       <w:bookmarkEnd w:id="14"/>
@@ -4157,7 +4227,7 @@
         </w:rPr>
         <w:t xml:space="preserve">? </w:t>
       </w:r>
-      <w:hyperlink r:id="rId11">
+      <w:hyperlink r:id="rId12">
         <w:r>
           <w:rPr>
             <w:rFonts w:ascii="Times New Roman" w:eastAsia="Times New Roman" w:hAnsi="Times New Roman" w:cs="Times New Roman"/>
@@ -4237,7 +4307,7 @@
         </w:rPr>
         <w:t xml:space="preserve"> </w:t>
       </w:r>
-      <w:hyperlink r:id="rId12" w:history="1">
+      <w:hyperlink r:id="rId13" w:history="1">
         <w:r>
           <w:rPr>
             <w:rFonts w:ascii="Times New Roman" w:eastAsia="Times New Roman" w:hAnsi="Times New Roman" w:cs="Times New Roman"/>
@@ -4288,7 +4358,7 @@
       </w:pPr>
     </w:p>
     <w:sectPr>
-      <w:headerReference w:type="default" r:id="rId13"/>
+      <w:headerReference w:type="default" r:id="rId14"/>
       <w:pgSz w:w="12240" w:h="15840"/>
       <w:pgMar w:top="1417" w:right="1701" w:bottom="1417" w:left="1701" w:header="708" w:footer="708" w:gutter="0"/>
       <w:pgNumType w:start="1"/>
@@ -4358,10 +4428,11 @@
         <w:docPartUnique/>
       </w:docPartObj>
     </w:sdtPr>
+    <w:sdtEndPr/>
     <w:sdtContent>
       <w:p>
         <w:pPr>
-          <w:pStyle w:val="Encabezado"/>
+          <w:pStyle w:val="Header"/>
           <w:jc w:val="right"/>
         </w:pPr>
         <w:r>
@@ -4387,7 +4458,7 @@
   </w:sdt>
   <w:p>
     <w:pPr>
-      <w:pStyle w:val="Encabezado"/>
+      <w:pStyle w:val="Header"/>
     </w:pPr>
   </w:p>
 </w:hdr>
@@ -5262,7 +5333,7 @@
     <w:qFormat/>
     <w:rsid w:val="00142074"/>
   </w:style>
-  <w:style w:type="paragraph" w:styleId="Ttulo1">
+  <w:style w:type="paragraph" w:styleId="Heading1">
     <w:name w:val="heading 1"/>
     <w:basedOn w:val="Normal"/>
     <w:next w:val="Normal"/>
@@ -5283,7 +5354,7 @@
       <w:szCs w:val="40"/>
     </w:rPr>
   </w:style>
-  <w:style w:type="paragraph" w:styleId="Ttulo2">
+  <w:style w:type="paragraph" w:styleId="Heading2">
     <w:name w:val="heading 2"/>
     <w:basedOn w:val="Normal"/>
     <w:next w:val="Normal"/>
@@ -5304,7 +5375,7 @@
       <w:szCs w:val="32"/>
     </w:rPr>
   </w:style>
-  <w:style w:type="paragraph" w:styleId="Ttulo3">
+  <w:style w:type="paragraph" w:styleId="Heading3">
     <w:name w:val="heading 3"/>
     <w:basedOn w:val="Normal"/>
     <w:next w:val="Normal"/>
@@ -5324,7 +5395,7 @@
       <w:szCs w:val="28"/>
     </w:rPr>
   </w:style>
-  <w:style w:type="paragraph" w:styleId="Ttulo4">
+  <w:style w:type="paragraph" w:styleId="Heading4">
     <w:name w:val="heading 4"/>
     <w:basedOn w:val="Normal"/>
     <w:next w:val="Normal"/>
@@ -5344,7 +5415,7 @@
       <w:color w:val="0F4761"/>
     </w:rPr>
   </w:style>
-  <w:style w:type="paragraph" w:styleId="Ttulo5">
+  <w:style w:type="paragraph" w:styleId="Heading5">
     <w:name w:val="heading 5"/>
     <w:basedOn w:val="Normal"/>
     <w:next w:val="Normal"/>
@@ -5362,7 +5433,7 @@
       <w:color w:val="0F4761"/>
     </w:rPr>
   </w:style>
-  <w:style w:type="paragraph" w:styleId="Ttulo6">
+  <w:style w:type="paragraph" w:styleId="Heading6">
     <w:name w:val="heading 6"/>
     <w:basedOn w:val="Normal"/>
     <w:next w:val="Normal"/>
@@ -5382,11 +5453,11 @@
       <w:color w:val="595959"/>
     </w:rPr>
   </w:style>
-  <w:style w:type="paragraph" w:styleId="Ttulo7">
+  <w:style w:type="paragraph" w:styleId="Heading7">
     <w:name w:val="heading 7"/>
     <w:basedOn w:val="Normal"/>
     <w:next w:val="Normal"/>
-    <w:link w:val="Ttulo7Car"/>
+    <w:link w:val="Heading7Char"/>
     <w:uiPriority w:val="9"/>
     <w:semiHidden/>
     <w:unhideWhenUsed/>
@@ -5403,11 +5474,11 @@
       <w:color w:val="595959" w:themeColor="text1" w:themeTint="A6"/>
     </w:rPr>
   </w:style>
-  <w:style w:type="paragraph" w:styleId="Ttulo8">
+  <w:style w:type="paragraph" w:styleId="Heading8">
     <w:name w:val="heading 8"/>
     <w:basedOn w:val="Normal"/>
     <w:next w:val="Normal"/>
-    <w:link w:val="Ttulo8Car"/>
+    <w:link w:val="Heading8Char"/>
     <w:uiPriority w:val="9"/>
     <w:semiHidden/>
     <w:unhideWhenUsed/>
@@ -5426,11 +5497,11 @@
       <w:color w:val="272727" w:themeColor="text1" w:themeTint="D8"/>
     </w:rPr>
   </w:style>
-  <w:style w:type="paragraph" w:styleId="Ttulo9">
+  <w:style w:type="paragraph" w:styleId="Heading9">
     <w:name w:val="heading 9"/>
     <w:basedOn w:val="Normal"/>
     <w:next w:val="Normal"/>
-    <w:link w:val="Ttulo9Car"/>
+    <w:link w:val="Heading9Char"/>
     <w:uiPriority w:val="9"/>
     <w:semiHidden/>
     <w:unhideWhenUsed/>
@@ -5447,12 +5518,13 @@
       <w:color w:val="272727" w:themeColor="text1" w:themeTint="D8"/>
     </w:rPr>
   </w:style>
-  <w:style w:type="character" w:default="1" w:styleId="Fuentedeprrafopredeter">
+  <w:style w:type="character" w:default="1" w:styleId="DefaultParagraphFont">
     <w:name w:val="Default Paragraph Font"/>
     <w:uiPriority w:val="1"/>
+    <w:semiHidden/>
     <w:unhideWhenUsed/>
   </w:style>
-  <w:style w:type="table" w:default="1" w:styleId="Tablanormal">
+  <w:style w:type="table" w:default="1" w:styleId="TableNormal">
     <w:name w:val="Normal Table"/>
     <w:uiPriority w:val="99"/>
     <w:semiHidden/>
@@ -5467,13 +5539,13 @@
       </w:tblCellMar>
     </w:tblPr>
   </w:style>
-  <w:style w:type="numbering" w:default="1" w:styleId="Sinlista">
+  <w:style w:type="numbering" w:default="1" w:styleId="NoList">
     <w:name w:val="No List"/>
     <w:uiPriority w:val="99"/>
     <w:semiHidden/>
     <w:unhideWhenUsed/>
   </w:style>
-  <w:style w:type="table" w:customStyle="1" w:styleId="TableNormal">
+  <w:style w:type="table" w:customStyle="1" w:styleId="TableNormal0">
     <w:name w:val="TableNormal"/>
     <w:tblPr>
       <w:tblCellMar>
@@ -5484,7 +5556,7 @@
       </w:tblCellMar>
     </w:tblPr>
   </w:style>
-  <w:style w:type="paragraph" w:styleId="Ttulo">
+  <w:style w:type="paragraph" w:styleId="Title">
     <w:name w:val="Title"/>
     <w:basedOn w:val="Normal"/>
     <w:next w:val="Normal"/>
@@ -5501,7 +5573,7 @@
   </w:style>
   <w:style w:type="character" w:customStyle="1" w:styleId="Ttulo1Car">
     <w:name w:val="Título 1 Car"/>
-    <w:basedOn w:val="Fuentedeprrafopredeter"/>
+    <w:basedOn w:val="DefaultParagraphFont"/>
     <w:uiPriority w:val="9"/>
     <w:rsid w:val="003602D8"/>
     <w:rPr>
@@ -5513,7 +5585,7 @@
   </w:style>
   <w:style w:type="character" w:customStyle="1" w:styleId="Ttulo2Car">
     <w:name w:val="Título 2 Car"/>
-    <w:basedOn w:val="Fuentedeprrafopredeter"/>
+    <w:basedOn w:val="DefaultParagraphFont"/>
     <w:uiPriority w:val="9"/>
     <w:semiHidden/>
     <w:rsid w:val="003602D8"/>
@@ -5526,7 +5598,7 @@
   </w:style>
   <w:style w:type="character" w:customStyle="1" w:styleId="Ttulo3Car">
     <w:name w:val="Título 3 Car"/>
-    <w:basedOn w:val="Fuentedeprrafopredeter"/>
+    <w:basedOn w:val="DefaultParagraphFont"/>
     <w:uiPriority w:val="9"/>
     <w:semiHidden/>
     <w:rsid w:val="003602D8"/>
@@ -5539,7 +5611,7 @@
   </w:style>
   <w:style w:type="character" w:customStyle="1" w:styleId="Ttulo4Car">
     <w:name w:val="Título 4 Car"/>
-    <w:basedOn w:val="Fuentedeprrafopredeter"/>
+    <w:basedOn w:val="DefaultParagraphFont"/>
     <w:uiPriority w:val="9"/>
     <w:semiHidden/>
     <w:rsid w:val="003602D8"/>
@@ -5552,7 +5624,7 @@
   </w:style>
   <w:style w:type="character" w:customStyle="1" w:styleId="Ttulo5Car">
     <w:name w:val="Título 5 Car"/>
-    <w:basedOn w:val="Fuentedeprrafopredeter"/>
+    <w:basedOn w:val="DefaultParagraphFont"/>
     <w:uiPriority w:val="9"/>
     <w:semiHidden/>
     <w:rsid w:val="003602D8"/>
@@ -5563,7 +5635,7 @@
   </w:style>
   <w:style w:type="character" w:customStyle="1" w:styleId="Ttulo6Car">
     <w:name w:val="Título 6 Car"/>
-    <w:basedOn w:val="Fuentedeprrafopredeter"/>
+    <w:basedOn w:val="DefaultParagraphFont"/>
     <w:uiPriority w:val="9"/>
     <w:semiHidden/>
     <w:rsid w:val="003602D8"/>
@@ -5574,10 +5646,10 @@
       <w:color w:val="595959" w:themeColor="text1" w:themeTint="A6"/>
     </w:rPr>
   </w:style>
-  <w:style w:type="character" w:customStyle="1" w:styleId="Ttulo7Car">
-    <w:name w:val="Título 7 Car"/>
-    <w:basedOn w:val="Fuentedeprrafopredeter"/>
-    <w:link w:val="Ttulo7"/>
+  <w:style w:type="character" w:customStyle="1" w:styleId="Heading7Char">
+    <w:name w:val="Heading 7 Char"/>
+    <w:basedOn w:val="DefaultParagraphFont"/>
+    <w:link w:val="Heading7"/>
     <w:uiPriority w:val="9"/>
     <w:semiHidden/>
     <w:rsid w:val="003602D8"/>
@@ -5586,10 +5658,10 @@
       <w:color w:val="595959" w:themeColor="text1" w:themeTint="A6"/>
     </w:rPr>
   </w:style>
-  <w:style w:type="character" w:customStyle="1" w:styleId="Ttulo8Car">
-    <w:name w:val="Título 8 Car"/>
-    <w:basedOn w:val="Fuentedeprrafopredeter"/>
-    <w:link w:val="Ttulo8"/>
+  <w:style w:type="character" w:customStyle="1" w:styleId="Heading8Char">
+    <w:name w:val="Heading 8 Char"/>
+    <w:basedOn w:val="DefaultParagraphFont"/>
+    <w:link w:val="Heading8"/>
     <w:uiPriority w:val="9"/>
     <w:semiHidden/>
     <w:rsid w:val="003602D8"/>
@@ -5600,10 +5672,10 @@
       <w:color w:val="272727" w:themeColor="text1" w:themeTint="D8"/>
     </w:rPr>
   </w:style>
-  <w:style w:type="character" w:customStyle="1" w:styleId="Ttulo9Car">
-    <w:name w:val="Título 9 Car"/>
-    <w:basedOn w:val="Fuentedeprrafopredeter"/>
-    <w:link w:val="Ttulo9"/>
+  <w:style w:type="character" w:customStyle="1" w:styleId="Heading9Char">
+    <w:name w:val="Heading 9 Char"/>
+    <w:basedOn w:val="DefaultParagraphFont"/>
+    <w:link w:val="Heading9"/>
     <w:uiPriority w:val="9"/>
     <w:semiHidden/>
     <w:rsid w:val="003602D8"/>
@@ -5614,7 +5686,7 @@
   </w:style>
   <w:style w:type="character" w:customStyle="1" w:styleId="TtuloCar">
     <w:name w:val="Título Car"/>
-    <w:basedOn w:val="Fuentedeprrafopredeter"/>
+    <w:basedOn w:val="DefaultParagraphFont"/>
     <w:uiPriority w:val="10"/>
     <w:rsid w:val="003602D8"/>
     <w:rPr>
@@ -5627,7 +5699,7 @@
   </w:style>
   <w:style w:type="character" w:customStyle="1" w:styleId="SubttuloCar">
     <w:name w:val="Subtítulo Car"/>
-    <w:basedOn w:val="Fuentedeprrafopredeter"/>
+    <w:basedOn w:val="DefaultParagraphFont"/>
     <w:uiPriority w:val="11"/>
     <w:rsid w:val="003602D8"/>
     <w:rPr>
@@ -5638,11 +5710,11 @@
       <w:szCs w:val="28"/>
     </w:rPr>
   </w:style>
-  <w:style w:type="paragraph" w:styleId="Cita">
+  <w:style w:type="paragraph" w:styleId="Quote">
     <w:name w:val="Quote"/>
     <w:basedOn w:val="Normal"/>
     <w:next w:val="Normal"/>
-    <w:link w:val="CitaCar"/>
+    <w:link w:val="QuoteChar"/>
     <w:uiPriority w:val="29"/>
     <w:qFormat/>
     <w:rsid w:val="003602D8"/>
@@ -5656,10 +5728,10 @@
       <w:color w:val="404040" w:themeColor="text1" w:themeTint="BF"/>
     </w:rPr>
   </w:style>
-  <w:style w:type="character" w:customStyle="1" w:styleId="CitaCar">
-    <w:name w:val="Cita Car"/>
-    <w:basedOn w:val="Fuentedeprrafopredeter"/>
-    <w:link w:val="Cita"/>
+  <w:style w:type="character" w:customStyle="1" w:styleId="QuoteChar">
+    <w:name w:val="Quote Char"/>
+    <w:basedOn w:val="DefaultParagraphFont"/>
+    <w:link w:val="Quote"/>
     <w:uiPriority w:val="29"/>
     <w:rsid w:val="003602D8"/>
     <w:rPr>
@@ -5668,7 +5740,7 @@
       <w:color w:val="404040" w:themeColor="text1" w:themeTint="BF"/>
     </w:rPr>
   </w:style>
-  <w:style w:type="paragraph" w:styleId="Prrafodelista">
+  <w:style w:type="paragraph" w:styleId="ListParagraph">
     <w:name w:val="List Paragraph"/>
     <w:basedOn w:val="Normal"/>
     <w:uiPriority w:val="34"/>
@@ -5679,9 +5751,9 @@
       <w:contextualSpacing/>
     </w:pPr>
   </w:style>
-  <w:style w:type="character" w:styleId="nfasisintenso">
+  <w:style w:type="character" w:styleId="IntenseEmphasis">
     <w:name w:val="Intense Emphasis"/>
-    <w:basedOn w:val="Fuentedeprrafopredeter"/>
+    <w:basedOn w:val="DefaultParagraphFont"/>
     <w:uiPriority w:val="21"/>
     <w:qFormat/>
     <w:rsid w:val="003602D8"/>
@@ -5691,11 +5763,11 @@
       <w:color w:val="0F4761" w:themeColor="accent1" w:themeShade="BF"/>
     </w:rPr>
   </w:style>
-  <w:style w:type="paragraph" w:styleId="Citadestacada">
+  <w:style w:type="paragraph" w:styleId="IntenseQuote">
     <w:name w:val="Intense Quote"/>
     <w:basedOn w:val="Normal"/>
     <w:next w:val="Normal"/>
-    <w:link w:val="CitadestacadaCar"/>
+    <w:link w:val="IntenseQuoteChar"/>
     <w:uiPriority w:val="30"/>
     <w:qFormat/>
     <w:rsid w:val="003602D8"/>
@@ -5714,10 +5786,10 @@
       <w:color w:val="0F4761" w:themeColor="accent1" w:themeShade="BF"/>
     </w:rPr>
   </w:style>
-  <w:style w:type="character" w:customStyle="1" w:styleId="CitadestacadaCar">
-    <w:name w:val="Cita destacada Car"/>
-    <w:basedOn w:val="Fuentedeprrafopredeter"/>
-    <w:link w:val="Citadestacada"/>
+  <w:style w:type="character" w:customStyle="1" w:styleId="IntenseQuoteChar">
+    <w:name w:val="Intense Quote Char"/>
+    <w:basedOn w:val="DefaultParagraphFont"/>
+    <w:link w:val="IntenseQuote"/>
     <w:uiPriority w:val="30"/>
     <w:rsid w:val="003602D8"/>
     <w:rPr>
@@ -5726,9 +5798,9 @@
       <w:color w:val="0F4761" w:themeColor="accent1" w:themeShade="BF"/>
     </w:rPr>
   </w:style>
-  <w:style w:type="character" w:styleId="Referenciaintensa">
+  <w:style w:type="character" w:styleId="IntenseReference">
     <w:name w:val="Intense Reference"/>
-    <w:basedOn w:val="Fuentedeprrafopredeter"/>
+    <w:basedOn w:val="DefaultParagraphFont"/>
     <w:uiPriority w:val="32"/>
     <w:qFormat/>
     <w:rsid w:val="003602D8"/>
@@ -5740,7 +5812,7 @@
       <w:spacing w:val="5"/>
     </w:rPr>
   </w:style>
-  <w:style w:type="paragraph" w:styleId="Subttulo">
+  <w:style w:type="paragraph" w:styleId="Subtitle">
     <w:name w:val="Subtitle"/>
     <w:basedOn w:val="Normal"/>
     <w:next w:val="Normal"/>
@@ -5752,9 +5824,9 @@
       <w:szCs w:val="28"/>
     </w:rPr>
   </w:style>
-  <w:style w:type="character" w:styleId="Hipervnculo">
+  <w:style w:type="character" w:styleId="Hyperlink">
     <w:name w:val="Hyperlink"/>
-    <w:basedOn w:val="Fuentedeprrafopredeter"/>
+    <w:basedOn w:val="DefaultParagraphFont"/>
     <w:uiPriority w:val="99"/>
     <w:unhideWhenUsed/>
     <w:rsid w:val="000A33BC"/>
@@ -5763,9 +5835,9 @@
       <w:u w:val="single"/>
     </w:rPr>
   </w:style>
-  <w:style w:type="character" w:styleId="Mencinsinresolver">
+  <w:style w:type="character" w:styleId="UnresolvedMention">
     <w:name w:val="Unresolved Mention"/>
-    <w:basedOn w:val="Fuentedeprrafopredeter"/>
+    <w:basedOn w:val="DefaultParagraphFont"/>
     <w:uiPriority w:val="99"/>
     <w:semiHidden/>
     <w:unhideWhenUsed/>
@@ -5775,9 +5847,9 @@
       <w:shd w:val="clear" w:color="auto" w:fill="E1DFDD"/>
     </w:rPr>
   </w:style>
-  <w:style w:type="paragraph" w:styleId="TtuloTDC">
+  <w:style w:type="paragraph" w:styleId="TOCHeading">
     <w:name w:val="TOC Heading"/>
-    <w:basedOn w:val="Ttulo1"/>
+    <w:basedOn w:val="Heading1"/>
     <w:next w:val="Normal"/>
     <w:uiPriority w:val="39"/>
     <w:unhideWhenUsed/>
@@ -5796,7 +5868,7 @@
       <w:szCs w:val="32"/>
     </w:rPr>
   </w:style>
-  <w:style w:type="paragraph" w:styleId="TDC1">
+  <w:style w:type="paragraph" w:styleId="TOC1">
     <w:name w:val="toc 1"/>
     <w:basedOn w:val="Normal"/>
     <w:next w:val="Normal"/>
@@ -5808,7 +5880,7 @@
       <w:spacing w:after="100"/>
     </w:pPr>
   </w:style>
-  <w:style w:type="paragraph" w:styleId="TDC2">
+  <w:style w:type="paragraph" w:styleId="TOC2">
     <w:name w:val="toc 2"/>
     <w:basedOn w:val="Normal"/>
     <w:next w:val="Normal"/>
@@ -5821,10 +5893,10 @@
       <w:ind w:left="240"/>
     </w:pPr>
   </w:style>
-  <w:style w:type="paragraph" w:styleId="Encabezado">
+  <w:style w:type="paragraph" w:styleId="Header">
     <w:name w:val="header"/>
     <w:basedOn w:val="Normal"/>
-    <w:link w:val="EncabezadoCar"/>
+    <w:link w:val="HeaderChar"/>
     <w:uiPriority w:val="99"/>
     <w:unhideWhenUsed/>
     <w:rsid w:val="000A33BC"/>
@@ -5836,17 +5908,17 @@
       <w:spacing w:after="0" w:line="240" w:lineRule="auto"/>
     </w:pPr>
   </w:style>
-  <w:style w:type="character" w:customStyle="1" w:styleId="EncabezadoCar">
-    <w:name w:val="Encabezado Car"/>
-    <w:basedOn w:val="Fuentedeprrafopredeter"/>
-    <w:link w:val="Encabezado"/>
+  <w:style w:type="character" w:customStyle="1" w:styleId="HeaderChar">
+    <w:name w:val="Header Char"/>
+    <w:basedOn w:val="DefaultParagraphFont"/>
+    <w:link w:val="Header"/>
     <w:uiPriority w:val="99"/>
     <w:rsid w:val="000A33BC"/>
   </w:style>
-  <w:style w:type="paragraph" w:styleId="Piedepgina">
+  <w:style w:type="paragraph" w:styleId="Footer">
     <w:name w:val="footer"/>
     <w:basedOn w:val="Normal"/>
-    <w:link w:val="PiedepginaCar"/>
+    <w:link w:val="FooterChar"/>
     <w:uiPriority w:val="99"/>
     <w:unhideWhenUsed/>
     <w:rsid w:val="000A33BC"/>
@@ -5858,14 +5930,14 @@
       <w:spacing w:after="0" w:line="240" w:lineRule="auto"/>
     </w:pPr>
   </w:style>
-  <w:style w:type="character" w:customStyle="1" w:styleId="PiedepginaCar">
-    <w:name w:val="Pie de página Car"/>
-    <w:basedOn w:val="Fuentedeprrafopredeter"/>
-    <w:link w:val="Piedepgina"/>
+  <w:style w:type="character" w:customStyle="1" w:styleId="FooterChar">
+    <w:name w:val="Footer Char"/>
+    <w:basedOn w:val="DefaultParagraphFont"/>
+    <w:link w:val="Footer"/>
     <w:uiPriority w:val="99"/>
     <w:rsid w:val="000A33BC"/>
   </w:style>
-  <w:style w:type="paragraph" w:styleId="Descripcin">
+  <w:style w:type="paragraph" w:styleId="Caption">
     <w:name w:val="caption"/>
     <w:basedOn w:val="Normal"/>
     <w:next w:val="Normal"/>
@@ -5884,7 +5956,7 @@
       <w:szCs w:val="18"/>
     </w:rPr>
   </w:style>
-  <w:style w:type="paragraph" w:styleId="Tabladeilustraciones">
+  <w:style w:type="paragraph" w:styleId="TableofFigures">
     <w:name w:val="table of figures"/>
     <w:basedOn w:val="Normal"/>
     <w:next w:val="Normal"/>

</xml_diff>

<commit_message>
Modifica los analisis finales de los skeolders, para contemplar sus necesidades
</commit_message>
<xml_diff>
--- a/docs/Documento escrito.docx
+++ b/docs/Documento escrito.docx
@@ -322,7 +322,7 @@
       <w:sdtContent>
         <w:p>
           <w:pPr>
-            <w:pStyle w:val="TOCHeading"/>
+            <w:pStyle w:val="TtuloTDC"/>
             <w:rPr>
               <w:sz w:val="22"/>
               <w:szCs w:val="22"/>
@@ -331,7 +331,7 @@
         </w:p>
         <w:p>
           <w:pPr>
-            <w:pStyle w:val="TOC1"/>
+            <w:pStyle w:val="TDC1"/>
             <w:tabs>
               <w:tab w:val="right" w:leader="dot" w:pos="8828"/>
             </w:tabs>
@@ -369,7 +369,7 @@
           <w:hyperlink w:anchor="_Toc243403960" w:history="1">
             <w:r>
               <w:rPr>
-                <w:rStyle w:val="Hyperlink"/>
+                <w:rStyle w:val="Hipervnculo"/>
                 <w:rFonts w:cs="Times New Roman"/>
                 <w:noProof/>
               </w:rPr>
@@ -427,7 +427,7 @@
         </w:p>
         <w:p>
           <w:pPr>
-            <w:pStyle w:val="TOC1"/>
+            <w:pStyle w:val="TDC1"/>
             <w:tabs>
               <w:tab w:val="right" w:leader="dot" w:pos="8828"/>
             </w:tabs>
@@ -441,7 +441,7 @@
           <w:hyperlink w:anchor="_Toc243403961" w:history="1">
             <w:r>
               <w:rPr>
-                <w:rStyle w:val="Hyperlink"/>
+                <w:rStyle w:val="Hipervnculo"/>
                 <w:noProof/>
               </w:rPr>
               <w:t>Introducción</w:t>
@@ -498,7 +498,7 @@
         </w:p>
         <w:p>
           <w:pPr>
-            <w:pStyle w:val="TOC1"/>
+            <w:pStyle w:val="TDC1"/>
             <w:tabs>
               <w:tab w:val="right" w:leader="dot" w:pos="8828"/>
             </w:tabs>
@@ -512,7 +512,7 @@
           <w:hyperlink w:anchor="_Toc243403962" w:history="1">
             <w:r>
               <w:rPr>
-                <w:rStyle w:val="Hyperlink"/>
+                <w:rStyle w:val="Hipervnculo"/>
                 <w:noProof/>
               </w:rPr>
               <w:t>Enlace al repositorio de Git</w:t>
@@ -569,7 +569,7 @@
         </w:p>
         <w:p>
           <w:pPr>
-            <w:pStyle w:val="TOC1"/>
+            <w:pStyle w:val="TDC1"/>
             <w:tabs>
               <w:tab w:val="right" w:leader="dot" w:pos="8828"/>
             </w:tabs>
@@ -583,7 +583,7 @@
           <w:hyperlink w:anchor="_Toc243403963" w:history="1">
             <w:r>
               <w:rPr>
-                <w:rStyle w:val="Hyperlink"/>
+                <w:rStyle w:val="Hipervnculo"/>
                 <w:noProof/>
               </w:rPr>
               <w:t>Enunciado del problema</w:t>
@@ -640,7 +640,7 @@
         </w:p>
         <w:p>
           <w:pPr>
-            <w:pStyle w:val="TOC1"/>
+            <w:pStyle w:val="TDC1"/>
             <w:tabs>
               <w:tab w:val="right" w:leader="dot" w:pos="8828"/>
             </w:tabs>
@@ -654,7 +654,7 @@
           <w:hyperlink w:anchor="_Toc243403964" w:history="1">
             <w:r>
               <w:rPr>
-                <w:rStyle w:val="Hyperlink"/>
+                <w:rStyle w:val="Hipervnculo"/>
                 <w:noProof/>
               </w:rPr>
               <w:t>Objetivos</w:t>
@@ -711,7 +711,7 @@
         </w:p>
         <w:p>
           <w:pPr>
-            <w:pStyle w:val="TOC2"/>
+            <w:pStyle w:val="TDC2"/>
             <w:tabs>
               <w:tab w:val="right" w:leader="dot" w:pos="8828"/>
             </w:tabs>
@@ -725,7 +725,7 @@
           <w:hyperlink w:anchor="_Toc243403965" w:history="1">
             <w:r>
               <w:rPr>
-                <w:rStyle w:val="Hyperlink"/>
+                <w:rStyle w:val="Hipervnculo"/>
                 <w:noProof/>
               </w:rPr>
               <w:t>Objetivo General</w:t>
@@ -782,7 +782,7 @@
         </w:p>
         <w:p>
           <w:pPr>
-            <w:pStyle w:val="TOC2"/>
+            <w:pStyle w:val="TDC2"/>
             <w:tabs>
               <w:tab w:val="right" w:leader="dot" w:pos="8828"/>
             </w:tabs>
@@ -796,7 +796,7 @@
           <w:hyperlink w:anchor="_Toc243403966" w:history="1">
             <w:r>
               <w:rPr>
-                <w:rStyle w:val="Hyperlink"/>
+                <w:rStyle w:val="Hipervnculo"/>
                 <w:noProof/>
               </w:rPr>
               <w:t>Objetivos Específicos</w:t>
@@ -853,7 +853,7 @@
         </w:p>
         <w:p>
           <w:pPr>
-            <w:pStyle w:val="TOC1"/>
+            <w:pStyle w:val="TDC1"/>
             <w:tabs>
               <w:tab w:val="right" w:leader="dot" w:pos="8828"/>
             </w:tabs>
@@ -867,7 +867,7 @@
           <w:hyperlink w:anchor="_Toc243403967" w:history="1">
             <w:r>
               <w:rPr>
-                <w:rStyle w:val="Hyperlink"/>
+                <w:rStyle w:val="Hipervnculo"/>
                 <w:noProof/>
               </w:rPr>
               <w:t>Identificación de stakeholders y necesidades de análisis</w:t>
@@ -924,7 +924,7 @@
         </w:p>
         <w:p>
           <w:pPr>
-            <w:pStyle w:val="TOC1"/>
+            <w:pStyle w:val="TDC1"/>
             <w:tabs>
               <w:tab w:val="right" w:leader="dot" w:pos="8828"/>
             </w:tabs>
@@ -938,7 +938,7 @@
           <w:hyperlink w:anchor="_Toc243403968" w:history="1">
             <w:r>
               <w:rPr>
-                <w:rStyle w:val="Hyperlink"/>
+                <w:rStyle w:val="Hipervnculo"/>
                 <w:noProof/>
               </w:rPr>
               <w:t>Descripción de la solución</w:t>
@@ -995,7 +995,7 @@
         </w:p>
         <w:p>
           <w:pPr>
-            <w:pStyle w:val="TOC1"/>
+            <w:pStyle w:val="TDC1"/>
             <w:tabs>
               <w:tab w:val="right" w:leader="dot" w:pos="8828"/>
             </w:tabs>
@@ -1009,7 +1009,7 @@
           <w:hyperlink w:anchor="_Toc243403969" w:history="1">
             <w:r>
               <w:rPr>
-                <w:rStyle w:val="Hyperlink"/>
+                <w:rStyle w:val="Hipervnculo"/>
                 <w:noProof/>
               </w:rPr>
               <w:t>Diagrama del Modelo Dimensional (Esquema Estrella o Copo de Nieve)</w:t>
@@ -1066,7 +1066,7 @@
         </w:p>
         <w:p>
           <w:pPr>
-            <w:pStyle w:val="TOC1"/>
+            <w:pStyle w:val="TDC1"/>
             <w:tabs>
               <w:tab w:val="right" w:leader="dot" w:pos="8828"/>
             </w:tabs>
@@ -1080,7 +1080,7 @@
           <w:hyperlink w:anchor="_Toc243403970" w:history="1">
             <w:r>
               <w:rPr>
-                <w:rStyle w:val="Hyperlink"/>
+                <w:rStyle w:val="Hipervnculo"/>
                 <w:noProof/>
               </w:rPr>
               <w:t>Conclusión</w:t>
@@ -1137,7 +1137,7 @@
         </w:p>
         <w:p>
           <w:pPr>
-            <w:pStyle w:val="TOC1"/>
+            <w:pStyle w:val="TDC1"/>
             <w:tabs>
               <w:tab w:val="right" w:leader="dot" w:pos="8828"/>
             </w:tabs>
@@ -1151,7 +1151,7 @@
           <w:hyperlink w:anchor="_Toc243403971" w:history="1">
             <w:r>
               <w:rPr>
-                <w:rStyle w:val="Hyperlink"/>
+                <w:rStyle w:val="Hipervnculo"/>
                 <w:noProof/>
               </w:rPr>
               <w:t>Bibliografía</w:t>
@@ -1232,7 +1232,7 @@
     </w:p>
     <w:p>
       <w:pPr>
-        <w:pStyle w:val="Heading1"/>
+        <w:pStyle w:val="Ttulo1"/>
         <w:rPr>
           <w:rFonts w:cs="Times New Roman"/>
           <w:sz w:val="22"/>
@@ -1264,7 +1264,7 @@
     </w:p>
     <w:p>
       <w:pPr>
-        <w:pStyle w:val="TableofFigures"/>
+        <w:pStyle w:val="Tabladeilustraciones"/>
         <w:tabs>
           <w:tab w:val="left" w:pos="1200"/>
           <w:tab w:val="right" w:leader="dot" w:pos="8828"/>
@@ -1311,7 +1311,7 @@
       <w:hyperlink w:anchor="_Toc243396385" w:history="1">
         <w:r>
           <w:rPr>
-            <w:rStyle w:val="Hyperlink"/>
+            <w:rStyle w:val="Hipervnculo"/>
             <w:rFonts w:ascii="Times New Roman" w:eastAsiaTheme="minorHAnsi" w:hAnsi="Times New Roman" w:cs="Times New Roman"/>
             <w:b/>
             <w:bCs/>
@@ -1335,7 +1335,7 @@
         </w:r>
         <w:r>
           <w:rPr>
-            <w:rStyle w:val="Hyperlink"/>
+            <w:rStyle w:val="Hipervnculo"/>
             <w:rFonts w:ascii="Times New Roman" w:eastAsiaTheme="minorHAnsi" w:hAnsi="Times New Roman" w:cs="Times New Roman"/>
             <w:b/>
             <w:bCs/>
@@ -1348,7 +1348,7 @@
         </w:r>
         <w:r>
           <w:rPr>
-            <w:rStyle w:val="Hyperlink"/>
+            <w:rStyle w:val="Hipervnculo"/>
             <w:rFonts w:ascii="Times New Roman" w:eastAsiaTheme="minorHAnsi" w:hAnsi="Times New Roman" w:cs="Times New Roman"/>
             <w:noProof/>
             <w:sz w:val="22"/>
@@ -1514,7 +1514,7 @@
     </w:p>
     <w:p>
       <w:pPr>
-        <w:pStyle w:val="Heading1"/>
+        <w:pStyle w:val="Ttulo1"/>
       </w:pPr>
       <w:bookmarkStart w:id="3" w:name="_Toc243403961"/>
       <w:r>
@@ -1645,7 +1645,7 @@
     </w:p>
     <w:p>
       <w:pPr>
-        <w:pStyle w:val="Heading1"/>
+        <w:pStyle w:val="Ttulo1"/>
       </w:pPr>
       <w:bookmarkStart w:id="4" w:name="_Toc243403962"/>
       <w:r>
@@ -1877,7 +1877,7 @@
     </w:p>
     <w:p>
       <w:pPr>
-        <w:pStyle w:val="Heading1"/>
+        <w:pStyle w:val="Ttulo1"/>
         <w:rPr>
           <w:szCs w:val="24"/>
         </w:rPr>
@@ -1886,7 +1886,7 @@
     <w:p/>
     <w:p>
       <w:pPr>
-        <w:pStyle w:val="Heading1"/>
+        <w:pStyle w:val="Ttulo1"/>
         <w:rPr>
           <w:szCs w:val="24"/>
         </w:rPr>
@@ -1953,25 +1953,7 @@
           <w:sz w:val="22"/>
           <w:szCs w:val="22"/>
         </w:rPr>
-        <w:t xml:space="preserve"> S.A. como organización del sector de supermercados y consumo masivo enfrenta el reto de gestionar y procesar grandes volúmenes de información fragmentada en múltiples archivos CSV. La </w:t>
-      </w:r>
-      <w:proofErr w:type="gramStart"/>
-      <w:r>
-        <w:rPr>
-          <w:rFonts w:ascii="Times New Roman" w:eastAsia="Times New Roman" w:hAnsi="Times New Roman" w:cs="Times New Roman"/>
-          <w:sz w:val="22"/>
-          <w:szCs w:val="22"/>
-        </w:rPr>
-        <w:t>cual</w:t>
-      </w:r>
-      <w:proofErr w:type="gramEnd"/>
-      <w:r>
-        <w:rPr>
-          <w:rFonts w:ascii="Times New Roman" w:eastAsia="Times New Roman" w:hAnsi="Times New Roman" w:cs="Times New Roman"/>
-          <w:sz w:val="22"/>
-          <w:szCs w:val="22"/>
-        </w:rPr>
-        <w:t xml:space="preserve"> mediante una revisión, se detectaron deficiencias críticas en la estructura y calidad de los datos:</w:t>
+        <w:t xml:space="preserve"> S.A. como organización del sector de supermercados y consumo masivo enfrenta el reto de gestionar y procesar grandes volúmenes de información fragmentada en múltiples archivos CSV. La cual mediante una revisión, se detectaron deficiencias críticas en la estructura y calidad de los datos:</w:t>
       </w:r>
     </w:p>
     <w:p>
@@ -2178,7 +2160,7 @@
     </w:p>
     <w:p>
       <w:pPr>
-        <w:pStyle w:val="Heading1"/>
+        <w:pStyle w:val="Ttulo1"/>
       </w:pPr>
       <w:bookmarkStart w:id="6" w:name="_Toc243403964"/>
       <w:r>
@@ -2189,7 +2171,7 @@
     </w:p>
     <w:p>
       <w:pPr>
-        <w:pStyle w:val="Heading2"/>
+        <w:pStyle w:val="Ttulo2"/>
         <w:rPr>
           <w:sz w:val="22"/>
           <w:szCs w:val="22"/>
@@ -2273,7 +2255,7 @@
     </w:p>
     <w:p>
       <w:pPr>
-        <w:pStyle w:val="Heading2"/>
+        <w:pStyle w:val="Ttulo2"/>
         <w:rPr>
           <w:sz w:val="22"/>
           <w:szCs w:val="22"/>
@@ -2305,7 +2287,7 @@
     </w:p>
     <w:p>
       <w:pPr>
-        <w:pStyle w:val="ListParagraph"/>
+        <w:pStyle w:val="Prrafodelista"/>
         <w:numPr>
           <w:ilvl w:val="0"/>
           <w:numId w:val="3"/>
@@ -2328,7 +2310,7 @@
     </w:p>
     <w:p>
       <w:pPr>
-        <w:pStyle w:val="ListParagraph"/>
+        <w:pStyle w:val="Prrafodelista"/>
         <w:numPr>
           <w:ilvl w:val="0"/>
           <w:numId w:val="3"/>
@@ -2395,7 +2377,7 @@
     </w:p>
     <w:p>
       <w:pPr>
-        <w:pStyle w:val="Heading1"/>
+        <w:pStyle w:val="Ttulo1"/>
         <w:rPr>
           <w:sz w:val="22"/>
           <w:szCs w:val="22"/>
@@ -2427,7 +2409,7 @@
           <w:sz w:val="22"/>
           <w:szCs w:val="22"/>
         </w:rPr>
-        <w:t xml:space="preserve">Para el desarrollo del Data </w:t>
+        <w:t xml:space="preserve">Para el desarrollo del Data Warehouse de </w:t>
       </w:r>
       <w:proofErr w:type="spellStart"/>
       <w:r>
@@ -2436,7 +2418,7 @@
           <w:sz w:val="22"/>
           <w:szCs w:val="22"/>
         </w:rPr>
-        <w:t>Warehouse</w:t>
+        <w:t>Invacom</w:t>
       </w:r>
       <w:proofErr w:type="spellEnd"/>
       <w:r>
@@ -2445,30 +2427,12 @@
           <w:sz w:val="22"/>
           <w:szCs w:val="22"/>
         </w:rPr>
-        <w:t xml:space="preserve"> de </w:t>
-      </w:r>
-      <w:proofErr w:type="spellStart"/>
-      <w:r>
-        <w:rPr>
-          <w:rFonts w:ascii="Times New Roman" w:eastAsia="Times New Roman" w:hAnsi="Times New Roman" w:cs="Times New Roman"/>
-          <w:sz w:val="22"/>
-          <w:szCs w:val="22"/>
-        </w:rPr>
-        <w:t>Invacom</w:t>
-      </w:r>
-      <w:proofErr w:type="spellEnd"/>
-      <w:r>
-        <w:rPr>
-          <w:rFonts w:ascii="Times New Roman" w:eastAsia="Times New Roman" w:hAnsi="Times New Roman" w:cs="Times New Roman"/>
-          <w:sz w:val="22"/>
-          <w:szCs w:val="22"/>
-        </w:rPr>
         <w:t xml:space="preserve"> Inc. S.A., se identifican los principales interesados y sus necesidades de información. A partir de estas necesidades, se proponen consultas para analizar las ventas, los productos, las campañas, los cupones y el comportamiento de compra de los hogares.</w:t>
       </w:r>
     </w:p>
     <w:p>
       <w:pPr>
-        <w:pStyle w:val="Caption"/>
+        <w:pStyle w:val="Descripcin"/>
         <w:keepNext/>
         <w:rPr>
           <w:rFonts w:ascii="Times New Roman" w:eastAsiaTheme="minorHAnsi" w:hAnsi="Times New Roman" w:cs="Times New Roman"/>
@@ -2851,23 +2815,13 @@
                 <w:szCs w:val="22"/>
               </w:rPr>
             </w:pPr>
-            <w:proofErr w:type="gramStart"/>
             <w:r>
               <w:rPr>
                 <w:rFonts w:ascii="Times New Roman" w:eastAsia="Times New Roman" w:hAnsi="Times New Roman" w:cs="Times New Roman"/>
                 <w:sz w:val="22"/>
                 <w:szCs w:val="22"/>
               </w:rPr>
-              <w:t>Total</w:t>
-            </w:r>
-            <w:proofErr w:type="gramEnd"/>
-            <w:r>
-              <w:rPr>
-                <w:rFonts w:ascii="Times New Roman" w:eastAsia="Times New Roman" w:hAnsi="Times New Roman" w:cs="Times New Roman"/>
-                <w:sz w:val="22"/>
-                <w:szCs w:val="22"/>
-              </w:rPr>
-              <w:t xml:space="preserve"> de ventas por período; comparación de ventas entre tiendas; productos que generan mayores ingresos; ventas con y sin actividad promocional identificada.</w:t>
+              <w:t>Total de ventas por período; comparación de ventas entre tiendas; productos que generan mayores ingresos; ventas con y sin actividad promocional identificada.</w:t>
             </w:r>
           </w:p>
         </w:tc>
@@ -3138,7 +3092,7 @@
                 <w:sz w:val="22"/>
                 <w:szCs w:val="22"/>
               </w:rPr>
-              <w:t>Evaluar los descuentos y la actividad promocional relacionada con las ventas para identificar oportunidades de mejora.</w:t>
+              <w:t>Evaluar los descuentos y el comportamiento de compra según la actividad promocional identificada, la elegibilidad de productos para cupones de campañas vigentes y las redenciones registradas por hogar, sin atribuir un cupón específico a cada línea de venta.</w:t>
             </w:r>
           </w:p>
         </w:tc>
@@ -3170,7 +3124,7 @@
                 <w:sz w:val="22"/>
                 <w:szCs w:val="22"/>
               </w:rPr>
-              <w:t>Descuentos por producto y período; ventas de productos con actividad promocional; compras de hogares con redenciones registradas; ventas de productos asociados a cupones de campañas vigentes.</w:t>
+              <w:t>Descuentos totales y promedio por línea de compra, agrupados por producto, categoría, tienda y período; comparación de ventas y cantidades con y sin actividad promocional identificada, distinguiendo los casos sin cobertura; comparación del gasto de hogares con y sin redenciones registradas el mismo día de compra; ventas de productos elegibles para cupones de campañas vigentes frente a productos sin elegibilidad identificada.</w:t>
             </w:r>
           </w:p>
         </w:tc>
@@ -3334,6 +3288,7 @@
           <w:lang w:eastAsia="en-US"/>
           <w14:ligatures w14:val="standardContextual"/>
         </w:rPr>
+        <w:lastRenderedPageBreak/>
         <w:t>Estas necesidades permiten definir las medidas, dimensiones e indicadores comerciales del Data Warehouse, de acuerdo con la información disponible en las tablas de Dunnhumby.</w:t>
       </w:r>
     </w:p>
@@ -3353,7 +3308,7 @@
     </w:p>
     <w:p>
       <w:pPr>
-        <w:pStyle w:val="Heading1"/>
+        <w:pStyle w:val="Ttulo1"/>
         <w:rPr>
           <w:sz w:val="22"/>
           <w:szCs w:val="22"/>
@@ -3365,7 +3320,6 @@
           <w:sz w:val="22"/>
           <w:szCs w:val="22"/>
         </w:rPr>
-        <w:lastRenderedPageBreak/>
         <w:t>Descripción de la solución</w:t>
       </w:r>
       <w:bookmarkEnd w:id="11"/>
@@ -3489,80 +3443,16 @@
     </w:p>
     <w:p>
       <w:pPr>
-        <w:jc w:val="center"/>
-        <w:rPr>
-          <w:rFonts w:ascii="Times New Roman" w:eastAsia="Times New Roman" w:hAnsi="Times New Roman" w:cs="Times New Roman"/>
-          <w:b/>
-          <w:bCs/>
-        </w:rPr>
-      </w:pPr>
-    </w:p>
-    <w:p>
-      <w:pPr>
-        <w:rPr>
-          <w:rFonts w:ascii="Times New Roman" w:eastAsia="Times New Roman" w:hAnsi="Times New Roman" w:cs="Times New Roman"/>
-          <w:b/>
-          <w:bCs/>
-        </w:rPr>
-      </w:pPr>
-    </w:p>
-    <w:p>
-      <w:pPr>
-        <w:rPr>
-          <w:rFonts w:ascii="Times New Roman" w:eastAsia="Times New Roman" w:hAnsi="Times New Roman" w:cs="Times New Roman"/>
-          <w:b/>
-          <w:bCs/>
-        </w:rPr>
-      </w:pPr>
-    </w:p>
-    <w:p>
-      <w:pPr>
-        <w:rPr>
-          <w:rFonts w:ascii="Times New Roman" w:eastAsia="Times New Roman" w:hAnsi="Times New Roman" w:cs="Times New Roman"/>
-          <w:b/>
-          <w:bCs/>
-        </w:rPr>
-      </w:pPr>
-    </w:p>
-    <w:p>
-      <w:pPr>
-        <w:rPr>
-          <w:rFonts w:ascii="Times New Roman" w:eastAsia="Times New Roman" w:hAnsi="Times New Roman" w:cs="Times New Roman"/>
-          <w:b/>
-          <w:bCs/>
-        </w:rPr>
-      </w:pPr>
-    </w:p>
-    <w:p>
-      <w:pPr>
-        <w:rPr>
-          <w:rFonts w:ascii="Times New Roman" w:eastAsia="Times New Roman" w:hAnsi="Times New Roman" w:cs="Times New Roman"/>
-          <w:b/>
-          <w:bCs/>
-        </w:rPr>
-      </w:pPr>
-    </w:p>
-    <w:p>
-      <w:pPr>
-        <w:rPr>
-          <w:rFonts w:ascii="Times New Roman" w:eastAsia="Times New Roman" w:hAnsi="Times New Roman" w:cs="Times New Roman"/>
-          <w:b/>
-          <w:bCs/>
-        </w:rPr>
-      </w:pPr>
-    </w:p>
-    <w:p>
-      <w:pPr>
-        <w:rPr>
-          <w:rFonts w:ascii="Times New Roman" w:eastAsia="Times New Roman" w:hAnsi="Times New Roman" w:cs="Times New Roman"/>
-          <w:b/>
-          <w:bCs/>
-        </w:rPr>
-      </w:pPr>
-    </w:p>
-    <w:p>
-      <w:pPr>
-        <w:pStyle w:val="Heading1"/>
+        <w:rPr>
+          <w:rFonts w:ascii="Times New Roman" w:eastAsia="Times New Roman" w:hAnsi="Times New Roman" w:cs="Times New Roman"/>
+          <w:b/>
+          <w:bCs/>
+        </w:rPr>
+      </w:pPr>
+    </w:p>
+    <w:p>
+      <w:pPr>
+        <w:pStyle w:val="Ttulo1"/>
       </w:pPr>
       <w:bookmarkStart w:id="12" w:name="_Toc243403969"/>
       <w:r>
@@ -3571,7 +3461,6 @@
       </w:r>
       <w:bookmarkEnd w:id="12"/>
     </w:p>
-    <w:p/>
     <w:p>
       <w:pPr>
         <w:jc w:val="center"/>
@@ -3887,7 +3776,7 @@
     </w:p>
     <w:p>
       <w:pPr>
-        <w:pStyle w:val="Heading1"/>
+        <w:pStyle w:val="Ttulo1"/>
       </w:pPr>
       <w:bookmarkStart w:id="13" w:name="_Toc243403970"/>
       <w:r>
@@ -4157,7 +4046,7 @@
     </w:p>
     <w:p>
       <w:pPr>
-        <w:pStyle w:val="Heading1"/>
+        <w:pStyle w:val="Ttulo1"/>
       </w:pPr>
       <w:bookmarkStart w:id="14" w:name="_Toc243403971"/>
       <w:r>
@@ -4428,11 +4317,10 @@
         <w:docPartUnique/>
       </w:docPartObj>
     </w:sdtPr>
-    <w:sdtEndPr/>
     <w:sdtContent>
       <w:p>
         <w:pPr>
-          <w:pStyle w:val="Header"/>
+          <w:pStyle w:val="Encabezado"/>
           <w:jc w:val="right"/>
         </w:pPr>
         <w:r>
@@ -4458,7 +4346,7 @@
   </w:sdt>
   <w:p>
     <w:pPr>
-      <w:pStyle w:val="Header"/>
+      <w:pStyle w:val="Encabezado"/>
     </w:pPr>
   </w:p>
 </w:hdr>
@@ -5333,7 +5221,7 @@
     <w:qFormat/>
     <w:rsid w:val="00142074"/>
   </w:style>
-  <w:style w:type="paragraph" w:styleId="Heading1">
+  <w:style w:type="paragraph" w:styleId="Ttulo1">
     <w:name w:val="heading 1"/>
     <w:basedOn w:val="Normal"/>
     <w:next w:val="Normal"/>
@@ -5354,7 +5242,7 @@
       <w:szCs w:val="40"/>
     </w:rPr>
   </w:style>
-  <w:style w:type="paragraph" w:styleId="Heading2">
+  <w:style w:type="paragraph" w:styleId="Ttulo2">
     <w:name w:val="heading 2"/>
     <w:basedOn w:val="Normal"/>
     <w:next w:val="Normal"/>
@@ -5375,7 +5263,7 @@
       <w:szCs w:val="32"/>
     </w:rPr>
   </w:style>
-  <w:style w:type="paragraph" w:styleId="Heading3">
+  <w:style w:type="paragraph" w:styleId="Ttulo3">
     <w:name w:val="heading 3"/>
     <w:basedOn w:val="Normal"/>
     <w:next w:val="Normal"/>
@@ -5395,7 +5283,7 @@
       <w:szCs w:val="28"/>
     </w:rPr>
   </w:style>
-  <w:style w:type="paragraph" w:styleId="Heading4">
+  <w:style w:type="paragraph" w:styleId="Ttulo4">
     <w:name w:val="heading 4"/>
     <w:basedOn w:val="Normal"/>
     <w:next w:val="Normal"/>
@@ -5415,7 +5303,7 @@
       <w:color w:val="0F4761"/>
     </w:rPr>
   </w:style>
-  <w:style w:type="paragraph" w:styleId="Heading5">
+  <w:style w:type="paragraph" w:styleId="Ttulo5">
     <w:name w:val="heading 5"/>
     <w:basedOn w:val="Normal"/>
     <w:next w:val="Normal"/>
@@ -5433,7 +5321,7 @@
       <w:color w:val="0F4761"/>
     </w:rPr>
   </w:style>
-  <w:style w:type="paragraph" w:styleId="Heading6">
+  <w:style w:type="paragraph" w:styleId="Ttulo6">
     <w:name w:val="heading 6"/>
     <w:basedOn w:val="Normal"/>
     <w:next w:val="Normal"/>
@@ -5453,11 +5341,11 @@
       <w:color w:val="595959"/>
     </w:rPr>
   </w:style>
-  <w:style w:type="paragraph" w:styleId="Heading7">
+  <w:style w:type="paragraph" w:styleId="Ttulo7">
     <w:name w:val="heading 7"/>
     <w:basedOn w:val="Normal"/>
     <w:next w:val="Normal"/>
-    <w:link w:val="Heading7Char"/>
+    <w:link w:val="Ttulo7Car"/>
     <w:uiPriority w:val="9"/>
     <w:semiHidden/>
     <w:unhideWhenUsed/>
@@ -5474,11 +5362,11 @@
       <w:color w:val="595959" w:themeColor="text1" w:themeTint="A6"/>
     </w:rPr>
   </w:style>
-  <w:style w:type="paragraph" w:styleId="Heading8">
+  <w:style w:type="paragraph" w:styleId="Ttulo8">
     <w:name w:val="heading 8"/>
     <w:basedOn w:val="Normal"/>
     <w:next w:val="Normal"/>
-    <w:link w:val="Heading8Char"/>
+    <w:link w:val="Ttulo8Car"/>
     <w:uiPriority w:val="9"/>
     <w:semiHidden/>
     <w:unhideWhenUsed/>
@@ -5497,11 +5385,11 @@
       <w:color w:val="272727" w:themeColor="text1" w:themeTint="D8"/>
     </w:rPr>
   </w:style>
-  <w:style w:type="paragraph" w:styleId="Heading9">
+  <w:style w:type="paragraph" w:styleId="Ttulo9">
     <w:name w:val="heading 9"/>
     <w:basedOn w:val="Normal"/>
     <w:next w:val="Normal"/>
-    <w:link w:val="Heading9Char"/>
+    <w:link w:val="Ttulo9Car"/>
     <w:uiPriority w:val="9"/>
     <w:semiHidden/>
     <w:unhideWhenUsed/>
@@ -5518,13 +5406,13 @@
       <w:color w:val="272727" w:themeColor="text1" w:themeTint="D8"/>
     </w:rPr>
   </w:style>
-  <w:style w:type="character" w:default="1" w:styleId="DefaultParagraphFont">
+  <w:style w:type="character" w:default="1" w:styleId="Fuentedeprrafopredeter">
     <w:name w:val="Default Paragraph Font"/>
     <w:uiPriority w:val="1"/>
     <w:semiHidden/>
     <w:unhideWhenUsed/>
   </w:style>
-  <w:style w:type="table" w:default="1" w:styleId="TableNormal">
+  <w:style w:type="table" w:default="1" w:styleId="Tablanormal">
     <w:name w:val="Normal Table"/>
     <w:uiPriority w:val="99"/>
     <w:semiHidden/>
@@ -5539,13 +5427,13 @@
       </w:tblCellMar>
     </w:tblPr>
   </w:style>
-  <w:style w:type="numbering" w:default="1" w:styleId="NoList">
+  <w:style w:type="numbering" w:default="1" w:styleId="Sinlista">
     <w:name w:val="No List"/>
     <w:uiPriority w:val="99"/>
     <w:semiHidden/>
     <w:unhideWhenUsed/>
   </w:style>
-  <w:style w:type="table" w:customStyle="1" w:styleId="TableNormal0">
+  <w:style w:type="table" w:customStyle="1" w:styleId="TableNormal">
     <w:name w:val="TableNormal"/>
     <w:tblPr>
       <w:tblCellMar>
@@ -5556,7 +5444,7 @@
       </w:tblCellMar>
     </w:tblPr>
   </w:style>
-  <w:style w:type="paragraph" w:styleId="Title">
+  <w:style w:type="paragraph" w:styleId="Ttulo">
     <w:name w:val="Title"/>
     <w:basedOn w:val="Normal"/>
     <w:next w:val="Normal"/>
@@ -5573,7 +5461,7 @@
   </w:style>
   <w:style w:type="character" w:customStyle="1" w:styleId="Ttulo1Car">
     <w:name w:val="Título 1 Car"/>
-    <w:basedOn w:val="DefaultParagraphFont"/>
+    <w:basedOn w:val="Fuentedeprrafopredeter"/>
     <w:uiPriority w:val="9"/>
     <w:rsid w:val="003602D8"/>
     <w:rPr>
@@ -5585,7 +5473,7 @@
   </w:style>
   <w:style w:type="character" w:customStyle="1" w:styleId="Ttulo2Car">
     <w:name w:val="Título 2 Car"/>
-    <w:basedOn w:val="DefaultParagraphFont"/>
+    <w:basedOn w:val="Fuentedeprrafopredeter"/>
     <w:uiPriority w:val="9"/>
     <w:semiHidden/>
     <w:rsid w:val="003602D8"/>
@@ -5598,7 +5486,7 @@
   </w:style>
   <w:style w:type="character" w:customStyle="1" w:styleId="Ttulo3Car">
     <w:name w:val="Título 3 Car"/>
-    <w:basedOn w:val="DefaultParagraphFont"/>
+    <w:basedOn w:val="Fuentedeprrafopredeter"/>
     <w:uiPriority w:val="9"/>
     <w:semiHidden/>
     <w:rsid w:val="003602D8"/>
@@ -5611,7 +5499,7 @@
   </w:style>
   <w:style w:type="character" w:customStyle="1" w:styleId="Ttulo4Car">
     <w:name w:val="Título 4 Car"/>
-    <w:basedOn w:val="DefaultParagraphFont"/>
+    <w:basedOn w:val="Fuentedeprrafopredeter"/>
     <w:uiPriority w:val="9"/>
     <w:semiHidden/>
     <w:rsid w:val="003602D8"/>
@@ -5624,7 +5512,7 @@
   </w:style>
   <w:style w:type="character" w:customStyle="1" w:styleId="Ttulo5Car">
     <w:name w:val="Título 5 Car"/>
-    <w:basedOn w:val="DefaultParagraphFont"/>
+    <w:basedOn w:val="Fuentedeprrafopredeter"/>
     <w:uiPriority w:val="9"/>
     <w:semiHidden/>
     <w:rsid w:val="003602D8"/>
@@ -5635,7 +5523,7 @@
   </w:style>
   <w:style w:type="character" w:customStyle="1" w:styleId="Ttulo6Car">
     <w:name w:val="Título 6 Car"/>
-    <w:basedOn w:val="DefaultParagraphFont"/>
+    <w:basedOn w:val="Fuentedeprrafopredeter"/>
     <w:uiPriority w:val="9"/>
     <w:semiHidden/>
     <w:rsid w:val="003602D8"/>
@@ -5646,10 +5534,10 @@
       <w:color w:val="595959" w:themeColor="text1" w:themeTint="A6"/>
     </w:rPr>
   </w:style>
-  <w:style w:type="character" w:customStyle="1" w:styleId="Heading7Char">
-    <w:name w:val="Heading 7 Char"/>
-    <w:basedOn w:val="DefaultParagraphFont"/>
-    <w:link w:val="Heading7"/>
+  <w:style w:type="character" w:customStyle="1" w:styleId="Ttulo7Car">
+    <w:name w:val="Título 7 Car"/>
+    <w:basedOn w:val="Fuentedeprrafopredeter"/>
+    <w:link w:val="Ttulo7"/>
     <w:uiPriority w:val="9"/>
     <w:semiHidden/>
     <w:rsid w:val="003602D8"/>
@@ -5658,10 +5546,10 @@
       <w:color w:val="595959" w:themeColor="text1" w:themeTint="A6"/>
     </w:rPr>
   </w:style>
-  <w:style w:type="character" w:customStyle="1" w:styleId="Heading8Char">
-    <w:name w:val="Heading 8 Char"/>
-    <w:basedOn w:val="DefaultParagraphFont"/>
-    <w:link w:val="Heading8"/>
+  <w:style w:type="character" w:customStyle="1" w:styleId="Ttulo8Car">
+    <w:name w:val="Título 8 Car"/>
+    <w:basedOn w:val="Fuentedeprrafopredeter"/>
+    <w:link w:val="Ttulo8"/>
     <w:uiPriority w:val="9"/>
     <w:semiHidden/>
     <w:rsid w:val="003602D8"/>
@@ -5672,10 +5560,10 @@
       <w:color w:val="272727" w:themeColor="text1" w:themeTint="D8"/>
     </w:rPr>
   </w:style>
-  <w:style w:type="character" w:customStyle="1" w:styleId="Heading9Char">
-    <w:name w:val="Heading 9 Char"/>
-    <w:basedOn w:val="DefaultParagraphFont"/>
-    <w:link w:val="Heading9"/>
+  <w:style w:type="character" w:customStyle="1" w:styleId="Ttulo9Car">
+    <w:name w:val="Título 9 Car"/>
+    <w:basedOn w:val="Fuentedeprrafopredeter"/>
+    <w:link w:val="Ttulo9"/>
     <w:uiPriority w:val="9"/>
     <w:semiHidden/>
     <w:rsid w:val="003602D8"/>
@@ -5686,7 +5574,7 @@
   </w:style>
   <w:style w:type="character" w:customStyle="1" w:styleId="TtuloCar">
     <w:name w:val="Título Car"/>
-    <w:basedOn w:val="DefaultParagraphFont"/>
+    <w:basedOn w:val="Fuentedeprrafopredeter"/>
     <w:uiPriority w:val="10"/>
     <w:rsid w:val="003602D8"/>
     <w:rPr>
@@ -5699,7 +5587,7 @@
   </w:style>
   <w:style w:type="character" w:customStyle="1" w:styleId="SubttuloCar">
     <w:name w:val="Subtítulo Car"/>
-    <w:basedOn w:val="DefaultParagraphFont"/>
+    <w:basedOn w:val="Fuentedeprrafopredeter"/>
     <w:uiPriority w:val="11"/>
     <w:rsid w:val="003602D8"/>
     <w:rPr>
@@ -5710,11 +5598,11 @@
       <w:szCs w:val="28"/>
     </w:rPr>
   </w:style>
-  <w:style w:type="paragraph" w:styleId="Quote">
+  <w:style w:type="paragraph" w:styleId="Cita">
     <w:name w:val="Quote"/>
     <w:basedOn w:val="Normal"/>
     <w:next w:val="Normal"/>
-    <w:link w:val="QuoteChar"/>
+    <w:link w:val="CitaCar"/>
     <w:uiPriority w:val="29"/>
     <w:qFormat/>
     <w:rsid w:val="003602D8"/>
@@ -5728,10 +5616,10 @@
       <w:color w:val="404040" w:themeColor="text1" w:themeTint="BF"/>
     </w:rPr>
   </w:style>
-  <w:style w:type="character" w:customStyle="1" w:styleId="QuoteChar">
-    <w:name w:val="Quote Char"/>
-    <w:basedOn w:val="DefaultParagraphFont"/>
-    <w:link w:val="Quote"/>
+  <w:style w:type="character" w:customStyle="1" w:styleId="CitaCar">
+    <w:name w:val="Cita Car"/>
+    <w:basedOn w:val="Fuentedeprrafopredeter"/>
+    <w:link w:val="Cita"/>
     <w:uiPriority w:val="29"/>
     <w:rsid w:val="003602D8"/>
     <w:rPr>
@@ -5740,7 +5628,7 @@
       <w:color w:val="404040" w:themeColor="text1" w:themeTint="BF"/>
     </w:rPr>
   </w:style>
-  <w:style w:type="paragraph" w:styleId="ListParagraph">
+  <w:style w:type="paragraph" w:styleId="Prrafodelista">
     <w:name w:val="List Paragraph"/>
     <w:basedOn w:val="Normal"/>
     <w:uiPriority w:val="34"/>
@@ -5751,9 +5639,9 @@
       <w:contextualSpacing/>
     </w:pPr>
   </w:style>
-  <w:style w:type="character" w:styleId="IntenseEmphasis">
+  <w:style w:type="character" w:styleId="nfasisintenso">
     <w:name w:val="Intense Emphasis"/>
-    <w:basedOn w:val="DefaultParagraphFont"/>
+    <w:basedOn w:val="Fuentedeprrafopredeter"/>
     <w:uiPriority w:val="21"/>
     <w:qFormat/>
     <w:rsid w:val="003602D8"/>
@@ -5763,11 +5651,11 @@
       <w:color w:val="0F4761" w:themeColor="accent1" w:themeShade="BF"/>
     </w:rPr>
   </w:style>
-  <w:style w:type="paragraph" w:styleId="IntenseQuote">
+  <w:style w:type="paragraph" w:styleId="Citadestacada">
     <w:name w:val="Intense Quote"/>
     <w:basedOn w:val="Normal"/>
     <w:next w:val="Normal"/>
-    <w:link w:val="IntenseQuoteChar"/>
+    <w:link w:val="CitadestacadaCar"/>
     <w:uiPriority w:val="30"/>
     <w:qFormat/>
     <w:rsid w:val="003602D8"/>
@@ -5786,10 +5674,10 @@
       <w:color w:val="0F4761" w:themeColor="accent1" w:themeShade="BF"/>
     </w:rPr>
   </w:style>
-  <w:style w:type="character" w:customStyle="1" w:styleId="IntenseQuoteChar">
-    <w:name w:val="Intense Quote Char"/>
-    <w:basedOn w:val="DefaultParagraphFont"/>
-    <w:link w:val="IntenseQuote"/>
+  <w:style w:type="character" w:customStyle="1" w:styleId="CitadestacadaCar">
+    <w:name w:val="Cita destacada Car"/>
+    <w:basedOn w:val="Fuentedeprrafopredeter"/>
+    <w:link w:val="Citadestacada"/>
     <w:uiPriority w:val="30"/>
     <w:rsid w:val="003602D8"/>
     <w:rPr>
@@ -5798,9 +5686,9 @@
       <w:color w:val="0F4761" w:themeColor="accent1" w:themeShade="BF"/>
     </w:rPr>
   </w:style>
-  <w:style w:type="character" w:styleId="IntenseReference">
+  <w:style w:type="character" w:styleId="Referenciaintensa">
     <w:name w:val="Intense Reference"/>
-    <w:basedOn w:val="DefaultParagraphFont"/>
+    <w:basedOn w:val="Fuentedeprrafopredeter"/>
     <w:uiPriority w:val="32"/>
     <w:qFormat/>
     <w:rsid w:val="003602D8"/>
@@ -5812,7 +5700,7 @@
       <w:spacing w:val="5"/>
     </w:rPr>
   </w:style>
-  <w:style w:type="paragraph" w:styleId="Subtitle">
+  <w:style w:type="paragraph" w:styleId="Subttulo">
     <w:name w:val="Subtitle"/>
     <w:basedOn w:val="Normal"/>
     <w:next w:val="Normal"/>
@@ -5824,9 +5712,9 @@
       <w:szCs w:val="28"/>
     </w:rPr>
   </w:style>
-  <w:style w:type="character" w:styleId="Hyperlink">
+  <w:style w:type="character" w:styleId="Hipervnculo">
     <w:name w:val="Hyperlink"/>
-    <w:basedOn w:val="DefaultParagraphFont"/>
+    <w:basedOn w:val="Fuentedeprrafopredeter"/>
     <w:uiPriority w:val="99"/>
     <w:unhideWhenUsed/>
     <w:rsid w:val="000A33BC"/>
@@ -5835,9 +5723,9 @@
       <w:u w:val="single"/>
     </w:rPr>
   </w:style>
-  <w:style w:type="character" w:styleId="UnresolvedMention">
+  <w:style w:type="character" w:styleId="Mencinsinresolver">
     <w:name w:val="Unresolved Mention"/>
-    <w:basedOn w:val="DefaultParagraphFont"/>
+    <w:basedOn w:val="Fuentedeprrafopredeter"/>
     <w:uiPriority w:val="99"/>
     <w:semiHidden/>
     <w:unhideWhenUsed/>
@@ -5847,9 +5735,9 @@
       <w:shd w:val="clear" w:color="auto" w:fill="E1DFDD"/>
     </w:rPr>
   </w:style>
-  <w:style w:type="paragraph" w:styleId="TOCHeading">
+  <w:style w:type="paragraph" w:styleId="TtuloTDC">
     <w:name w:val="TOC Heading"/>
-    <w:basedOn w:val="Heading1"/>
+    <w:basedOn w:val="Ttulo1"/>
     <w:next w:val="Normal"/>
     <w:uiPriority w:val="39"/>
     <w:unhideWhenUsed/>
@@ -5868,7 +5756,7 @@
       <w:szCs w:val="32"/>
     </w:rPr>
   </w:style>
-  <w:style w:type="paragraph" w:styleId="TOC1">
+  <w:style w:type="paragraph" w:styleId="TDC1">
     <w:name w:val="toc 1"/>
     <w:basedOn w:val="Normal"/>
     <w:next w:val="Normal"/>
@@ -5880,7 +5768,7 @@
       <w:spacing w:after="100"/>
     </w:pPr>
   </w:style>
-  <w:style w:type="paragraph" w:styleId="TOC2">
+  <w:style w:type="paragraph" w:styleId="TDC2">
     <w:name w:val="toc 2"/>
     <w:basedOn w:val="Normal"/>
     <w:next w:val="Normal"/>
@@ -5893,10 +5781,10 @@
       <w:ind w:left="240"/>
     </w:pPr>
   </w:style>
-  <w:style w:type="paragraph" w:styleId="Header">
+  <w:style w:type="paragraph" w:styleId="Encabezado">
     <w:name w:val="header"/>
     <w:basedOn w:val="Normal"/>
-    <w:link w:val="HeaderChar"/>
+    <w:link w:val="EncabezadoCar"/>
     <w:uiPriority w:val="99"/>
     <w:unhideWhenUsed/>
     <w:rsid w:val="000A33BC"/>
@@ -5908,17 +5796,17 @@
       <w:spacing w:after="0" w:line="240" w:lineRule="auto"/>
     </w:pPr>
   </w:style>
-  <w:style w:type="character" w:customStyle="1" w:styleId="HeaderChar">
-    <w:name w:val="Header Char"/>
-    <w:basedOn w:val="DefaultParagraphFont"/>
-    <w:link w:val="Header"/>
+  <w:style w:type="character" w:customStyle="1" w:styleId="EncabezadoCar">
+    <w:name w:val="Encabezado Car"/>
+    <w:basedOn w:val="Fuentedeprrafopredeter"/>
+    <w:link w:val="Encabezado"/>
     <w:uiPriority w:val="99"/>
     <w:rsid w:val="000A33BC"/>
   </w:style>
-  <w:style w:type="paragraph" w:styleId="Footer">
+  <w:style w:type="paragraph" w:styleId="Piedepgina">
     <w:name w:val="footer"/>
     <w:basedOn w:val="Normal"/>
-    <w:link w:val="FooterChar"/>
+    <w:link w:val="PiedepginaCar"/>
     <w:uiPriority w:val="99"/>
     <w:unhideWhenUsed/>
     <w:rsid w:val="000A33BC"/>
@@ -5930,14 +5818,14 @@
       <w:spacing w:after="0" w:line="240" w:lineRule="auto"/>
     </w:pPr>
   </w:style>
-  <w:style w:type="character" w:customStyle="1" w:styleId="FooterChar">
-    <w:name w:val="Footer Char"/>
-    <w:basedOn w:val="DefaultParagraphFont"/>
-    <w:link w:val="Footer"/>
+  <w:style w:type="character" w:customStyle="1" w:styleId="PiedepginaCar">
+    <w:name w:val="Pie de página Car"/>
+    <w:basedOn w:val="Fuentedeprrafopredeter"/>
+    <w:link w:val="Piedepgina"/>
     <w:uiPriority w:val="99"/>
     <w:rsid w:val="000A33BC"/>
   </w:style>
-  <w:style w:type="paragraph" w:styleId="Caption">
+  <w:style w:type="paragraph" w:styleId="Descripcin">
     <w:name w:val="caption"/>
     <w:basedOn w:val="Normal"/>
     <w:next w:val="Normal"/>
@@ -5956,7 +5844,7 @@
       <w:szCs w:val="18"/>
     </w:rPr>
   </w:style>
-  <w:style w:type="paragraph" w:styleId="TableofFigures">
+  <w:style w:type="paragraph" w:styleId="Tabladeilustraciones">
     <w:name w:val="table of figures"/>
     <w:basedOn w:val="Normal"/>
     <w:next w:val="Normal"/>
@@ -6286,28 +6174,28 @@
 </file>
 
 <file path=customXml/item1.xml><?xml version="1.0" encoding="utf-8"?>
-<b:Sources xmlns:b="http://schemas.openxmlformats.org/officeDocument/2006/bibliography" xmlns="http://schemas.openxmlformats.org/officeDocument/2006/bibliography" SelectedStyle="\APASixthEditionOfficeOnline.xsl" StyleName="APA" Version="6"/>
-</file>
-
-<file path=customXml/item2.xml><?xml version="1.0" encoding="utf-8"?>
 <go:gDocsCustomXmlDataStorage xmlns:go="http://customooxmlschemas.google.com/" xmlns:r="http://schemas.openxmlformats.org/officeDocument/2006/relationships" uri="GoogleDocsCustomDataVersion2">
   <go:docsCustomData xmlns:go="http://customooxmlschemas.google.com/" roundtripDataSignature="AMtx7mgNEoP3Kwq+1LxZPzAZXi8V9NcnBA==">CgMxLjA4AHIhMWZGMDk1QVlYQkZjVDI5RnR4bmhOaUp4VnZIVnd1WC1Y</go:docsCustomData>
 </go:gDocsCustomXmlDataStorage>
 </file>
 
-<file path=customXml/itemProps1.xml><?xml version="1.0" encoding="utf-8"?>
-<ds:datastoreItem xmlns:ds="http://schemas.openxmlformats.org/officeDocument/2006/customXml" ds:itemID="{1ABD5AAA-B4E8-496F-AB7C-4CB05F8790EB}">
-  <ds:schemaRefs>
-    <ds:schemaRef ds:uri="http://schemas.openxmlformats.org/officeDocument/2006/bibliography"/>
-  </ds:schemaRefs>
-</ds:datastoreItem>
+<file path=customXml/item2.xml><?xml version="1.0" encoding="utf-8"?>
+<b:Sources xmlns:b="http://schemas.openxmlformats.org/officeDocument/2006/bibliography" xmlns="http://schemas.openxmlformats.org/officeDocument/2006/bibliography" SelectedStyle="\APASixthEditionOfficeOnline.xsl" StyleName="APA" Version="6"/>
 </file>
 
-<file path=customXml/itemProps2.xml><?xml version="1.0" encoding="utf-8"?>
+<file path=customXml/itemProps1.xml><?xml version="1.0" encoding="utf-8"?>
 <ds:datastoreItem xmlns:ds="http://schemas.openxmlformats.org/officeDocument/2006/customXml" ds:itemID="{11111111-1234-1234-1234-123412341234}">
   <ds:schemaRefs>
     <ds:schemaRef ds:uri="http://customooxmlschemas.google.com/"/>
     <ds:schemaRef ds:uri="http://schemas.openxmlformats.org/officeDocument/2006/relationships"/>
   </ds:schemaRefs>
 </ds:datastoreItem>
+</file>
+
+<file path=customXml/itemProps2.xml><?xml version="1.0" encoding="utf-8"?>
+<ds:datastoreItem xmlns:ds="http://schemas.openxmlformats.org/officeDocument/2006/customXml" ds:itemID="{1ABD5AAA-B4E8-496F-AB7C-4CB05F8790EB}">
+  <ds:schemaRefs>
+    <ds:schemaRef ds:uri="http://schemas.openxmlformats.org/officeDocument/2006/bibliography"/>
+  </ds:schemaRefs>
+</ds:datastoreItem>
 </file>
</xml_diff>

<commit_message>
Actualizar los análisis de marketing según las campañas vigentes
</commit_message>
<xml_diff>
--- a/docs/Documento escrito.docx
+++ b/docs/Documento escrito.docx
@@ -2991,7 +2991,7 @@
                 <w:sz w:val="22"/>
                 <w:szCs w:val="22"/>
               </w:rPr>
-              <w:t>Analizar el comportamiento de compra de los hogares asociados a campañas promocionales para identificar patrones de consumo.</w:t>
+              <w:t>Analizar el comportamiento de compra de los hogares según tengan o no campañas asignadas vigentes, identificando diferencias en importes y cantidades compradas.</w:t>
             </w:r>
           </w:p>
         </w:tc>
@@ -3023,7 +3023,7 @@
                 <w:sz w:val="22"/>
                 <w:szCs w:val="22"/>
               </w:rPr>
-              <w:t>Ventas de hogares asociados a campañas vigentes; comparación de compras de hogares con y sin campañas activas; gasto durante períodos promocionales.</w:t>
+              <w:t>Comparación de importes y cantidades compradas por hogares con y sin campañas asignadas vigentes el día de la compra; análisis del gasto según la cantidad de campañas asignadas vigentes; comparación del gasto de hogares durante días con campañas asignadas vigentes y días sin ellas.</w:t>
             </w:r>
           </w:p>
         </w:tc>

</xml_diff>